<commit_message>
Verify False Creek stats
</commit_message>
<xml_diff>
--- a/BSH_2026_Tour_Content_Tracked_Changes.docx
+++ b/BSH_2026_Tour_Content_Tracked_Changes.docx
@@ -343,17 +343,246 @@
     </w:p>
     <w:p>
       <w:r>
-        <w:t>False Creek South represents one of Vancouver's most successful experiments in mixed-tenure community development. Built on former industrial land in the 1970s and 1980s, this 136-acre waterfront neighbourhood demonstrates how public land ownership can support diverse housing options while maintaining long-term affordability.</w:t>
-      </w:r>
-    </w:p>
-    <w:p>
-      <w:r>
-        <w:t>The City of Vancouver owns about 80 acres in False Creek South, making it a rare example of large-scale public land stewardship. The original vision committed to a tenure mix of one-third non-market rental housing, one-third co-ops, and one-third strata leasehold — a model designed to avoid the social stratification common in single-tenure developments.</w:t>
-      </w:r>
-    </w:p>
-    <w:p>
-      <w:r>
-        <w:t>Today, about 5,500 residents live in 1,849 homes. The land is leased on 60-year terms that begin expiring between 2036 and 2046, creating a pivotal decision point about how to preserve affordability while renewing public assets.</w:t>
+        <w:rPr>
+          <w:sz w:val="22"/>
+        </w:rPr>
+        <w:t xml:space="preserve">False Creek South represents one of Vancouver's most successful experiments in mixed-tenure community development. Built on former industrial land in the 1970s and 1980s, this </w:t>
+      </w:r>
+      <w:r>
+        <w:rPr>
+          <w:strike/>
+          <w:color w:val="CC0000"/>
+          <w:sz w:val="22"/>
+        </w:rPr>
+        <w:t xml:space="preserve">136-acre waterfront </w:t>
+      </w:r>
+      <w:r>
+        <w:rPr>
+          <w:color w:val="0044CC"/>
+          <w:sz w:val="22"/>
+          <w:u w:val="single"/>
+        </w:rPr>
+        <w:t xml:space="preserve">approximately 100-acre </w:t>
+      </w:r>
+      <w:r>
+        <w:rPr>
+          <w:sz w:val="22"/>
+        </w:rPr>
+        <w:t xml:space="preserve">neighbourhood demonstrates how public land ownership can support diverse housing options while maintaining long-term affordability. </w:t>
+      </w:r>
+    </w:p>
+    <w:p>
+      <w:r>
+        <w:rPr>
+          <w:sz w:val="22"/>
+        </w:rPr>
+        <w:t xml:space="preserve">The City of Vancouver owns about 80 acres in False Creek South, making it a rare example of large-scale public land stewardship. The </w:t>
+      </w:r>
+      <w:r>
+        <w:rPr>
+          <w:strike/>
+          <w:color w:val="CC0000"/>
+          <w:sz w:val="22"/>
+        </w:rPr>
+        <w:t xml:space="preserve">original vision committed to </w:t>
+      </w:r>
+      <w:r>
+        <w:rPr>
+          <w:color w:val="0044CC"/>
+          <w:sz w:val="22"/>
+          <w:u w:val="single"/>
+        </w:rPr>
+        <w:t xml:space="preserve">neighbourhood includes </w:t>
+      </w:r>
+      <w:r>
+        <w:rPr>
+          <w:sz w:val="22"/>
+        </w:rPr>
+        <w:t xml:space="preserve">a </w:t>
+      </w:r>
+      <w:r>
+        <w:rPr>
+          <w:strike/>
+          <w:color w:val="CC0000"/>
+          <w:sz w:val="22"/>
+        </w:rPr>
+        <w:t xml:space="preserve">tenure </w:t>
+      </w:r>
+      <w:r>
+        <w:rPr>
+          <w:sz w:val="22"/>
+        </w:rPr>
+        <w:t xml:space="preserve">mix of </w:t>
+      </w:r>
+      <w:r>
+        <w:rPr>
+          <w:strike/>
+          <w:color w:val="CC0000"/>
+          <w:sz w:val="22"/>
+        </w:rPr>
+        <w:t xml:space="preserve">one-third </w:t>
+      </w:r>
+      <w:r>
+        <w:rPr>
+          <w:color w:val="0044CC"/>
+          <w:sz w:val="22"/>
+          <w:u w:val="single"/>
+        </w:rPr>
+        <w:t xml:space="preserve">co-op, </w:t>
+      </w:r>
+      <w:r>
+        <w:rPr>
+          <w:sz w:val="22"/>
+        </w:rPr>
+        <w:t xml:space="preserve">non-market </w:t>
+      </w:r>
+      <w:r>
+        <w:rPr>
+          <w:strike/>
+          <w:color w:val="CC0000"/>
+          <w:sz w:val="22"/>
+        </w:rPr>
+        <w:t xml:space="preserve">rental housing, one-third co-ops, </w:t>
+      </w:r>
+      <w:r>
+        <w:rPr>
+          <w:color w:val="0044CC"/>
+          <w:sz w:val="22"/>
+          <w:u w:val="single"/>
+        </w:rPr>
+        <w:t xml:space="preserve">rental, market rental, </w:t>
+      </w:r>
+      <w:r>
+        <w:rPr>
+          <w:sz w:val="22"/>
+        </w:rPr>
+        <w:t xml:space="preserve">and </w:t>
+      </w:r>
+      <w:r>
+        <w:rPr>
+          <w:strike/>
+          <w:color w:val="CC0000"/>
+          <w:sz w:val="22"/>
+        </w:rPr>
+        <w:t xml:space="preserve">one-third </w:t>
+      </w:r>
+      <w:r>
+        <w:rPr>
+          <w:sz w:val="22"/>
+        </w:rPr>
+        <w:t xml:space="preserve">strata leasehold </w:t>
+      </w:r>
+      <w:r>
+        <w:rPr>
+          <w:strike/>
+          <w:color w:val="CC0000"/>
+          <w:sz w:val="22"/>
+        </w:rPr>
+        <w:t xml:space="preserve">— a model designed to avoid the social stratification common in single-tenure developments. </w:t>
+      </w:r>
+      <w:r>
+        <w:rPr>
+          <w:color w:val="0044CC"/>
+          <w:sz w:val="22"/>
+          <w:u w:val="single"/>
+        </w:rPr>
+        <w:t xml:space="preserve">housing, alongside civic and commercial uses. </w:t>
+      </w:r>
+    </w:p>
+    <w:p>
+      <w:r>
+        <w:rPr>
+          <w:strike/>
+          <w:color w:val="CC0000"/>
+          <w:sz w:val="22"/>
+        </w:rPr>
+        <w:t xml:space="preserve">Today, about </w:t>
+      </w:r>
+      <w:r>
+        <w:rPr>
+          <w:color w:val="0044CC"/>
+          <w:sz w:val="22"/>
+          <w:u w:val="single"/>
+        </w:rPr>
+        <w:t xml:space="preserve">There are approximately </w:t>
+      </w:r>
+      <w:r>
+        <w:rPr>
+          <w:sz w:val="22"/>
+        </w:rPr>
+        <w:t xml:space="preserve">5,500 residents </w:t>
+      </w:r>
+      <w:r>
+        <w:rPr>
+          <w:strike/>
+          <w:color w:val="CC0000"/>
+          <w:sz w:val="22"/>
+        </w:rPr>
+        <w:t xml:space="preserve">live </w:t>
+      </w:r>
+      <w:r>
+        <w:rPr>
+          <w:sz w:val="22"/>
+        </w:rPr>
+        <w:t xml:space="preserve">in </w:t>
+      </w:r>
+      <w:r>
+        <w:rPr>
+          <w:color w:val="0044CC"/>
+          <w:sz w:val="22"/>
+          <w:u w:val="single"/>
+        </w:rPr>
+        <w:t xml:space="preserve">all of False Creek South. On City-owned land, there are </w:t>
+      </w:r>
+      <w:r>
+        <w:rPr>
+          <w:sz w:val="22"/>
+        </w:rPr>
+        <w:t xml:space="preserve">1,849 </w:t>
+      </w:r>
+      <w:r>
+        <w:rPr>
+          <w:strike/>
+          <w:color w:val="CC0000"/>
+          <w:sz w:val="22"/>
+        </w:rPr>
+        <w:t xml:space="preserve">homes. </w:t>
+      </w:r>
+      <w:r>
+        <w:rPr>
+          <w:color w:val="0044CC"/>
+          <w:sz w:val="22"/>
+          <w:u w:val="single"/>
+        </w:rPr>
+        <w:t xml:space="preserve">housing units (plus 1,354 units on non-City land). </w:t>
+      </w:r>
+      <w:r>
+        <w:rPr>
+          <w:sz w:val="22"/>
+        </w:rPr>
+        <w:t xml:space="preserve">The land is leased on 60-year </w:t>
+      </w:r>
+      <w:r>
+        <w:rPr>
+          <w:strike/>
+          <w:color w:val="CC0000"/>
+          <w:sz w:val="22"/>
+        </w:rPr>
+        <w:t xml:space="preserve">terms that begin expiring </w:t>
+      </w:r>
+      <w:r>
+        <w:rPr>
+          <w:color w:val="0044CC"/>
+          <w:sz w:val="22"/>
+          <w:u w:val="single"/>
+        </w:rPr>
+        <w:t xml:space="preserve">terms, and most City-land leases expire </w:t>
+      </w:r>
+      <w:r>
+        <w:rPr>
+          <w:sz w:val="22"/>
+        </w:rPr>
+        <w:t xml:space="preserve">between 2036 and 2046, creating a pivotal decision point about how to preserve affordability while renewing public assets. </w:t>
       </w:r>
     </w:p>
     <w:p>
@@ -409,12 +638,98 @@
     </w:p>
     <w:p>
       <w:r>
-        <w:t>False Creek South showcases six distinct tenure types, each serving different community needs:</w:t>
-      </w:r>
-    </w:p>
-    <w:p>
-      <w:r>
-        <w:t>• Co-operatives: Six housing co-ops including Twin Rainbows (86 units, opened 1981), Creekview, Alder Bay, and others. Members have secure tenure and participate in democratic governance.</w:t>
+        <w:rPr>
+          <w:sz w:val="22"/>
+        </w:rPr>
+        <w:t xml:space="preserve">False Creek South </w:t>
+      </w:r>
+      <w:r>
+        <w:rPr>
+          <w:strike/>
+          <w:color w:val="CC0000"/>
+          <w:sz w:val="22"/>
+        </w:rPr>
+        <w:t xml:space="preserve">showcases six distinct </w:t>
+      </w:r>
+      <w:r>
+        <w:rPr>
+          <w:color w:val="0044CC"/>
+          <w:sz w:val="22"/>
+          <w:u w:val="single"/>
+        </w:rPr>
+        <w:t xml:space="preserve">includes multiple </w:t>
+      </w:r>
+      <w:r>
+        <w:rPr>
+          <w:sz w:val="22"/>
+        </w:rPr>
+        <w:t xml:space="preserve">tenure types, each serving different community needs: </w:t>
+      </w:r>
+    </w:p>
+    <w:p>
+      <w:r>
+        <w:rPr>
+          <w:sz w:val="22"/>
+        </w:rPr>
+        <w:t xml:space="preserve">• Co-operatives: </w:t>
+      </w:r>
+      <w:r>
+        <w:rPr>
+          <w:strike/>
+          <w:color w:val="CC0000"/>
+          <w:sz w:val="22"/>
+        </w:rPr>
+        <w:t xml:space="preserve">Six housing co-ops </w:t>
+      </w:r>
+      <w:r>
+        <w:rPr>
+          <w:color w:val="0044CC"/>
+          <w:sz w:val="22"/>
+          <w:u w:val="single"/>
+        </w:rPr>
+        <w:t xml:space="preserve">City data identifies seven co-op buildings (517 units) on City land, </w:t>
+      </w:r>
+      <w:r>
+        <w:rPr>
+          <w:sz w:val="22"/>
+        </w:rPr>
+        <w:t xml:space="preserve">including Twin Rainbows </w:t>
+      </w:r>
+      <w:r>
+        <w:rPr>
+          <w:color w:val="0044CC"/>
+          <w:sz w:val="22"/>
+          <w:u w:val="single"/>
+        </w:rPr>
+        <w:t xml:space="preserve">Co-op </w:t>
+      </w:r>
+      <w:r>
+        <w:rPr>
+          <w:sz w:val="22"/>
+        </w:rPr>
+        <w:t xml:space="preserve">(86 units, opened </w:t>
+      </w:r>
+      <w:r>
+        <w:rPr>
+          <w:strike/>
+          <w:color w:val="CC0000"/>
+          <w:sz w:val="22"/>
+        </w:rPr>
+        <w:t xml:space="preserve">1981), Creekview, Alder Bay, and others. </w:t>
+      </w:r>
+      <w:r>
+        <w:rPr>
+          <w:color w:val="0044CC"/>
+          <w:sz w:val="22"/>
+          <w:u w:val="single"/>
+        </w:rPr>
+        <w:t xml:space="preserve">1981). </w:t>
+      </w:r>
+      <w:r>
+        <w:rPr>
+          <w:sz w:val="22"/>
+        </w:rPr>
+        <w:t xml:space="preserve">Members have secure tenure and participate in democratic governance. </w:t>
       </w:r>
     </w:p>
     <w:p>
@@ -449,7 +764,76 @@
     </w:p>
     <w:p>
       <w:r>
-        <w:t>Housing operators lease land from the city rather than purchasing it. All lease terms expire in the 2030s and 2040s, creating both opportunity and uncertainty. This model:</w:t>
+        <w:rPr>
+          <w:sz w:val="22"/>
+        </w:rPr>
+        <w:t xml:space="preserve">Housing operators lease land from the city rather than purchasing it. </w:t>
+      </w:r>
+      <w:r>
+        <w:rPr>
+          <w:strike/>
+          <w:color w:val="CC0000"/>
+          <w:sz w:val="22"/>
+        </w:rPr>
+        <w:t xml:space="preserve">All </w:t>
+      </w:r>
+      <w:r>
+        <w:rPr>
+          <w:color w:val="0044CC"/>
+          <w:sz w:val="22"/>
+          <w:u w:val="single"/>
+        </w:rPr>
+        <w:t xml:space="preserve">Most City-land </w:t>
+      </w:r>
+      <w:r>
+        <w:rPr>
+          <w:sz w:val="22"/>
+        </w:rPr>
+        <w:t xml:space="preserve">lease terms expire </w:t>
+      </w:r>
+      <w:r>
+        <w:rPr>
+          <w:strike/>
+          <w:color w:val="CC0000"/>
+          <w:sz w:val="22"/>
+        </w:rPr>
+        <w:t xml:space="preserve">in the 2030s </w:t>
+      </w:r>
+      <w:r>
+        <w:rPr>
+          <w:color w:val="0044CC"/>
+          <w:sz w:val="22"/>
+          <w:u w:val="single"/>
+        </w:rPr>
+        <w:t xml:space="preserve">between 2036 </w:t>
+      </w:r>
+      <w:r>
+        <w:rPr>
+          <w:sz w:val="22"/>
+        </w:rPr>
+        <w:t xml:space="preserve">and </w:t>
+      </w:r>
+      <w:r>
+        <w:rPr>
+          <w:strike/>
+          <w:color w:val="CC0000"/>
+          <w:sz w:val="22"/>
+        </w:rPr>
+        <w:t xml:space="preserve">2040s, </w:t>
+      </w:r>
+      <w:r>
+        <w:rPr>
+          <w:color w:val="0044CC"/>
+          <w:sz w:val="22"/>
+          <w:u w:val="single"/>
+        </w:rPr>
+        <w:t xml:space="preserve">2046, </w:t>
+      </w:r>
+      <w:r>
+        <w:rPr>
+          <w:sz w:val="22"/>
+        </w:rPr>
+        <w:t xml:space="preserve">creating both opportunity and uncertainty. This model: </w:t>
       </w:r>
     </w:p>
     <w:p>
@@ -474,12 +858,230 @@
     </w:p>
     <w:p>
       <w:r>
-        <w:t>The Lease Crisis</w:t>
-      </w:r>
-    </w:p>
-    <w:p>
-      <w:r>
-        <w:t>The original 60-year leases are approaching expiry, creating uncertainty for roughly 3,200 residents. In 2021, City Council rejected a staff proposal to triple density and instead directed a community-led planning process. In January 2025, the City awarded a $4 million contract to Arup Group to prepare a landowner plan, sparking renewed debate about community involvement.</w:t>
+        <w:rPr>
+          <w:sz w:val="22"/>
+        </w:rPr>
+        <w:t xml:space="preserve">The Lease </w:t>
+      </w:r>
+      <w:r>
+        <w:rPr>
+          <w:strike/>
+          <w:color w:val="CC0000"/>
+          <w:sz w:val="22"/>
+        </w:rPr>
+        <w:t xml:space="preserve">Crisis </w:t>
+      </w:r>
+      <w:r>
+        <w:rPr>
+          <w:color w:val="0044CC"/>
+          <w:sz w:val="22"/>
+          <w:u w:val="single"/>
+        </w:rPr>
+        <w:t xml:space="preserve">Renewal Moment </w:t>
+      </w:r>
+    </w:p>
+    <w:p>
+      <w:r>
+        <w:rPr>
+          <w:sz w:val="22"/>
+        </w:rPr>
+        <w:t xml:space="preserve">The original 60-year leases are approaching expiry, creating uncertainty for </w:t>
+      </w:r>
+      <w:r>
+        <w:rPr>
+          <w:strike/>
+          <w:color w:val="CC0000"/>
+          <w:sz w:val="22"/>
+        </w:rPr>
+        <w:t xml:space="preserve">roughly 3,200 residents. </w:t>
+      </w:r>
+      <w:r>
+        <w:rPr>
+          <w:color w:val="0044CC"/>
+          <w:sz w:val="22"/>
+          <w:u w:val="single"/>
+        </w:rPr>
+        <w:t xml:space="preserve">households across the neighbourhood. </w:t>
+      </w:r>
+      <w:r>
+        <w:rPr>
+          <w:sz w:val="22"/>
+        </w:rPr>
+        <w:t xml:space="preserve">In </w:t>
+      </w:r>
+      <w:r>
+        <w:rPr>
+          <w:color w:val="0044CC"/>
+          <w:sz w:val="22"/>
+          <w:u w:val="single"/>
+        </w:rPr>
+        <w:t xml:space="preserve">October </w:t>
+      </w:r>
+      <w:r>
+        <w:rPr>
+          <w:sz w:val="22"/>
+        </w:rPr>
+        <w:t xml:space="preserve">2021, </w:t>
+      </w:r>
+      <w:r>
+        <w:rPr>
+          <w:strike/>
+          <w:color w:val="CC0000"/>
+          <w:sz w:val="22"/>
+        </w:rPr>
+        <w:t xml:space="preserve">City </w:t>
+      </w:r>
+      <w:r>
+        <w:rPr>
+          <w:sz w:val="22"/>
+        </w:rPr>
+        <w:t xml:space="preserve">Council </w:t>
+      </w:r>
+      <w:r>
+        <w:rPr>
+          <w:strike/>
+          <w:color w:val="CC0000"/>
+          <w:sz w:val="22"/>
+        </w:rPr>
+        <w:t xml:space="preserve">rejected </w:t>
+      </w:r>
+      <w:r>
+        <w:rPr>
+          <w:color w:val="0044CC"/>
+          <w:sz w:val="22"/>
+          <w:u w:val="single"/>
+        </w:rPr>
+        <w:t xml:space="preserve">received </w:t>
+      </w:r>
+      <w:r>
+        <w:rPr>
+          <w:sz w:val="22"/>
+        </w:rPr>
+        <w:t xml:space="preserve">a </w:t>
+      </w:r>
+      <w:r>
+        <w:rPr>
+          <w:color w:val="0044CC"/>
+          <w:sz w:val="22"/>
+          <w:u w:val="single"/>
+        </w:rPr>
+        <w:t xml:space="preserve">False Creek South landowner update, and in March 2024 Council directed </w:t>
+      </w:r>
+      <w:r>
+        <w:rPr>
+          <w:sz w:val="22"/>
+        </w:rPr>
+        <w:t xml:space="preserve">staff </w:t>
+      </w:r>
+      <w:r>
+        <w:rPr>
+          <w:strike/>
+          <w:color w:val="CC0000"/>
+          <w:sz w:val="22"/>
+        </w:rPr>
+        <w:t xml:space="preserve">proposal </w:t>
+      </w:r>
+      <w:r>
+        <w:rPr>
+          <w:sz w:val="22"/>
+        </w:rPr>
+        <w:t xml:space="preserve">to </w:t>
+      </w:r>
+      <w:r>
+        <w:rPr>
+          <w:strike/>
+          <w:color w:val="CC0000"/>
+          <w:sz w:val="22"/>
+        </w:rPr>
+        <w:t xml:space="preserve">triple density </w:t>
+      </w:r>
+      <w:r>
+        <w:rPr>
+          <w:color w:val="0044CC"/>
+          <w:sz w:val="22"/>
+          <w:u w:val="single"/>
+        </w:rPr>
+        <w:t xml:space="preserve">report back with an updated </w:t>
+      </w:r>
+      <w:r>
+        <w:rPr>
+          <w:sz w:val="22"/>
+        </w:rPr>
+        <w:t xml:space="preserve">and </w:t>
+      </w:r>
+      <w:r>
+        <w:rPr>
+          <w:strike/>
+          <w:color w:val="CC0000"/>
+          <w:sz w:val="22"/>
+        </w:rPr>
+        <w:t xml:space="preserve">instead directed a community-led planning process. In </w:t>
+      </w:r>
+      <w:r>
+        <w:rPr>
+          <w:color w:val="0044CC"/>
+          <w:sz w:val="22"/>
+          <w:u w:val="single"/>
+        </w:rPr>
+        <w:t xml:space="preserve">enhanced development framework. On </w:t>
+      </w:r>
+      <w:r>
+        <w:rPr>
+          <w:sz w:val="22"/>
+        </w:rPr>
+        <w:t xml:space="preserve">January </w:t>
+      </w:r>
+      <w:r>
+        <w:rPr>
+          <w:color w:val="0044CC"/>
+          <w:sz w:val="22"/>
+          <w:u w:val="single"/>
+        </w:rPr>
+        <w:t xml:space="preserve">22, </w:t>
+      </w:r>
+      <w:r>
+        <w:rPr>
+          <w:sz w:val="22"/>
+        </w:rPr>
+        <w:t xml:space="preserve">2025, </w:t>
+      </w:r>
+      <w:r>
+        <w:rPr>
+          <w:strike/>
+          <w:color w:val="CC0000"/>
+          <w:sz w:val="22"/>
+        </w:rPr>
+        <w:t xml:space="preserve">the City awarded a </w:t>
+      </w:r>
+      <w:r>
+        <w:rPr>
+          <w:color w:val="0044CC"/>
+          <w:sz w:val="22"/>
+          <w:u w:val="single"/>
+        </w:rPr>
+        <w:t xml:space="preserve">Council approved entering negotiations with Arup Canada Inc. for consulting services, with an estimated contract value of </w:t>
+      </w:r>
+      <w:r>
+        <w:rPr>
+          <w:sz w:val="22"/>
+        </w:rPr>
+        <w:t xml:space="preserve">$4 </w:t>
+      </w:r>
+      <w:r>
+        <w:rPr>
+          <w:strike/>
+          <w:color w:val="CC0000"/>
+          <w:sz w:val="22"/>
+        </w:rPr>
+        <w:t xml:space="preserve">million contract to Arup Group to prepare a landowner plan, sparking renewed debate about community involvement. </w:t>
+      </w:r>
+      <w:r>
+        <w:rPr>
+          <w:color w:val="0044CC"/>
+          <w:sz w:val="22"/>
+          <w:u w:val="single"/>
+        </w:rPr>
+        <w:t xml:space="preserve">million. </w:t>
       </w:r>
     </w:p>
     <w:p>
@@ -489,7 +1091,68 @@
     </w:p>
     <w:p>
       <w:r>
-        <w:t>In March 2024, Vancouver Council passed a motion supporting the construction of new co-ops on City-owned land through a community land trust model. The False Creek South Community Housing Trust received funding from Vancity Community Foundation to develop a business plan and engage with co-op boards. As Robyn Chan explains: "It's a way to have more control and to expand non-profit housing."</w:t>
+        <w:rPr>
+          <w:sz w:val="22"/>
+        </w:rPr>
+        <w:t xml:space="preserve">In March 2024, Vancouver Council passed a motion supporting </w:t>
+      </w:r>
+      <w:r>
+        <w:rPr>
+          <w:color w:val="0044CC"/>
+          <w:sz w:val="22"/>
+          <w:u w:val="single"/>
+        </w:rPr>
+        <w:t xml:space="preserve">community land trust models and </w:t>
+      </w:r>
+      <w:r>
+        <w:rPr>
+          <w:sz w:val="22"/>
+        </w:rPr>
+        <w:t xml:space="preserve">the construction of </w:t>
+      </w:r>
+      <w:r>
+        <w:rPr>
+          <w:strike/>
+          <w:color w:val="CC0000"/>
+          <w:sz w:val="22"/>
+        </w:rPr>
+        <w:t xml:space="preserve">new co-ops </w:t>
+      </w:r>
+      <w:r>
+        <w:rPr>
+          <w:color w:val="0044CC"/>
+          <w:sz w:val="22"/>
+          <w:u w:val="single"/>
+        </w:rPr>
+        <w:t xml:space="preserve">newly built co-op housing </w:t>
+      </w:r>
+      <w:r>
+        <w:rPr>
+          <w:sz w:val="22"/>
+        </w:rPr>
+        <w:t xml:space="preserve">on City-owned </w:t>
+      </w:r>
+      <w:r>
+        <w:rPr>
+          <w:strike/>
+          <w:color w:val="CC0000"/>
+          <w:sz w:val="22"/>
+        </w:rPr>
+        <w:t xml:space="preserve">land through a community land trust model. </w:t>
+      </w:r>
+      <w:r>
+        <w:rPr>
+          <w:color w:val="0044CC"/>
+          <w:sz w:val="22"/>
+          <w:u w:val="single"/>
+        </w:rPr>
+        <w:t xml:space="preserve">land. </w:t>
+      </w:r>
+      <w:r>
+        <w:rPr>
+          <w:sz w:val="22"/>
+        </w:rPr>
+        <w:t xml:space="preserve">The False Creek South Community Housing Trust received funding from Vancity Community Foundation to develop a business plan and engage with co-op boards. As Robyn Chan explains: "It's a way to have more control and to expand non-profit housing." </w:t>
       </w:r>
     </w:p>
     <w:p>
@@ -504,22 +1167,140 @@
     </w:p>
     <w:p>
       <w:r>
-        <w:t>• 1,849 homes with a one-third / one-third / one-third tenure mix</w:t>
-      </w:r>
-    </w:p>
-    <w:p>
-      <w:r>
-        <w:t>• All land leases expire in 2036-2046 — critical transition period</w:t>
-      </w:r>
-    </w:p>
-    <w:p>
-      <w:r>
-        <w:t>• 2021 Council rejected wholesale demolition and density tripling</w:t>
-      </w:r>
-    </w:p>
-    <w:p>
-      <w:r>
-        <w:t>• March 2024 Council motion supports community land trust model</w:t>
+        <w:rPr>
+          <w:sz w:val="22"/>
+        </w:rPr>
+        <w:t xml:space="preserve">• 1,849 </w:t>
+      </w:r>
+      <w:r>
+        <w:rPr>
+          <w:strike/>
+          <w:color w:val="CC0000"/>
+          <w:sz w:val="22"/>
+        </w:rPr>
+        <w:t xml:space="preserve">homes with a one-third / one-third / one-third tenure mix </w:t>
+      </w:r>
+      <w:r>
+        <w:rPr>
+          <w:color w:val="0044CC"/>
+          <w:sz w:val="22"/>
+          <w:u w:val="single"/>
+        </w:rPr>
+        <w:t xml:space="preserve">housing units are on City land, plus 1,354 units on non-City land </w:t>
+      </w:r>
+    </w:p>
+    <w:p>
+      <w:r>
+        <w:rPr>
+          <w:sz w:val="22"/>
+        </w:rPr>
+        <w:t xml:space="preserve">• </w:t>
+      </w:r>
+      <w:r>
+        <w:rPr>
+          <w:strike/>
+          <w:color w:val="CC0000"/>
+          <w:sz w:val="22"/>
+        </w:rPr>
+        <w:t xml:space="preserve">All land </w:t>
+      </w:r>
+      <w:r>
+        <w:rPr>
+          <w:color w:val="0044CC"/>
+          <w:sz w:val="22"/>
+          <w:u w:val="single"/>
+        </w:rPr>
+        <w:t xml:space="preserve">Most City-land </w:t>
+      </w:r>
+      <w:r>
+        <w:rPr>
+          <w:sz w:val="22"/>
+        </w:rPr>
+        <w:t xml:space="preserve">leases expire in 2036-2046 — </w:t>
+      </w:r>
+      <w:r>
+        <w:rPr>
+          <w:color w:val="0044CC"/>
+          <w:sz w:val="22"/>
+          <w:u w:val="single"/>
+        </w:rPr>
+        <w:t xml:space="preserve">a </w:t>
+      </w:r>
+      <w:r>
+        <w:rPr>
+          <w:sz w:val="22"/>
+        </w:rPr>
+        <w:t xml:space="preserve">critical transition period </w:t>
+      </w:r>
+    </w:p>
+    <w:p>
+      <w:r>
+        <w:rPr>
+          <w:sz w:val="22"/>
+        </w:rPr>
+        <w:t xml:space="preserve">• </w:t>
+      </w:r>
+      <w:r>
+        <w:rPr>
+          <w:strike/>
+          <w:color w:val="CC0000"/>
+          <w:sz w:val="22"/>
+        </w:rPr>
+        <w:t xml:space="preserve">2021 </w:t>
+      </w:r>
+      <w:r>
+        <w:rPr>
+          <w:color w:val="0044CC"/>
+          <w:sz w:val="22"/>
+          <w:u w:val="single"/>
+        </w:rPr>
+        <w:t xml:space="preserve">January 22, 2025: </w:t>
+      </w:r>
+      <w:r>
+        <w:rPr>
+          <w:sz w:val="22"/>
+        </w:rPr>
+        <w:t xml:space="preserve">Council </w:t>
+      </w:r>
+      <w:r>
+        <w:rPr>
+          <w:strike/>
+          <w:color w:val="CC0000"/>
+          <w:sz w:val="22"/>
+        </w:rPr>
+        <w:t xml:space="preserve">rejected wholesale demolition and density tripling </w:t>
+      </w:r>
+      <w:r>
+        <w:rPr>
+          <w:color w:val="0044CC"/>
+          <w:sz w:val="22"/>
+          <w:u w:val="single"/>
+        </w:rPr>
+        <w:t xml:space="preserve">approved negotiations for a consulting contract valued at up to $4 million </w:t>
+      </w:r>
+    </w:p>
+    <w:p>
+      <w:r>
+        <w:rPr>
+          <w:sz w:val="22"/>
+        </w:rPr>
+        <w:t xml:space="preserve">• March 2024 Council motion supports community land trust </w:t>
+      </w:r>
+      <w:r>
+        <w:rPr>
+          <w:strike/>
+          <w:color w:val="CC0000"/>
+          <w:sz w:val="22"/>
+        </w:rPr>
+        <w:t xml:space="preserve">model </w:t>
+      </w:r>
+      <w:r>
+        <w:rPr>
+          <w:color w:val="0044CC"/>
+          <w:sz w:val="22"/>
+          <w:u w:val="single"/>
+        </w:rPr>
+        <w:t xml:space="preserve">models and new co-op housing on City-owned land </w:t>
       </w:r>
     </w:p>
     <w:p>
@@ -571,6 +1352,56 @@
     <w:p>
       <w:r>
         <w:t>• City of Vancouver — False Creek South - Municipal planning information and policy documents | https://vancouver.ca/home-property-development/false-creek-south.aspx</w:t>
+      </w:r>
+    </w:p>
+    <w:p>
+      <w:r>
+        <w:rPr>
+          <w:color w:val="0044CC"/>
+          <w:sz w:val="22"/>
+          <w:u w:val="single"/>
+        </w:rPr>
+        <w:t>• City of Vancouver — False Creek South Leases on City Land - City and non-City land unit counts and lease-expiry timeline | https://vancouver.ca/home-property-development/false-creek-south-leases-on-city-land.aspx</w:t>
+      </w:r>
+    </w:p>
+    <w:p>
+      <w:r>
+        <w:rPr>
+          <w:color w:val="0044CC"/>
+          <w:sz w:val="22"/>
+          <w:u w:val="single"/>
+        </w:rPr>
+        <w:t>• Vancouver Council Report (Oct 21, 2021) — False Creek South Planning Program Update - Council report with neighbourhood size, land ownership, and resident figures | https://council.vancouver.ca/20211021/documents/pspc2.pdf</w:t>
+      </w:r>
+    </w:p>
+    <w:p>
+      <w:r>
+        <w:rPr>
+          <w:color w:val="0044CC"/>
+          <w:sz w:val="22"/>
+          <w:u w:val="single"/>
+        </w:rPr>
+        <w:t>• Vancouver Council Report (Jan 22, 2025) — Contracting Authority to Arup Canada Inc. - Council approval for consulting services with an estimated value of $4 million | https://council.vancouver.ca/20250122/documents/pspc2r.pdf</w:t>
+      </w:r>
+    </w:p>
+    <w:p>
+      <w:r>
+        <w:rPr>
+          <w:color w:val="0044CC"/>
+          <w:sz w:val="22"/>
+          <w:u w:val="single"/>
+        </w:rPr>
+        <w:t>• Vancouver Council Motion (Mar 13, 2024) — False Creek South Planning Program - Council direction supporting CLT models and newly built co-op housing on City-owned lands | https://council.vancouver.ca/20240313/documents/cfsca3.pdf</w:t>
+      </w:r>
+    </w:p>
+    <w:p>
+      <w:r>
+        <w:rPr>
+          <w:color w:val="0044CC"/>
+          <w:sz w:val="22"/>
+          <w:u w:val="single"/>
+        </w:rPr>
+        <w:t>• Twin Rainbows Housing Co-op - Co-op profile including 86 units and 1981 completion year | https://www.twinrainbowscoop.ca/</w:t>
       </w:r>
     </w:p>
     <w:p>
@@ -747,96 +1578,238 @@
     </w:p>
     <w:p>
       <w:r>
-        <w:t>Sen̓áḵw (pronounced "sen-AHK-w") is the largest Indigenous-led urban housing development in Canadian history. Located on 10.5 acres of Squamish Nation reserve land near the south end of the Burrard Bridge, this project demonstrates how Indigenous land rights can create new pathways for housing development.</w:t>
-      </w:r>
-    </w:p>
-    <w:p>
-      <w:r>
-        <w:rPr>
-          <w:sz w:val="22"/>
-        </w:rPr>
-        <w:t xml:space="preserve">The development will include 6,000 purpose-built rental units across 11 towers, with 4 million square feet of floor space. Critically, 1,200 units </w:t>
-      </w:r>
-      <w:r>
-        <w:rPr>
-          <w:color w:val="0044CC"/>
-          <w:sz w:val="22"/>
-          <w:u w:val="single"/>
-        </w:rPr>
-        <w:t xml:space="preserve">(20%) </w:t>
-      </w:r>
-      <w:r>
-        <w:rPr>
-          <w:sz w:val="22"/>
-        </w:rPr>
-        <w:t xml:space="preserve">will be designated affordable, </w:t>
-      </w:r>
-      <w:r>
-        <w:rPr>
-          <w:strike/>
-          <w:color w:val="CC0000"/>
-          <w:sz w:val="22"/>
-        </w:rPr>
-        <w:t xml:space="preserve">and </w:t>
-      </w:r>
-      <w:r>
-        <w:rPr>
-          <w:color w:val="0044CC"/>
-          <w:sz w:val="22"/>
-          <w:u w:val="single"/>
-        </w:rPr>
-        <w:t xml:space="preserve">with </w:t>
-      </w:r>
-      <w:r>
-        <w:rPr>
-          <w:sz w:val="22"/>
-        </w:rPr>
-        <w:t xml:space="preserve">rents </w:t>
-      </w:r>
-      <w:r>
-        <w:rPr>
-          <w:strike/>
-          <w:color w:val="CC0000"/>
-          <w:sz w:val="22"/>
-        </w:rPr>
-        <w:t xml:space="preserve">will be 30-40% </w:t>
-      </w:r>
-      <w:r>
-        <w:rPr>
-          <w:color w:val="0044CC"/>
-          <w:sz w:val="22"/>
-          <w:u w:val="single"/>
-        </w:rPr>
-        <w:t xml:space="preserve">30–40% </w:t>
-      </w:r>
-      <w:r>
-        <w:rPr>
-          <w:sz w:val="22"/>
-        </w:rPr>
-        <w:t xml:space="preserve">below comparable market rates. </w:t>
-      </w:r>
-      <w:r>
-        <w:rPr>
-          <w:color w:val="0044CC"/>
-          <w:sz w:val="22"/>
-          <w:u w:val="single"/>
-        </w:rPr>
-        <w:t xml:space="preserve">Of these, 250 units are set aside specifically for Squamish Nation members, managed by the Nation's non-profit housing society Hiy̓ám̓ Housing. Applications for Squamish citizens opened in February 2026 — making Sen̓áḵw the largest permanent return of Squamish residents to this land in over a century. </w:t>
-      </w:r>
-    </w:p>
-    <w:p>
-      <w:r>
-        <w:rPr>
-          <w:color w:val="0044CC"/>
-          <w:sz w:val="22"/>
-          <w:u w:val="single"/>
-        </w:rPr>
-        <w:t>The three-tier rental structure prioritizes Indigenous access: Hiy̓ám̓ Housing homes (rent-assisted, Squamish members first), affordable homes (below-market for middle-income households), and market rental homes. This model positions Sen̓áḵw as a landmark in urban Indigenous housing — addressing the needs of one of Vancouver's most historically marginalized communities.</w:t>
-      </w:r>
-    </w:p>
-    <w:p>
-      <w:r>
-        <w:t>In September 2022, Prime Minister Justin Trudeau announced a $1.4 billion federal loan to fund the first two phases. Phase One (1,409 units in three towers) targets completion in early 2026, with phased buildout continuing into the early 2030s.</w:t>
+        <w:rPr>
+          <w:sz w:val="22"/>
+        </w:rPr>
+        <w:t xml:space="preserve">Sen̓áḵw (pronounced "sen-AHK-w") is </w:t>
+      </w:r>
+      <w:r>
+        <w:rPr>
+          <w:color w:val="0044CC"/>
+          <w:sz w:val="22"/>
+          <w:u w:val="single"/>
+        </w:rPr>
+        <w:t xml:space="preserve">one of </w:t>
+      </w:r>
+      <w:r>
+        <w:rPr>
+          <w:sz w:val="22"/>
+        </w:rPr>
+        <w:t xml:space="preserve">the largest Indigenous-led urban housing </w:t>
+      </w:r>
+      <w:r>
+        <w:rPr>
+          <w:strike/>
+          <w:color w:val="CC0000"/>
+          <w:sz w:val="22"/>
+        </w:rPr>
+        <w:t xml:space="preserve">development </w:t>
+      </w:r>
+      <w:r>
+        <w:rPr>
+          <w:color w:val="0044CC"/>
+          <w:sz w:val="22"/>
+          <w:u w:val="single"/>
+        </w:rPr>
+        <w:t xml:space="preserve">developments </w:t>
+      </w:r>
+      <w:r>
+        <w:rPr>
+          <w:sz w:val="22"/>
+        </w:rPr>
+        <w:t xml:space="preserve">in </w:t>
+      </w:r>
+      <w:r>
+        <w:rPr>
+          <w:strike/>
+          <w:color w:val="CC0000"/>
+          <w:sz w:val="22"/>
+        </w:rPr>
+        <w:t xml:space="preserve">Canadian history. Located </w:t>
+      </w:r>
+      <w:r>
+        <w:rPr>
+          <w:color w:val="0044CC"/>
+          <w:sz w:val="22"/>
+          <w:u w:val="single"/>
+        </w:rPr>
+        <w:t xml:space="preserve">Canada. It is being built </w:t>
+      </w:r>
+      <w:r>
+        <w:rPr>
+          <w:sz w:val="22"/>
+        </w:rPr>
+        <w:t xml:space="preserve">on 10.5 acres of Squamish Nation reserve land near the south end of the Burrard </w:t>
+      </w:r>
+      <w:r>
+        <w:rPr>
+          <w:strike/>
+          <w:color w:val="CC0000"/>
+          <w:sz w:val="22"/>
+        </w:rPr>
+        <w:t xml:space="preserve">Bridge, this project demonstrates how Indigenous land rights can create new pathways for housing development. </w:t>
+      </w:r>
+      <w:r>
+        <w:rPr>
+          <w:color w:val="0044CC"/>
+          <w:sz w:val="22"/>
+          <w:u w:val="single"/>
+        </w:rPr>
+        <w:t xml:space="preserve">Bridge. </w:t>
+      </w:r>
+    </w:p>
+    <w:p>
+      <w:r>
+        <w:rPr>
+          <w:sz w:val="22"/>
+        </w:rPr>
+        <w:t xml:space="preserve">The </w:t>
+      </w:r>
+      <w:r>
+        <w:rPr>
+          <w:strike/>
+          <w:color w:val="CC0000"/>
+          <w:sz w:val="22"/>
+        </w:rPr>
+        <w:t xml:space="preserve">development will include </w:t>
+      </w:r>
+      <w:r>
+        <w:rPr>
+          <w:color w:val="0044CC"/>
+          <w:sz w:val="22"/>
+          <w:u w:val="single"/>
+        </w:rPr>
+        <w:t xml:space="preserve">project is planned as </w:t>
+      </w:r>
+      <w:r>
+        <w:rPr>
+          <w:sz w:val="22"/>
+        </w:rPr>
+        <w:t xml:space="preserve">6,000 purpose-built rental </w:t>
+      </w:r>
+      <w:r>
+        <w:rPr>
+          <w:strike/>
+          <w:color w:val="CC0000"/>
+          <w:sz w:val="22"/>
+        </w:rPr>
+        <w:t xml:space="preserve">units across 11 towers, with 4 million square feet of floor space. Critically, </w:t>
+      </w:r>
+      <w:r>
+        <w:rPr>
+          <w:color w:val="0044CC"/>
+          <w:sz w:val="22"/>
+          <w:u w:val="single"/>
+        </w:rPr>
+        <w:t xml:space="preserve">homes, including </w:t>
+      </w:r>
+      <w:r>
+        <w:rPr>
+          <w:sz w:val="22"/>
+        </w:rPr>
+        <w:t xml:space="preserve">1,200 </w:t>
+      </w:r>
+      <w:r>
+        <w:rPr>
+          <w:strike/>
+          <w:color w:val="CC0000"/>
+          <w:sz w:val="22"/>
+        </w:rPr>
+        <w:t xml:space="preserve">units will be designated affordable, and rents will be 30-40% below comparable market rates. </w:t>
+      </w:r>
+      <w:r>
+        <w:rPr>
+          <w:color w:val="0044CC"/>
+          <w:sz w:val="22"/>
+          <w:u w:val="single"/>
+        </w:rPr>
+        <w:t xml:space="preserve">below-market homes. Hiy̓ám̓ Housing states that 250 homes are allocated for Squamish People through its housing stream. </w:t>
+      </w:r>
+    </w:p>
+    <w:p>
+      <w:r>
+        <w:rPr>
+          <w:strike/>
+          <w:color w:val="CC0000"/>
+          <w:sz w:val="22"/>
+        </w:rPr>
+        <w:t xml:space="preserve">In September 2022, Prime Minister Justin Trudeau announced a $1.4 billion federal loan to fund the first two phases. </w:t>
+      </w:r>
+      <w:r>
+        <w:rPr>
+          <w:sz w:val="22"/>
+        </w:rPr>
+        <w:t xml:space="preserve">Phase One </w:t>
+      </w:r>
+      <w:r>
+        <w:rPr>
+          <w:strike/>
+          <w:color w:val="CC0000"/>
+          <w:sz w:val="22"/>
+        </w:rPr>
+        <w:t xml:space="preserve">(1,409 units </w:t>
+      </w:r>
+      <w:r>
+        <w:rPr>
+          <w:color w:val="0044CC"/>
+          <w:sz w:val="22"/>
+          <w:u w:val="single"/>
+        </w:rPr>
+        <w:t xml:space="preserve">includes three towers and 1,409 homes. In its February 5, 2026 update, Squamish Nation said first move-ins were expected </w:t>
+      </w:r>
+      <w:r>
+        <w:rPr>
+          <w:sz w:val="22"/>
+        </w:rPr>
+        <w:t xml:space="preserve">in </w:t>
+      </w:r>
+      <w:r>
+        <w:rPr>
+          <w:strike/>
+          <w:color w:val="CC0000"/>
+          <w:sz w:val="22"/>
+        </w:rPr>
+        <w:t xml:space="preserve">three towers) targets completion in early </w:t>
+      </w:r>
+      <w:r>
+        <w:rPr>
+          <w:color w:val="0044CC"/>
+          <w:sz w:val="22"/>
+          <w:u w:val="single"/>
+        </w:rPr>
+        <w:t xml:space="preserve">summer </w:t>
+      </w:r>
+      <w:r>
+        <w:rPr>
+          <w:sz w:val="22"/>
+        </w:rPr>
+        <w:t xml:space="preserve">2026, with </w:t>
+      </w:r>
+      <w:r>
+        <w:rPr>
+          <w:strike/>
+          <w:color w:val="CC0000"/>
+          <w:sz w:val="22"/>
+        </w:rPr>
+        <w:t xml:space="preserve">phased buildout continuing into the early 2030s. </w:t>
+      </w:r>
+      <w:r>
+        <w:rPr>
+          <w:color w:val="0044CC"/>
+          <w:sz w:val="22"/>
+          <w:u w:val="single"/>
+        </w:rPr>
+        <w:t xml:space="preserve">phase-one homes prioritized for Squamish People. </w:t>
+      </w:r>
+    </w:p>
+    <w:p>
+      <w:r>
+        <w:rPr>
+          <w:color w:val="0044CC"/>
+          <w:sz w:val="22"/>
+          <w:u w:val="single"/>
+        </w:rPr>
+        <w:t>On September 6, 2022, the federal government announced $1.4 billion in financing support for Sen̓áḵw through CMHC for early phases of the project.</w:t>
       </w:r>
     </w:p>
     <w:p>
@@ -849,12 +1822,62 @@
     </w:p>
     <w:p>
       <w:r>
-        <w:t>• Tower Cluster View: Compare the 11-tower massing plan with surrounding Kitsilano scale to understand the density shift. (Design focus)</w:t>
-      </w:r>
-    </w:p>
-    <w:p>
-      <w:r>
-        <w:t>• Public Green Space: Walk the six-acre open space to see how public realm access is built into the development agreement. (Open space)</w:t>
+        <w:rPr>
+          <w:sz w:val="22"/>
+        </w:rPr>
+        <w:t xml:space="preserve">• Tower Cluster View: Compare the </w:t>
+      </w:r>
+      <w:r>
+        <w:rPr>
+          <w:strike/>
+          <w:color w:val="CC0000"/>
+          <w:sz w:val="22"/>
+        </w:rPr>
+        <w:t xml:space="preserve">11-tower </w:t>
+      </w:r>
+      <w:r>
+        <w:rPr>
+          <w:color w:val="0044CC"/>
+          <w:sz w:val="22"/>
+          <w:u w:val="single"/>
+        </w:rPr>
+        <w:t xml:space="preserve">tower </w:t>
+      </w:r>
+      <w:r>
+        <w:rPr>
+          <w:sz w:val="22"/>
+        </w:rPr>
+        <w:t xml:space="preserve">massing plan with surrounding Kitsilano scale to understand the density shift. (Design focus) </w:t>
+      </w:r>
+    </w:p>
+    <w:p>
+      <w:r>
+        <w:rPr>
+          <w:sz w:val="22"/>
+        </w:rPr>
+        <w:t xml:space="preserve">• Public Green Space: Walk the </w:t>
+      </w:r>
+      <w:r>
+        <w:rPr>
+          <w:strike/>
+          <w:color w:val="CC0000"/>
+          <w:sz w:val="22"/>
+        </w:rPr>
+        <w:t xml:space="preserve">six-acre open space </w:t>
+      </w:r>
+      <w:r>
+        <w:rPr>
+          <w:color w:val="0044CC"/>
+          <w:sz w:val="22"/>
+          <w:u w:val="single"/>
+        </w:rPr>
+        <w:t xml:space="preserve">public open-space network </w:t>
+      </w:r>
+      <w:r>
+        <w:rPr>
+          <w:sz w:val="22"/>
+        </w:rPr>
+        <w:t xml:space="preserve">to see how public realm access is built into the development agreement. (Open space) </w:t>
       </w:r>
     </w:p>
     <w:p>
@@ -877,17 +1900,206 @@
     </w:p>
     <w:p>
       <w:r>
-        <w:t>Federal Jurisdiction &amp; View Cones</w:t>
-      </w:r>
-    </w:p>
-    <w:p>
-      <w:r>
-        <w:t>Sen̓áḵw operates on federal reserve land, which exempts it from Vancouver's municipal zoning bylaws — including the city's "view cone" policies that restrict building heights to protect mountain views.</w:t>
-      </w:r>
-    </w:p>
-    <w:p>
-      <w:r>
-        <w:t>Vancouver's view cones, established in 1989, identify 38 protected views from specific locations. The Sen̓áḵw towers enter View Cone 20.0 (from West Broadway and Granville Street), but as reserve land, the project is not bound by these restrictions. In July 2024, Council approved major changes to the view cone policy, partly influenced by Sen̓áḵw's development.</w:t>
+        <w:rPr>
+          <w:sz w:val="22"/>
+        </w:rPr>
+        <w:t xml:space="preserve">Federal Jurisdiction &amp; </w:t>
+      </w:r>
+      <w:r>
+        <w:rPr>
+          <w:strike/>
+          <w:color w:val="CC0000"/>
+          <w:sz w:val="22"/>
+        </w:rPr>
+        <w:t xml:space="preserve">View Cones </w:t>
+      </w:r>
+      <w:r>
+        <w:rPr>
+          <w:color w:val="0044CC"/>
+          <w:sz w:val="22"/>
+          <w:u w:val="single"/>
+        </w:rPr>
+        <w:t xml:space="preserve">Public Views </w:t>
+      </w:r>
+    </w:p>
+    <w:p>
+      <w:r>
+        <w:rPr>
+          <w:sz w:val="22"/>
+        </w:rPr>
+        <w:t xml:space="preserve">Sen̓áḵw </w:t>
+      </w:r>
+      <w:r>
+        <w:rPr>
+          <w:strike/>
+          <w:color w:val="CC0000"/>
+          <w:sz w:val="22"/>
+        </w:rPr>
+        <w:t xml:space="preserve">operates </w:t>
+      </w:r>
+      <w:r>
+        <w:rPr>
+          <w:color w:val="0044CC"/>
+          <w:sz w:val="22"/>
+          <w:u w:val="single"/>
+        </w:rPr>
+        <w:t xml:space="preserve">is </w:t>
+      </w:r>
+      <w:r>
+        <w:rPr>
+          <w:sz w:val="22"/>
+        </w:rPr>
+        <w:t xml:space="preserve">on federal reserve </w:t>
+      </w:r>
+      <w:r>
+        <w:rPr>
+          <w:strike/>
+          <w:color w:val="CC0000"/>
+          <w:sz w:val="22"/>
+        </w:rPr>
+        <w:t xml:space="preserve">land, which exempts it from Vancouver's municipal zoning bylaws — including </w:t>
+      </w:r>
+      <w:r>
+        <w:rPr>
+          <w:color w:val="0044CC"/>
+          <w:sz w:val="22"/>
+          <w:u w:val="single"/>
+        </w:rPr>
+        <w:t xml:space="preserve">land. The City of Vancouver states that city land-use policies and regulations do not apply to these lands, and </w:t>
+      </w:r>
+      <w:r>
+        <w:rPr>
+          <w:sz w:val="22"/>
+        </w:rPr>
+        <w:t xml:space="preserve">the </w:t>
+      </w:r>
+      <w:r>
+        <w:rPr>
+          <w:strike/>
+          <w:color w:val="CC0000"/>
+          <w:sz w:val="22"/>
+        </w:rPr>
+        <w:t xml:space="preserve">city's "view cone" policies that restrict building heights to protect mountain views. </w:t>
+      </w:r>
+      <w:r>
+        <w:rPr>
+          <w:color w:val="0044CC"/>
+          <w:sz w:val="22"/>
+          <w:u w:val="single"/>
+        </w:rPr>
+        <w:t xml:space="preserve">City is not directly involved in planning or design approvals. </w:t>
+      </w:r>
+    </w:p>
+    <w:p>
+      <w:r>
+        <w:rPr>
+          <w:color w:val="0044CC"/>
+          <w:sz w:val="22"/>
+          <w:u w:val="single"/>
+        </w:rPr>
+        <w:t xml:space="preserve">For context, </w:t>
+      </w:r>
+      <w:r>
+        <w:rPr>
+          <w:sz w:val="22"/>
+        </w:rPr>
+        <w:t xml:space="preserve">Vancouver's </w:t>
+      </w:r>
+      <w:r>
+        <w:rPr>
+          <w:strike/>
+          <w:color w:val="CC0000"/>
+          <w:sz w:val="22"/>
+        </w:rPr>
+        <w:t xml:space="preserve">view cones, established </w:t>
+      </w:r>
+      <w:r>
+        <w:rPr>
+          <w:color w:val="0044CC"/>
+          <w:sz w:val="22"/>
+          <w:u w:val="single"/>
+        </w:rPr>
+        <w:t xml:space="preserve">protected public-view framework has been </w:t>
+      </w:r>
+      <w:r>
+        <w:rPr>
+          <w:sz w:val="22"/>
+        </w:rPr>
+        <w:t xml:space="preserve">in </w:t>
+      </w:r>
+      <w:r>
+        <w:rPr>
+          <w:strike/>
+          <w:color w:val="CC0000"/>
+          <w:sz w:val="22"/>
+        </w:rPr>
+        <w:t xml:space="preserve">1989, identify 38 protected views from specific locations. The Sen̓áḵw towers enter View Cone 20.0 (from West Broadway and Granville Street), but as reserve land, the project is not bound by these restrictions. In </w:t>
+      </w:r>
+      <w:r>
+        <w:rPr>
+          <w:color w:val="0044CC"/>
+          <w:sz w:val="22"/>
+          <w:u w:val="single"/>
+        </w:rPr>
+        <w:t xml:space="preserve">place since 1989. On </w:t>
+      </w:r>
+      <w:r>
+        <w:rPr>
+          <w:sz w:val="22"/>
+        </w:rPr>
+        <w:t xml:space="preserve">July </w:t>
+      </w:r>
+      <w:r>
+        <w:rPr>
+          <w:color w:val="0044CC"/>
+          <w:sz w:val="22"/>
+          <w:u w:val="single"/>
+        </w:rPr>
+        <w:t xml:space="preserve">10, </w:t>
+      </w:r>
+      <w:r>
+        <w:rPr>
+          <w:sz w:val="22"/>
+        </w:rPr>
+        <w:t xml:space="preserve">2024, Council </w:t>
+      </w:r>
+      <w:r>
+        <w:rPr>
+          <w:strike/>
+          <w:color w:val="CC0000"/>
+          <w:sz w:val="22"/>
+        </w:rPr>
+        <w:t xml:space="preserve">approved major changes </w:t>
+      </w:r>
+      <w:r>
+        <w:rPr>
+          <w:color w:val="0044CC"/>
+          <w:sz w:val="22"/>
+          <w:u w:val="single"/>
+        </w:rPr>
+        <w:t xml:space="preserve">replaced the old View Protection Guidelines with new Public Views Guidelines, including amendments </w:t>
+      </w:r>
+      <w:r>
+        <w:rPr>
+          <w:sz w:val="22"/>
+        </w:rPr>
+        <w:t xml:space="preserve">to </w:t>
+      </w:r>
+      <w:r>
+        <w:rPr>
+          <w:strike/>
+          <w:color w:val="CC0000"/>
+          <w:sz w:val="22"/>
+        </w:rPr>
+        <w:t xml:space="preserve">the view cone policy, partly influenced by Sen̓áḵw's development. </w:t>
+      </w:r>
+      <w:r>
+        <w:rPr>
+          <w:color w:val="0044CC"/>
+          <w:sz w:val="22"/>
+          <w:u w:val="single"/>
+        </w:rPr>
+        <w:t xml:space="preserve">some public views. </w:t>
       </w:r>
     </w:p>
     <w:p>
@@ -897,27 +2109,274 @@
     </w:p>
     <w:p>
       <w:r>
-        <w:t>In August 2025, OPTrust — one of Canada's largest pension fund investors — acquired development partner Westbank's ownership stake in Phases One and Two. OPTrust and the Squamish Nation now each hold 50% ownership in these phases, representing a significant Indigenous-led partnership model.</w:t>
-      </w:r>
-    </w:p>
-    <w:p>
-      <w:r>
-        <w:t>Project Scope &amp; Public Space</w:t>
-      </w:r>
-    </w:p>
-    <w:p>
-      <w:r>
-        <w:t>Sen̓áḵw's unit mix includes 2,688 studios, 2,046 one-bedrooms, 874 two-bedrooms, and 472 three-bedrooms. Over half the site (roughly six acres) is planned as publicly accessible green space and cultural gathering areas.</w:t>
-      </w:r>
-    </w:p>
-    <w:p>
-      <w:r>
-        <w:t>Services Agreement &amp; Tenant Protections</w:t>
-      </w:r>
-    </w:p>
-    <w:p>
-      <w:r>
-        <w:t>A 120-year services agreement with the City of Vancouver (signed May 2022) covers water, sewer, fire, and police services, with the Squamish Nation paying the same rates as Vancouver property owners.</w:t>
+        <w:rPr>
+          <w:strike/>
+          <w:color w:val="CC0000"/>
+          <w:sz w:val="22"/>
+        </w:rPr>
+        <w:t xml:space="preserve">In </w:t>
+      </w:r>
+      <w:r>
+        <w:rPr>
+          <w:color w:val="0044CC"/>
+          <w:sz w:val="22"/>
+          <w:u w:val="single"/>
+        </w:rPr>
+        <w:t xml:space="preserve">On </w:t>
+      </w:r>
+      <w:r>
+        <w:rPr>
+          <w:sz w:val="22"/>
+        </w:rPr>
+        <w:t xml:space="preserve">August </w:t>
+      </w:r>
+      <w:r>
+        <w:rPr>
+          <w:color w:val="0044CC"/>
+          <w:sz w:val="22"/>
+          <w:u w:val="single"/>
+        </w:rPr>
+        <w:t xml:space="preserve">28, </w:t>
+      </w:r>
+      <w:r>
+        <w:rPr>
+          <w:sz w:val="22"/>
+        </w:rPr>
+        <w:t xml:space="preserve">2025, OPTrust </w:t>
+      </w:r>
+      <w:r>
+        <w:rPr>
+          <w:strike/>
+          <w:color w:val="CC0000"/>
+          <w:sz w:val="22"/>
+        </w:rPr>
+        <w:t xml:space="preserve">— one of Canada's largest pension fund investors — </w:t>
+      </w:r>
+      <w:r>
+        <w:rPr>
+          <w:color w:val="0044CC"/>
+          <w:sz w:val="22"/>
+          <w:u w:val="single"/>
+        </w:rPr>
+        <w:t xml:space="preserve">announced it had </w:t>
+      </w:r>
+      <w:r>
+        <w:rPr>
+          <w:sz w:val="22"/>
+        </w:rPr>
+        <w:t xml:space="preserve">acquired </w:t>
+      </w:r>
+      <w:r>
+        <w:rPr>
+          <w:strike/>
+          <w:color w:val="CC0000"/>
+          <w:sz w:val="22"/>
+        </w:rPr>
+        <w:t xml:space="preserve">development partner </w:t>
+      </w:r>
+      <w:r>
+        <w:rPr>
+          <w:sz w:val="22"/>
+        </w:rPr>
+        <w:t xml:space="preserve">Westbank's </w:t>
+      </w:r>
+      <w:r>
+        <w:rPr>
+          <w:strike/>
+          <w:color w:val="CC0000"/>
+          <w:sz w:val="22"/>
+        </w:rPr>
+        <w:t xml:space="preserve">ownership stake </w:t>
+      </w:r>
+      <w:r>
+        <w:rPr>
+          <w:color w:val="0044CC"/>
+          <w:sz w:val="22"/>
+          <w:u w:val="single"/>
+        </w:rPr>
+        <w:t xml:space="preserve">interest </w:t>
+      </w:r>
+      <w:r>
+        <w:rPr>
+          <w:sz w:val="22"/>
+        </w:rPr>
+        <w:t xml:space="preserve">in Phases One and Two. OPTrust and the Squamish Nation now each hold 50% ownership in </w:t>
+      </w:r>
+      <w:r>
+        <w:rPr>
+          <w:strike/>
+          <w:color w:val="CC0000"/>
+          <w:sz w:val="22"/>
+        </w:rPr>
+        <w:t xml:space="preserve">these </w:t>
+      </w:r>
+      <w:r>
+        <w:rPr>
+          <w:color w:val="0044CC"/>
+          <w:sz w:val="22"/>
+          <w:u w:val="single"/>
+        </w:rPr>
+        <w:t xml:space="preserve">those </w:t>
+      </w:r>
+      <w:r>
+        <w:rPr>
+          <w:sz w:val="22"/>
+        </w:rPr>
+        <w:t xml:space="preserve">phases, </w:t>
+      </w:r>
+      <w:r>
+        <w:rPr>
+          <w:strike/>
+          <w:color w:val="CC0000"/>
+          <w:sz w:val="22"/>
+        </w:rPr>
+        <w:t xml:space="preserve">representing a significant Indigenous-led partnership model. </w:t>
+      </w:r>
+      <w:r>
+        <w:rPr>
+          <w:color w:val="0044CC"/>
+          <w:sz w:val="22"/>
+          <w:u w:val="single"/>
+        </w:rPr>
+        <w:t xml:space="preserve">while Squamish Nation holds 100% ownership of Phases Three and Four. </w:t>
+      </w:r>
+    </w:p>
+    <w:p>
+      <w:r>
+        <w:rPr>
+          <w:strike/>
+          <w:color w:val="CC0000"/>
+          <w:sz w:val="22"/>
+        </w:rPr>
+        <w:t xml:space="preserve">Project Scope &amp; Public Space </w:t>
+      </w:r>
+      <w:r>
+        <w:rPr>
+          <w:color w:val="0044CC"/>
+          <w:sz w:val="22"/>
+          <w:u w:val="single"/>
+        </w:rPr>
+        <w:t xml:space="preserve">Services Agreement </w:t>
+      </w:r>
+    </w:p>
+    <w:p>
+      <w:r>
+        <w:rPr>
+          <w:strike/>
+          <w:color w:val="CC0000"/>
+          <w:sz w:val="22"/>
+        </w:rPr>
+        <w:t xml:space="preserve">Sen̓áḵw's unit mix includes 2,688 studios, 2,046 one-bedrooms, 874 two-bedrooms, </w:t>
+      </w:r>
+      <w:r>
+        <w:rPr>
+          <w:color w:val="0044CC"/>
+          <w:sz w:val="22"/>
+          <w:u w:val="single"/>
+        </w:rPr>
+        <w:t xml:space="preserve">The City of Vancouver </w:t>
+      </w:r>
+      <w:r>
+        <w:rPr>
+          <w:sz w:val="22"/>
+        </w:rPr>
+        <w:t xml:space="preserve">and </w:t>
+      </w:r>
+      <w:r>
+        <w:rPr>
+          <w:strike/>
+          <w:color w:val="CC0000"/>
+          <w:sz w:val="22"/>
+        </w:rPr>
+        <w:t xml:space="preserve">472 three-bedrooms. Over half </w:t>
+      </w:r>
+      <w:r>
+        <w:rPr>
+          <w:color w:val="0044CC"/>
+          <w:sz w:val="22"/>
+          <w:u w:val="single"/>
+        </w:rPr>
+        <w:t xml:space="preserve">Squamish Nation signed a services agreement on May 25, 2022. The Service Agreement Overview states a 120-year term applying to all four phases. It also states that </w:t>
+      </w:r>
+      <w:r>
+        <w:rPr>
+          <w:sz w:val="22"/>
+        </w:rPr>
+        <w:t xml:space="preserve">the </w:t>
+      </w:r>
+      <w:r>
+        <w:rPr>
+          <w:strike/>
+          <w:color w:val="CC0000"/>
+          <w:sz w:val="22"/>
+        </w:rPr>
+        <w:t xml:space="preserve">site (roughly six acres) is planned as publicly accessible green space </w:t>
+      </w:r>
+      <w:r>
+        <w:rPr>
+          <w:color w:val="0044CC"/>
+          <w:sz w:val="22"/>
+          <w:u w:val="single"/>
+        </w:rPr>
+        <w:t xml:space="preserve">City provides core municipal services, </w:t>
+      </w:r>
+      <w:r>
+        <w:rPr>
+          <w:sz w:val="22"/>
+        </w:rPr>
+        <w:t xml:space="preserve">and </w:t>
+      </w:r>
+      <w:r>
+        <w:rPr>
+          <w:strike/>
+          <w:color w:val="CC0000"/>
+          <w:sz w:val="22"/>
+        </w:rPr>
+        <w:t xml:space="preserve">cultural gathering areas. </w:t>
+      </w:r>
+      <w:r>
+        <w:rPr>
+          <w:color w:val="0044CC"/>
+          <w:sz w:val="22"/>
+          <w:u w:val="single"/>
+        </w:rPr>
+        <w:t xml:space="preserve">the Nation pays annual charges using the same methodology applied to other Vancouver property owners. </w:t>
+      </w:r>
+    </w:p>
+    <w:p>
+      <w:r>
+        <w:rPr>
+          <w:strike/>
+          <w:color w:val="CC0000"/>
+          <w:sz w:val="22"/>
+        </w:rPr>
+        <w:t xml:space="preserve">Services Agreement &amp; Tenant Protections </w:t>
+      </w:r>
+      <w:r>
+        <w:rPr>
+          <w:color w:val="0044CC"/>
+          <w:sz w:val="22"/>
+          <w:u w:val="single"/>
+        </w:rPr>
+        <w:t xml:space="preserve">The same overview states that the first two phases are expected to include approximately 2,950 rental units, including 590 affordable units (20%), plus 65-75 childcare spaces. </w:t>
+      </w:r>
+    </w:p>
+    <w:p>
+      <w:r>
+        <w:rPr>
+          <w:strike/>
+          <w:color w:val="CC0000"/>
+          <w:sz w:val="22"/>
+        </w:rPr>
+        <w:t xml:space="preserve">A 120-year services agreement with the City of Vancouver (signed May 2022) covers water, sewer, fire, and police services, with the Squamish Nation paying the same rates as Vancouver property owners. </w:t>
+      </w:r>
+      <w:r>
+        <w:rPr>
+          <w:color w:val="0044CC"/>
+          <w:sz w:val="22"/>
+          <w:u w:val="single"/>
+        </w:rPr>
+        <w:t xml:space="preserve">Tenant Protections </w:t>
       </w:r>
     </w:p>
     <w:p>
@@ -935,7 +2394,7 @@
           <w:sz w:val="22"/>
           <w:u w:val="single"/>
         </w:rPr>
-        <w:t xml:space="preserve">In July 2023, the </w:t>
+        <w:t xml:space="preserve">In July 2023, </w:t>
       </w:r>
       <w:r>
         <w:rPr>
@@ -957,7 +2416,7 @@
           <w:sz w:val="22"/>
           <w:u w:val="single"/>
         </w:rPr>
-        <w:t xml:space="preserve">became the first in Canada to adopt </w:t>
+        <w:t xml:space="preserve">announced that protections in </w:t>
       </w:r>
       <w:r>
         <w:rPr>
@@ -971,7 +2430,7 @@
           <w:sz w:val="22"/>
           <w:u w:val="single"/>
         </w:rPr>
-        <w:t xml:space="preserve">(BCRTA) for a major housing development </w:t>
+        <w:t xml:space="preserve">(BCRTA) would be in place for Sen̓áḵw </w:t>
       </w:r>
       <w:r>
         <w:rPr>
@@ -999,81 +2458,15 @@
           <w:color w:val="CC0000"/>
           <w:sz w:val="22"/>
         </w:rPr>
-        <w:t xml:space="preserve">Act, ensuring </w:t>
-      </w:r>
-      <w:r>
-        <w:rPr>
-          <w:color w:val="0044CC"/>
-          <w:sz w:val="22"/>
-          <w:u w:val="single"/>
-        </w:rPr>
-        <w:t xml:space="preserve">Act (FNCIDA). FNCIDA enables First Nations to request federal regulations that incorporate provincial law on reserve lands — a mechanism used only five times since 2005, and never before for residential housing. This means Sen̓áḵw tenants receive the same </w:t>
-      </w:r>
-      <w:r>
-        <w:rPr>
-          <w:sz w:val="22"/>
-        </w:rPr>
-        <w:t xml:space="preserve">rent increase </w:t>
-      </w:r>
-      <w:r>
-        <w:rPr>
-          <w:strike/>
-          <w:color w:val="CC0000"/>
-          <w:sz w:val="22"/>
-        </w:rPr>
-        <w:t xml:space="preserve">limits </w:t>
-      </w:r>
-      <w:r>
-        <w:rPr>
-          <w:color w:val="0044CC"/>
-          <w:sz w:val="22"/>
-          <w:u w:val="single"/>
-        </w:rPr>
-        <w:t xml:space="preserve">limits, eviction protections, </w:t>
-      </w:r>
-      <w:r>
-        <w:rPr>
-          <w:sz w:val="22"/>
-        </w:rPr>
-        <w:t xml:space="preserve">and </w:t>
-      </w:r>
-      <w:r>
-        <w:rPr>
-          <w:strike/>
-          <w:color w:val="CC0000"/>
-          <w:sz w:val="22"/>
-        </w:rPr>
-        <w:t xml:space="preserve">tenant protections, alongside </w:t>
-      </w:r>
-      <w:r>
-        <w:rPr>
-          <w:color w:val="0044CC"/>
-          <w:sz w:val="22"/>
-          <w:u w:val="single"/>
-        </w:rPr>
-        <w:t xml:space="preserve">dispute resolution rights as any BC renter, with one key addition: </w:t>
-      </w:r>
-      <w:r>
-        <w:rPr>
-          <w:sz w:val="22"/>
-        </w:rPr>
-        <w:t xml:space="preserve">an Indigenous-led dispute resolution </w:t>
-      </w:r>
-      <w:r>
-        <w:rPr>
-          <w:strike/>
-          <w:color w:val="CC0000"/>
-          <w:sz w:val="22"/>
-        </w:rPr>
-        <w:t xml:space="preserve">process. </w:t>
-      </w:r>
-      <w:r>
-        <w:rPr>
-          <w:color w:val="0044CC"/>
-          <w:sz w:val="22"/>
-          <w:u w:val="single"/>
-        </w:rPr>
-        <w:t xml:space="preserve">process consistent with Squamish traditions. The protections also extend to Hiy̓ám̓ Housing developments on other Squamish Nation reserves in North Vancouver. </w:t>
+        <w:t xml:space="preserve">Act, ensuring rent increase limits and tenant protections, alongside an Indigenous-led dispute resolution process. </w:t>
+      </w:r>
+      <w:r>
+        <w:rPr>
+          <w:color w:val="0044CC"/>
+          <w:sz w:val="22"/>
+          <w:u w:val="single"/>
+        </w:rPr>
+        <w:t xml:space="preserve">Act (FNCIDA). The Squamish Nation Residential Tenancy Regulations (SOR/2023-135) are now in force under FNCIDA. </w:t>
       </w:r>
     </w:p>
     <w:p>
@@ -1103,7 +2496,46 @@
     </w:p>
     <w:p>
       <w:r>
-        <w:t>• The 100% rental model prevents speculation and ensures ongoing control</w:t>
+        <w:rPr>
+          <w:sz w:val="22"/>
+        </w:rPr>
+        <w:t xml:space="preserve">• The </w:t>
+      </w:r>
+      <w:r>
+        <w:rPr>
+          <w:strike/>
+          <w:color w:val="CC0000"/>
+          <w:sz w:val="22"/>
+        </w:rPr>
+        <w:t xml:space="preserve">100% </w:t>
+      </w:r>
+      <w:r>
+        <w:rPr>
+          <w:sz w:val="22"/>
+        </w:rPr>
+        <w:t xml:space="preserve">rental model </w:t>
+      </w:r>
+      <w:r>
+        <w:rPr>
+          <w:strike/>
+          <w:color w:val="CC0000"/>
+          <w:sz w:val="22"/>
+        </w:rPr>
+        <w:t xml:space="preserve">prevents speculation and ensures ongoing </w:t>
+      </w:r>
+      <w:r>
+        <w:rPr>
+          <w:color w:val="0044CC"/>
+          <w:sz w:val="22"/>
+          <w:u w:val="single"/>
+        </w:rPr>
+        <w:t xml:space="preserve">supports long-term community </w:t>
+      </w:r>
+      <w:r>
+        <w:rPr>
+          <w:sz w:val="22"/>
+        </w:rPr>
+        <w:t xml:space="preserve">control </w:t>
       </w:r>
     </w:p>
     <w:p>
@@ -1116,7 +2548,29 @@
         <w:rPr>
           <w:sz w:val="22"/>
         </w:rPr>
-        <w:t xml:space="preserve">• 100% rental: 6,000 </w:t>
+        <w:t xml:space="preserve">• </w:t>
+      </w:r>
+      <w:r>
+        <w:rPr>
+          <w:strike/>
+          <w:color w:val="CC0000"/>
+          <w:sz w:val="22"/>
+        </w:rPr>
+        <w:t xml:space="preserve">100% rental: </w:t>
+      </w:r>
+      <w:r>
+        <w:rPr>
+          <w:color w:val="0044CC"/>
+          <w:sz w:val="22"/>
+          <w:u w:val="single"/>
+        </w:rPr>
+        <w:t xml:space="preserve">Project scale: </w:t>
+      </w:r>
+      <w:r>
+        <w:rPr>
+          <w:sz w:val="22"/>
+        </w:rPr>
+        <w:t xml:space="preserve">6,000 </w:t>
       </w:r>
       <w:r>
         <w:rPr>
@@ -1132,7 +2586,7 @@
           <w:sz w:val="22"/>
           <w:u w:val="single"/>
         </w:rPr>
-        <w:t xml:space="preserve">units; </w:t>
+        <w:t xml:space="preserve">rental homes and </w:t>
       </w:r>
       <w:r>
         <w:rPr>
@@ -1154,22 +2608,89 @@
           <w:sz w:val="22"/>
           <w:u w:val="single"/>
         </w:rPr>
-        <w:t xml:space="preserve">affordable; 250 for Squamish Nation members via Hiy̓ám̓ Housing </w:t>
-      </w:r>
-    </w:p>
-    <w:p>
-      <w:r>
-        <w:t>• $1.4B federal loan announced September 2022</w:t>
-      </w:r>
-    </w:p>
-    <w:p>
-      <w:r>
-        <w:t>• 50/50 Squamish Nation-OPTrust ownership (Phases 1-2)</w:t>
-      </w:r>
-    </w:p>
-    <w:p>
-      <w:r>
-        <w:t>• Over half the site dedicated to public green space</w:t>
+        <w:t xml:space="preserve">below-market homes </w:t>
+      </w:r>
+    </w:p>
+    <w:p>
+      <w:r>
+        <w:rPr>
+          <w:sz w:val="22"/>
+        </w:rPr>
+        <w:t xml:space="preserve">• </w:t>
+      </w:r>
+      <w:r>
+        <w:rPr>
+          <w:strike/>
+          <w:color w:val="CC0000"/>
+          <w:sz w:val="22"/>
+        </w:rPr>
+        <w:t xml:space="preserve">$1.4B federal loan announced September 2022 </w:t>
+      </w:r>
+      <w:r>
+        <w:rPr>
+          <w:color w:val="0044CC"/>
+          <w:sz w:val="22"/>
+          <w:u w:val="single"/>
+        </w:rPr>
+        <w:t xml:space="preserve">Phase One: 1,409 homes across three towers; 250 homes allocated through Hiy̓ám̓ Housing </w:t>
+      </w:r>
+    </w:p>
+    <w:p>
+      <w:r>
+        <w:rPr>
+          <w:sz w:val="22"/>
+        </w:rPr>
+        <w:t xml:space="preserve">• </w:t>
+      </w:r>
+      <w:r>
+        <w:rPr>
+          <w:strike/>
+          <w:color w:val="CC0000"/>
+          <w:sz w:val="22"/>
+        </w:rPr>
+        <w:t xml:space="preserve">50/50 Squamish Nation-OPTrust ownership (Phases 1-2) </w:t>
+      </w:r>
+      <w:r>
+        <w:rPr>
+          <w:color w:val="0044CC"/>
+          <w:sz w:val="22"/>
+          <w:u w:val="single"/>
+        </w:rPr>
+        <w:t xml:space="preserve">$1.4B federal financing support announced September 6, 2022 </w:t>
+      </w:r>
+    </w:p>
+    <w:p>
+      <w:r>
+        <w:rPr>
+          <w:sz w:val="22"/>
+        </w:rPr>
+        <w:t xml:space="preserve">• </w:t>
+      </w:r>
+      <w:r>
+        <w:rPr>
+          <w:strike/>
+          <w:color w:val="CC0000"/>
+          <w:sz w:val="22"/>
+        </w:rPr>
+        <w:t xml:space="preserve">Over half the site dedicated to public green space </w:t>
+      </w:r>
+      <w:r>
+        <w:rPr>
+          <w:color w:val="0044CC"/>
+          <w:sz w:val="22"/>
+          <w:u w:val="single"/>
+        </w:rPr>
+        <w:t xml:space="preserve">August 28, 2025: OPTrust and Squamish Nation each hold 50% of Phases 1-2; Nation holds 100% of Phases 3-4 </w:t>
+      </w:r>
+    </w:p>
+    <w:p>
+      <w:r>
+        <w:rPr>
+          <w:color w:val="0044CC"/>
+          <w:sz w:val="22"/>
+          <w:u w:val="single"/>
+        </w:rPr>
+        <w:t>• Services agreement term: 120 years; first two phases: ~2,950 rental homes including 590 affordable units</w:t>
       </w:r>
     </w:p>
     <w:p>
@@ -1215,52 +2736,230 @@
     </w:p>
     <w:p>
       <w:r>
+        <w:rPr>
+          <w:color w:val="0044CC"/>
+          <w:sz w:val="22"/>
+          <w:u w:val="single"/>
+        </w:rPr>
+        <w:t>• Sen̓áḵw Project Page - Current project headline figures including rental and below-market homes | https://senakw.com/project</w:t>
+      </w:r>
+    </w:p>
+    <w:p>
+      <w:r>
         <w:t>• Squamish Nation — Sen̓áḵw Partnership - Squamish Nation's overview of the project | https://www.squamish.net/partnerships-entities/partnerships/senakw/</w:t>
       </w:r>
     </w:p>
     <w:p>
       <w:r>
+        <w:rPr>
+          <w:color w:val="0044CC"/>
+          <w:sz w:val="22"/>
+          <w:u w:val="single"/>
+        </w:rPr>
+        <w:t>• Squamish Nation — Returning to Sen̓áḵw (Feb 5, 2026) - Phase-one home count, three-tower configuration, and move-in timing update | https://www.squamish.net/returning-to-sen%CC%93a%E1%B8%B5w/</w:t>
+      </w:r>
+    </w:p>
+    <w:p>
+      <w:r>
+        <w:rPr>
+          <w:color w:val="0044CC"/>
+          <w:sz w:val="22"/>
+          <w:u w:val="single"/>
+        </w:rPr>
+        <w:t>• Hiy̓ám̓ Housing — Sen̓áḵw - 250 homes allocated for Squamish People through Hiy̓ám̓ Housing | https://hiyamhousing.com/senakw</w:t>
+      </w:r>
+    </w:p>
+    <w:p>
+      <w:r>
+        <w:rPr>
+          <w:color w:val="0044CC"/>
+          <w:sz w:val="22"/>
+          <w:u w:val="single"/>
+        </w:rPr>
+        <w:t>• Prime Minister of Canada (Sep 6, 2022) — Historic partnership announcement - Announcement of $1.4 billion federal support for early Sen̓áḵw phases | https://www.pm.gc.ca/en/news/news-releases/2022/09/06/historic-partnership-between-canada-and-skwxwu7mesh-uxwumixw-squamish</w:t>
+      </w:r>
+    </w:p>
+    <w:p>
+      <w:r>
+        <w:rPr>
+          <w:color w:val="0044CC"/>
+          <w:sz w:val="22"/>
+          <w:u w:val="single"/>
+        </w:rPr>
+        <w:t>• City of Vancouver-Squamish Nation Sen̓áḵw Service Agreement Overview (PDF) - 120-year term, municipal service framework, and phase 1-2 housing/affordability figures | https://www.squamish.net/wp-content/uploads/2023/11/Senakw-Service-Agreement-Overview.pdf</w:t>
+      </w:r>
+    </w:p>
+    <w:p>
+      <w:r>
         <w:t>• City of Vancouver — Sen̓áḵw Development - City coordination and infrastructure planning | https://vancouver.ca/home-property-development/senakw-development.aspx</w:t>
       </w:r>
     </w:p>
     <w:p>
       <w:r>
-        <w:t>• CBC — Inside Canada's Largest Indigenous-Led Housing Development - 2025 media coverage with interior previews | https://www.cbc.ca/news/canada/british-columbia/sen-%C3%A1%E1%B8%B5w-sneak-preview-1.7451499</w:t>
-      </w:r>
-    </w:p>
-    <w:p>
-      <w:r>
-        <w:t>• Vancouver Public Views Policy - Background on view cone regulations | https://vancouver.ca/home-property-development/protecting-vancouvers-views.aspx</w:t>
-      </w:r>
-    </w:p>
-    <w:p>
-      <w:r>
-        <w:rPr>
-          <w:color w:val="0044CC"/>
-          <w:sz w:val="22"/>
-          <w:u w:val="single"/>
-        </w:rPr>
-        <w:t>• Squamish Nation — BCRTA Adoption Press Release - First-in-Canada adoption of provincial tenancy protections on reserve land via FNCIDA | https://www.squamish.net/bcrta-adoption/</w:t>
-      </w:r>
-    </w:p>
-    <w:p>
-      <w:r>
-        <w:rPr>
-          <w:color w:val="0044CC"/>
-          <w:sz w:val="22"/>
-          <w:u w:val="single"/>
-        </w:rPr>
-        <w:t>• First Nations Commercial and Industrial Development Act (FNCIDA) - Federal legislation enabling Squamish Nation residential tenancy regulations | https://www.sac-isc.gc.ca/eng/1100100033561/1612128155378</w:t>
-      </w:r>
-    </w:p>
-    <w:p>
-      <w:r>
-        <w:rPr>
-          <w:color w:val="0044CC"/>
-          <w:sz w:val="22"/>
-          <w:u w:val="single"/>
-        </w:rPr>
-        <w:t>• Maclean's — Vancouver's Mega-Development Is Undeniably Indigenous - In-depth feature on Sen̓áḵw's significance for Indigenous urbanism | https://macleans.ca/society/senakw-vancouver/</w:t>
+        <w:rPr>
+          <w:sz w:val="22"/>
+        </w:rPr>
+        <w:t xml:space="preserve">• </w:t>
+      </w:r>
+      <w:r>
+        <w:rPr>
+          <w:strike/>
+          <w:color w:val="CC0000"/>
+          <w:sz w:val="22"/>
+        </w:rPr>
+        <w:t xml:space="preserve">CBC </w:t>
+      </w:r>
+      <w:r>
+        <w:rPr>
+          <w:color w:val="0044CC"/>
+          <w:sz w:val="22"/>
+          <w:u w:val="single"/>
+        </w:rPr>
+        <w:t xml:space="preserve">City of Vancouver </w:t>
+      </w:r>
+      <w:r>
+        <w:rPr>
+          <w:sz w:val="22"/>
+        </w:rPr>
+        <w:t xml:space="preserve">— </w:t>
+      </w:r>
+      <w:r>
+        <w:rPr>
+          <w:strike/>
+          <w:color w:val="CC0000"/>
+          <w:sz w:val="22"/>
+        </w:rPr>
+        <w:t xml:space="preserve">Inside Canada's Largest Indigenous-Led Housing Development </w:t>
+      </w:r>
+      <w:r>
+        <w:rPr>
+          <w:color w:val="0044CC"/>
+          <w:sz w:val="22"/>
+          <w:u w:val="single"/>
+        </w:rPr>
+        <w:t xml:space="preserve">Public Views </w:t>
+      </w:r>
+      <w:r>
+        <w:rPr>
+          <w:sz w:val="22"/>
+        </w:rPr>
+        <w:t xml:space="preserve">- </w:t>
+      </w:r>
+      <w:r>
+        <w:rPr>
+          <w:strike/>
+          <w:color w:val="CC0000"/>
+          <w:sz w:val="22"/>
+        </w:rPr>
+        <w:t xml:space="preserve">2025 media coverage with interior previews </w:t>
+      </w:r>
+      <w:r>
+        <w:rPr>
+          <w:color w:val="0044CC"/>
+          <w:sz w:val="22"/>
+          <w:u w:val="single"/>
+        </w:rPr>
+        <w:t xml:space="preserve">Public views policy background and July 10, 2024 guideline update </w:t>
+      </w:r>
+      <w:r>
+        <w:rPr>
+          <w:sz w:val="22"/>
+        </w:rPr>
+        <w:t xml:space="preserve">| </w:t>
+      </w:r>
+      <w:r>
+        <w:rPr>
+          <w:strike/>
+          <w:color w:val="CC0000"/>
+          <w:sz w:val="22"/>
+        </w:rPr>
+        <w:t xml:space="preserve">https://www.cbc.ca/news/canada/british-columbia/sen-%C3%A1%E1%B8%B5w-sneak-preview-1.7451499 </w:t>
+      </w:r>
+      <w:r>
+        <w:rPr>
+          <w:color w:val="0044CC"/>
+          <w:sz w:val="22"/>
+          <w:u w:val="single"/>
+        </w:rPr>
+        <w:t xml:space="preserve">https://vancouver.ca/home-property-development/protecting-public-views.aspx </w:t>
+      </w:r>
+    </w:p>
+    <w:p>
+      <w:r>
+        <w:rPr>
+          <w:sz w:val="22"/>
+        </w:rPr>
+        <w:t xml:space="preserve">• </w:t>
+      </w:r>
+      <w:r>
+        <w:rPr>
+          <w:strike/>
+          <w:color w:val="CC0000"/>
+          <w:sz w:val="22"/>
+        </w:rPr>
+        <w:t xml:space="preserve">Vancouver Public Views Policy </w:t>
+      </w:r>
+      <w:r>
+        <w:rPr>
+          <w:color w:val="0044CC"/>
+          <w:sz w:val="22"/>
+          <w:u w:val="single"/>
+        </w:rPr>
+        <w:t xml:space="preserve">OPTrust (Aug 28, 2025) — Sen̓áḵw ownership update </w:t>
+      </w:r>
+      <w:r>
+        <w:rPr>
+          <w:sz w:val="22"/>
+        </w:rPr>
+        <w:t xml:space="preserve">- </w:t>
+      </w:r>
+      <w:r>
+        <w:rPr>
+          <w:strike/>
+          <w:color w:val="CC0000"/>
+          <w:sz w:val="22"/>
+        </w:rPr>
+        <w:t xml:space="preserve">Background on view cone regulations </w:t>
+      </w:r>
+      <w:r>
+        <w:rPr>
+          <w:color w:val="0044CC"/>
+          <w:sz w:val="22"/>
+          <w:u w:val="single"/>
+        </w:rPr>
+        <w:t xml:space="preserve">OPTrust 50% stake in Phases 1-2 and updated partnership structure </w:t>
+      </w:r>
+      <w:r>
+        <w:rPr>
+          <w:sz w:val="22"/>
+        </w:rPr>
+        <w:t xml:space="preserve">| </w:t>
+      </w:r>
+      <w:r>
+        <w:rPr>
+          <w:strike/>
+          <w:color w:val="CC0000"/>
+          <w:sz w:val="22"/>
+        </w:rPr>
+        <w:t xml:space="preserve">https://vancouver.ca/home-property-development/protecting-vancouvers-views.aspx </w:t>
+      </w:r>
+      <w:r>
+        <w:rPr>
+          <w:color w:val="0044CC"/>
+          <w:sz w:val="22"/>
+          <w:u w:val="single"/>
+        </w:rPr>
+        <w:t xml:space="preserve">https://www.optrust.com/news/senakw-development-partnership-welcomes-50-ownership-stake-by-OPTrust </w:t>
+      </w:r>
+    </w:p>
+    <w:p>
+      <w:r>
+        <w:rPr>
+          <w:color w:val="0044CC"/>
+          <w:sz w:val="22"/>
+          <w:u w:val="single"/>
+        </w:rPr>
+        <w:t>• Squamish Nation Residential Tenancy Regulations (SOR/2023-135) - Federal regulations applying BC tenancy-law framework to Sen̓áḵw through FNCIDA | https://laws-lois.justice.gc.ca/eng/regulations/SOR-2023-135/index.html</w:t>
       </w:r>
     </w:p>
     <w:p>

</xml_diff>

<commit_message>
Update Senakw stats sources
</commit_message>
<xml_diff>
--- a/BSH_2026_Tour_Content_Tracked_Changes.docx
+++ b/BSH_2026_Tour_Content_Tracked_Changes.docx
@@ -1444,43 +1444,43 @@
           <w:color w:val="CC0000"/>
           <w:sz w:val="22"/>
         </w:rPr>
-        <w:t xml:space="preserve">Units: </w:t>
-      </w:r>
-      <w:r>
-        <w:rPr>
-          <w:color w:val="0044CC"/>
-          <w:sz w:val="22"/>
-          <w:u w:val="single"/>
-        </w:rPr>
-        <w:t xml:space="preserve">Rental Homes: </w:t>
-      </w:r>
-      <w:r>
-        <w:rPr>
-          <w:sz w:val="22"/>
-        </w:rPr>
-        <w:t xml:space="preserve">6,000 | </w:t>
-      </w:r>
-      <w:r>
-        <w:rPr>
-          <w:strike/>
-          <w:color w:val="CC0000"/>
-          <w:sz w:val="22"/>
-        </w:rPr>
-        <w:t xml:space="preserve">Affordable: </w:t>
-      </w:r>
-      <w:r>
-        <w:rPr>
-          <w:color w:val="0044CC"/>
-          <w:sz w:val="22"/>
-          <w:u w:val="single"/>
-        </w:rPr>
-        <w:t xml:space="preserve">Below-Market Homes: </w:t>
-      </w:r>
-      <w:r>
-        <w:rPr>
-          <w:sz w:val="22"/>
-        </w:rPr>
-        <w:t xml:space="preserve">1,200 | Phase </w:t>
+        <w:t xml:space="preserve">Units: 6,000 </w:t>
+      </w:r>
+      <w:r>
+        <w:rPr>
+          <w:color w:val="0044CC"/>
+          <w:sz w:val="22"/>
+          <w:u w:val="single"/>
+        </w:rPr>
+        <w:t xml:space="preserve">Rental Homes: 6,000+ </w:t>
+      </w:r>
+      <w:r>
+        <w:rPr>
+          <w:sz w:val="22"/>
+        </w:rPr>
+        <w:t xml:space="preserve">| </w:t>
+      </w:r>
+      <w:r>
+        <w:rPr>
+          <w:strike/>
+          <w:color w:val="CC0000"/>
+          <w:sz w:val="22"/>
+        </w:rPr>
+        <w:t xml:space="preserve">Affordable: 1,200 </w:t>
+      </w:r>
+      <w:r>
+        <w:rPr>
+          <w:color w:val="0044CC"/>
+          <w:sz w:val="22"/>
+          <w:u w:val="single"/>
+        </w:rPr>
+        <w:t xml:space="preserve">Below-Market Homes: 1,200+ </w:t>
+      </w:r>
+      <w:r>
+        <w:rPr>
+          <w:sz w:val="22"/>
+        </w:rPr>
+        <w:t xml:space="preserve">| Phase </w:t>
       </w:r>
       <w:r>
         <w:rPr>
@@ -1671,59 +1671,37 @@
           <w:color w:val="CC0000"/>
           <w:sz w:val="22"/>
         </w:rPr>
-        <w:t xml:space="preserve">development will include </w:t>
-      </w:r>
-      <w:r>
-        <w:rPr>
-          <w:color w:val="0044CC"/>
-          <w:sz w:val="22"/>
-          <w:u w:val="single"/>
-        </w:rPr>
-        <w:t xml:space="preserve">project is planned as </w:t>
-      </w:r>
-      <w:r>
-        <w:rPr>
-          <w:sz w:val="22"/>
-        </w:rPr>
-        <w:t xml:space="preserve">6,000 purpose-built rental </w:t>
-      </w:r>
-      <w:r>
-        <w:rPr>
-          <w:strike/>
-          <w:color w:val="CC0000"/>
-          <w:sz w:val="22"/>
-        </w:rPr>
-        <w:t xml:space="preserve">units across 11 towers, with 4 million square feet of floor space. Critically, </w:t>
-      </w:r>
-      <w:r>
-        <w:rPr>
-          <w:color w:val="0044CC"/>
-          <w:sz w:val="22"/>
-          <w:u w:val="single"/>
-        </w:rPr>
-        <w:t xml:space="preserve">homes, including </w:t>
-      </w:r>
-      <w:r>
-        <w:rPr>
-          <w:sz w:val="22"/>
-        </w:rPr>
-        <w:t xml:space="preserve">1,200 </w:t>
-      </w:r>
-      <w:r>
-        <w:rPr>
-          <w:strike/>
-          <w:color w:val="CC0000"/>
-          <w:sz w:val="22"/>
-        </w:rPr>
-        <w:t xml:space="preserve">units will be designated affordable, and rents will be 30-40% below comparable market rates. </w:t>
-      </w:r>
-      <w:r>
-        <w:rPr>
-          <w:color w:val="0044CC"/>
-          <w:sz w:val="22"/>
-          <w:u w:val="single"/>
-        </w:rPr>
-        <w:t xml:space="preserve">below-market homes. Hiy̓ám̓ Housing states that 250 homes are allocated for Squamish People through its housing stream. </w:t>
+        <w:t xml:space="preserve">development will include 6,000 </w:t>
+      </w:r>
+      <w:r>
+        <w:rPr>
+          <w:color w:val="0044CC"/>
+          <w:sz w:val="22"/>
+          <w:u w:val="single"/>
+        </w:rPr>
+        <w:t xml:space="preserve">project is planned as 6,000+ </w:t>
+      </w:r>
+      <w:r>
+        <w:rPr>
+          <w:sz w:val="22"/>
+        </w:rPr>
+        <w:t xml:space="preserve">purpose-built rental </w:t>
+      </w:r>
+      <w:r>
+        <w:rPr>
+          <w:strike/>
+          <w:color w:val="CC0000"/>
+          <w:sz w:val="22"/>
+        </w:rPr>
+        <w:t xml:space="preserve">units across 11 towers, with 4 million square feet of floor space. Critically, 1,200 units will be designated affordable, and rents will be 30-40% below comparable market rates. </w:t>
+      </w:r>
+      <w:r>
+        <w:rPr>
+          <w:color w:val="0044CC"/>
+          <w:sz w:val="22"/>
+          <w:u w:val="single"/>
+        </w:rPr>
+        <w:t xml:space="preserve">homes, including 1,200+ below-market homes. Hiy̓ám̓ Housing states that 250 homes are allocated for Squamish People through its housing stream. </w:t>
       </w:r>
     </w:p>
     <w:p>
@@ -2556,59 +2534,15 @@
           <w:color w:val="CC0000"/>
           <w:sz w:val="22"/>
         </w:rPr>
-        <w:t xml:space="preserve">100% rental: </w:t>
-      </w:r>
-      <w:r>
-        <w:rPr>
-          <w:color w:val="0044CC"/>
-          <w:sz w:val="22"/>
-          <w:u w:val="single"/>
-        </w:rPr>
-        <w:t xml:space="preserve">Project scale: </w:t>
-      </w:r>
-      <w:r>
-        <w:rPr>
-          <w:sz w:val="22"/>
-        </w:rPr>
-        <w:t xml:space="preserve">6,000 </w:t>
-      </w:r>
-      <w:r>
-        <w:rPr>
-          <w:strike/>
-          <w:color w:val="CC0000"/>
-          <w:sz w:val="22"/>
-        </w:rPr>
-        <w:t xml:space="preserve">units with </w:t>
-      </w:r>
-      <w:r>
-        <w:rPr>
-          <w:color w:val="0044CC"/>
-          <w:sz w:val="22"/>
-          <w:u w:val="single"/>
-        </w:rPr>
-        <w:t xml:space="preserve">rental homes and </w:t>
-      </w:r>
-      <w:r>
-        <w:rPr>
-          <w:sz w:val="22"/>
-        </w:rPr>
-        <w:t xml:space="preserve">1,200 </w:t>
-      </w:r>
-      <w:r>
-        <w:rPr>
-          <w:strike/>
-          <w:color w:val="CC0000"/>
-          <w:sz w:val="22"/>
-        </w:rPr>
-        <w:t xml:space="preserve">affordable </w:t>
-      </w:r>
-      <w:r>
-        <w:rPr>
-          <w:color w:val="0044CC"/>
-          <w:sz w:val="22"/>
-          <w:u w:val="single"/>
-        </w:rPr>
-        <w:t xml:space="preserve">below-market homes </w:t>
+        <w:t xml:space="preserve">100% rental: 6,000 units with 1,200 affordable </w:t>
+      </w:r>
+      <w:r>
+        <w:rPr>
+          <w:color w:val="0044CC"/>
+          <w:sz w:val="22"/>
+          <w:u w:val="single"/>
+        </w:rPr>
+        <w:t xml:space="preserve">Project scale: 6,000+ rental homes and 1,200+ below-market homes </w:t>
       </w:r>
     </w:p>
     <w:p>

</xml_diff>

<commit_message>
Update Granville Island data sources
</commit_message>
<xml_diff>
--- a/BSH_2026_Tour_Content_Tracked_Changes.docx
+++ b/BSH_2026_Tour_Content_Tracked_Changes.docx
@@ -3060,17 +3060,230 @@
     </w:p>
     <w:p>
       <w:r>
-        <w:t>Granville Island is a 40-acre federal property that demonstrates how public land ownership can create vibrant, mixed-use communities without privatization. Managed by the Canada Mortgage and Housing Corporation (CMHC) since 1973, the island is entirely self-sustaining with no government funding — operating solely on lease revenue, parking fees, and filming permits.</w:t>
-      </w:r>
-    </w:p>
-    <w:p>
-      <w:r>
-        <w:t>Between 1973 and 1982, CMHC invested $24.7 million to transform the former industrial site into a public market, arts hub, and cultural destination. As federal land, Granville Island operates outside Vancouver's municipal regulations, functioning essentially as its own jurisdiction and enabling creative placemaking that wouldn't be possible under rigid municipal zoning.</w:t>
-      </w:r>
-    </w:p>
-    <w:p>
-      <w:r>
-        <w:t>Urbanist and documentary creator Uytae Lee highlighted the island's governance model in a 2025 documentary, sparking renewed public debate about whether the site should pursue more development, public subsidy, or a new foundation model to fund repairs.</w:t>
+        <w:rPr>
+          <w:sz w:val="22"/>
+        </w:rPr>
+        <w:t xml:space="preserve">Granville Island is a </w:t>
+      </w:r>
+      <w:r>
+        <w:rPr>
+          <w:strike/>
+          <w:color w:val="CC0000"/>
+          <w:sz w:val="22"/>
+        </w:rPr>
+        <w:t xml:space="preserve">40-acre federal property that demonstrates how </w:t>
+      </w:r>
+      <w:r>
+        <w:rPr>
+          <w:color w:val="0044CC"/>
+          <w:sz w:val="22"/>
+          <w:u w:val="single"/>
+        </w:rPr>
+        <w:t xml:space="preserve">federally administered </w:t>
+      </w:r>
+      <w:r>
+        <w:rPr>
+          <w:sz w:val="22"/>
+        </w:rPr>
+        <w:t xml:space="preserve">public </w:t>
+      </w:r>
+      <w:r>
+        <w:rPr>
+          <w:color w:val="0044CC"/>
+          <w:sz w:val="22"/>
+          <w:u w:val="single"/>
+        </w:rPr>
+        <w:t xml:space="preserve">asset. A 2023 Granville Island Council notice describes it as 15.2 hectares of </w:t>
+      </w:r>
+      <w:r>
+        <w:rPr>
+          <w:sz w:val="22"/>
+        </w:rPr>
+        <w:t xml:space="preserve">land </w:t>
+      </w:r>
+      <w:r>
+        <w:rPr>
+          <w:strike/>
+          <w:color w:val="CC0000"/>
+          <w:sz w:val="22"/>
+        </w:rPr>
+        <w:t xml:space="preserve">ownership can create vibrant, mixed-use communities without privatization. Managed by the Canada Mortgage and Housing Corporation (CMHC) since 1973, the island is entirely self-sustaining with no government funding — operating solely on lease revenue, parking fees, and filming permits. </w:t>
+      </w:r>
+      <w:r>
+        <w:rPr>
+          <w:color w:val="0044CC"/>
+          <w:sz w:val="22"/>
+          <w:u w:val="single"/>
+        </w:rPr>
+        <w:t xml:space="preserve">plus 2.1 hectares of tidal water, in close proximity to downtown Vancouver. </w:t>
+      </w:r>
+    </w:p>
+    <w:p>
+      <w:r>
+        <w:rPr>
+          <w:strike/>
+          <w:color w:val="CC0000"/>
+          <w:sz w:val="22"/>
+        </w:rPr>
+        <w:t xml:space="preserve">Between </w:t>
+      </w:r>
+      <w:r>
+        <w:rPr>
+          <w:color w:val="0044CC"/>
+          <w:sz w:val="22"/>
+          <w:u w:val="single"/>
+        </w:rPr>
+        <w:t xml:space="preserve">The same notice states that administration, management, and control were transferred to CMHC by </w:t>
+      </w:r>
+      <w:r>
+        <w:rPr>
+          <w:sz w:val="22"/>
+        </w:rPr>
+        <w:t xml:space="preserve">1973 </w:t>
+      </w:r>
+      <w:r>
+        <w:rPr>
+          <w:strike/>
+          <w:color w:val="CC0000"/>
+          <w:sz w:val="22"/>
+        </w:rPr>
+        <w:t xml:space="preserve">and 1982, CMHC invested $24.7 million to transform the former industrial site into a public market, arts hub, and cultural destination. As federal land, </w:t>
+      </w:r>
+      <w:r>
+        <w:rPr>
+          <w:color w:val="0044CC"/>
+          <w:sz w:val="22"/>
+          <w:u w:val="single"/>
+        </w:rPr>
+        <w:t xml:space="preserve">Order in Council. </w:t>
+      </w:r>
+      <w:r>
+        <w:rPr>
+          <w:sz w:val="22"/>
+        </w:rPr>
+        <w:t xml:space="preserve">Granville Island </w:t>
+      </w:r>
+      <w:r>
+        <w:rPr>
+          <w:strike/>
+          <w:color w:val="CC0000"/>
+          <w:sz w:val="22"/>
+        </w:rPr>
+        <w:t xml:space="preserve">operates outside Vancouver's municipal regulations, functioning essentially </w:t>
+      </w:r>
+      <w:r>
+        <w:rPr>
+          <w:color w:val="0044CC"/>
+          <w:sz w:val="22"/>
+          <w:u w:val="single"/>
+        </w:rPr>
+        <w:t xml:space="preserve">Administration describes the island </w:t>
+      </w:r>
+      <w:r>
+        <w:rPr>
+          <w:sz w:val="22"/>
+        </w:rPr>
+        <w:t xml:space="preserve">as </w:t>
+      </w:r>
+      <w:r>
+        <w:rPr>
+          <w:strike/>
+          <w:color w:val="CC0000"/>
+          <w:sz w:val="22"/>
+        </w:rPr>
+        <w:t xml:space="preserve">its own jurisdiction </w:t>
+      </w:r>
+      <w:r>
+        <w:rPr>
+          <w:color w:val="0044CC"/>
+          <w:sz w:val="22"/>
+          <w:u w:val="single"/>
+        </w:rPr>
+        <w:t xml:space="preserve">operationally self-sustaining, with major revenues from rent </w:t>
+      </w:r>
+      <w:r>
+        <w:rPr>
+          <w:sz w:val="22"/>
+        </w:rPr>
+        <w:t xml:space="preserve">and </w:t>
+      </w:r>
+      <w:r>
+        <w:rPr>
+          <w:strike/>
+          <w:color w:val="CC0000"/>
+          <w:sz w:val="22"/>
+        </w:rPr>
+        <w:t xml:space="preserve">enabling creative placemaking that wouldn't be possible under rigid municipal zoning. </w:t>
+      </w:r>
+      <w:r>
+        <w:rPr>
+          <w:color w:val="0044CC"/>
+          <w:sz w:val="22"/>
+          <w:u w:val="single"/>
+        </w:rPr>
+        <w:t xml:space="preserve">parking. </w:t>
+      </w:r>
+    </w:p>
+    <w:p>
+      <w:r>
+        <w:rPr>
+          <w:strike/>
+          <w:color w:val="CC0000"/>
+          <w:sz w:val="22"/>
+        </w:rPr>
+        <w:t xml:space="preserve">Urbanist </w:t>
+      </w:r>
+      <w:r>
+        <w:rPr>
+          <w:color w:val="0044CC"/>
+          <w:sz w:val="22"/>
+          <w:u w:val="single"/>
+        </w:rPr>
+        <w:t xml:space="preserve">Granville Island continues to be used as a public policy reference point for how federal public land can support mixed cultural, commercial, </w:t>
+      </w:r>
+      <w:r>
+        <w:rPr>
+          <w:sz w:val="22"/>
+        </w:rPr>
+        <w:t xml:space="preserve">and </w:t>
+      </w:r>
+      <w:r>
+        <w:rPr>
+          <w:strike/>
+          <w:color w:val="CC0000"/>
+          <w:sz w:val="22"/>
+        </w:rPr>
+        <w:t xml:space="preserve">documentary creator Uytae Lee highlighted the island's governance model </w:t>
+      </w:r>
+      <w:r>
+        <w:rPr>
+          <w:color w:val="0044CC"/>
+          <w:sz w:val="22"/>
+          <w:u w:val="single"/>
+        </w:rPr>
+        <w:t xml:space="preserve">community uses </w:t>
+      </w:r>
+      <w:r>
+        <w:rPr>
+          <w:sz w:val="22"/>
+        </w:rPr>
+        <w:t xml:space="preserve">in a </w:t>
+      </w:r>
+      <w:r>
+        <w:rPr>
+          <w:strike/>
+          <w:color w:val="CC0000"/>
+          <w:sz w:val="22"/>
+        </w:rPr>
+        <w:t xml:space="preserve">2025 documentary, sparking renewed public debate about whether the site should pursue more development, public subsidy, or a new foundation model to fund repairs. </w:t>
+      </w:r>
+      <w:r>
+        <w:rPr>
+          <w:color w:val="0044CC"/>
+          <w:sz w:val="22"/>
+          <w:u w:val="single"/>
+        </w:rPr>
+        <w:t xml:space="preserve">high-value urban location. </w:t>
       </w:r>
     </w:p>
     <w:p>
@@ -3116,7 +3329,128 @@
     </w:p>
     <w:p>
       <w:r>
-        <w:t>CMHC owns all land on Granville Island and leases it to over 300 commercial, retail, cultural, artistic, and educational tenants. The island operates a subsidy model where market rents from some businesses support more affordable rents for:</w:t>
+        <w:rPr>
+          <w:sz w:val="22"/>
+        </w:rPr>
+        <w:t xml:space="preserve">CMHC </w:t>
+      </w:r>
+      <w:r>
+        <w:rPr>
+          <w:strike/>
+          <w:color w:val="CC0000"/>
+          <w:sz w:val="22"/>
+        </w:rPr>
+        <w:t xml:space="preserve">owns all land on </w:t>
+      </w:r>
+      <w:r>
+        <w:rPr>
+          <w:color w:val="0044CC"/>
+          <w:sz w:val="22"/>
+          <w:u w:val="single"/>
+        </w:rPr>
+        <w:t xml:space="preserve">administers </w:t>
+      </w:r>
+      <w:r>
+        <w:rPr>
+          <w:sz w:val="22"/>
+        </w:rPr>
+        <w:t xml:space="preserve">Granville Island </w:t>
+      </w:r>
+      <w:r>
+        <w:rPr>
+          <w:color w:val="0044CC"/>
+          <w:sz w:val="22"/>
+          <w:u w:val="single"/>
+        </w:rPr>
+        <w:t xml:space="preserve">on behalf of the Government of Canada </w:t>
+      </w:r>
+      <w:r>
+        <w:rPr>
+          <w:sz w:val="22"/>
+        </w:rPr>
+        <w:t xml:space="preserve">and leases </w:t>
+      </w:r>
+      <w:r>
+        <w:rPr>
+          <w:strike/>
+          <w:color w:val="CC0000"/>
+          <w:sz w:val="22"/>
+        </w:rPr>
+        <w:t xml:space="preserve">it </w:t>
+      </w:r>
+      <w:r>
+        <w:rPr>
+          <w:color w:val="0044CC"/>
+          <w:sz w:val="22"/>
+          <w:u w:val="single"/>
+        </w:rPr>
+        <w:t xml:space="preserve">space </w:t>
+      </w:r>
+      <w:r>
+        <w:rPr>
+          <w:sz w:val="22"/>
+        </w:rPr>
+        <w:t xml:space="preserve">to </w:t>
+      </w:r>
+      <w:r>
+        <w:rPr>
+          <w:strike/>
+          <w:color w:val="CC0000"/>
+          <w:sz w:val="22"/>
+        </w:rPr>
+        <w:t xml:space="preserve">over 300 commercial, retail, cultural, artistic, </w:t>
+      </w:r>
+      <w:r>
+        <w:rPr>
+          <w:color w:val="0044CC"/>
+          <w:sz w:val="22"/>
+          <w:u w:val="single"/>
+        </w:rPr>
+        <w:t xml:space="preserve">a diverse tenant mix. Granville Island Administration reports 300+ businesses </w:t>
+      </w:r>
+      <w:r>
+        <w:rPr>
+          <w:sz w:val="22"/>
+        </w:rPr>
+        <w:t xml:space="preserve">and </w:t>
+      </w:r>
+      <w:r>
+        <w:rPr>
+          <w:strike/>
+          <w:color w:val="CC0000"/>
+          <w:sz w:val="22"/>
+        </w:rPr>
+        <w:t xml:space="preserve">educational tenants. The island operates a subsidy model where market rents from some businesses </w:t>
+      </w:r>
+      <w:r>
+        <w:rPr>
+          <w:color w:val="0044CC"/>
+          <w:sz w:val="22"/>
+          <w:u w:val="single"/>
+        </w:rPr>
+        <w:t xml:space="preserve">3,000+ jobs, while emphasizing </w:t>
+      </w:r>
+      <w:r>
+        <w:rPr>
+          <w:sz w:val="22"/>
+        </w:rPr>
+        <w:t xml:space="preserve">support </w:t>
+      </w:r>
+      <w:r>
+        <w:rPr>
+          <w:strike/>
+          <w:color w:val="CC0000"/>
+          <w:sz w:val="22"/>
+        </w:rPr>
+        <w:t xml:space="preserve">more affordable rents for: </w:t>
+      </w:r>
+      <w:r>
+        <w:rPr>
+          <w:color w:val="0044CC"/>
+          <w:sz w:val="22"/>
+          <w:u w:val="single"/>
+        </w:rPr>
+        <w:t xml:space="preserve">for arts, culture, and local enterprise. </w:t>
       </w:r>
     </w:p>
     <w:p>
@@ -3136,7 +3470,52 @@
     </w:p>
     <w:p>
       <w:r>
-        <w:t>• The Public Market vendors</w:t>
+        <w:rPr>
+          <w:sz w:val="22"/>
+        </w:rPr>
+        <w:t xml:space="preserve">• </w:t>
+      </w:r>
+      <w:r>
+        <w:rPr>
+          <w:strike/>
+          <w:color w:val="CC0000"/>
+          <w:sz w:val="22"/>
+        </w:rPr>
+        <w:t xml:space="preserve">The </w:t>
+      </w:r>
+      <w:r>
+        <w:rPr>
+          <w:sz w:val="22"/>
+        </w:rPr>
+        <w:t xml:space="preserve">Public Market vendors </w:t>
+      </w:r>
+      <w:r>
+        <w:rPr>
+          <w:color w:val="0044CC"/>
+          <w:sz w:val="22"/>
+          <w:u w:val="single"/>
+        </w:rPr>
+        <w:t xml:space="preserve">and food businesses </w:t>
+      </w:r>
+    </w:p>
+    <w:p>
+      <w:r>
+        <w:rPr>
+          <w:color w:val="0044CC"/>
+          <w:sz w:val="22"/>
+          <w:u w:val="single"/>
+        </w:rPr>
+        <w:t>Economic Profile (2023 Council Notice)</w:t>
+      </w:r>
+    </w:p>
+    <w:p>
+      <w:r>
+        <w:rPr>
+          <w:color w:val="0044CC"/>
+          <w:sz w:val="22"/>
+          <w:u w:val="single"/>
+        </w:rPr>
+        <w:t>A 2023 Council notice reports Granville Island as generating over $300 million in economic activity, with $105 million in annual sales and about $2 million in annual tax receipts.</w:t>
       </w:r>
     </w:p>
     <w:p>
@@ -3146,11 +3525,109 @@
     </w:p>
     <w:p>
       <w:r>
-        <w:t>General Manager Tom Lancaster estimates up to $300 million is needed for infrastructure upgrades. Public Market revenues have leveled off, while aging buildings (including the former Emily Carr campus and Cats Social House) need major repairs.</w:t>
-      </w:r>
-    </w:p>
-    <w:p>
-      <w:r>
+        <w:rPr>
+          <w:strike/>
+          <w:color w:val="CC0000"/>
+          <w:sz w:val="22"/>
+        </w:rPr>
+        <w:t xml:space="preserve">General Manager Tom Lancaster estimates up </w:t>
+      </w:r>
+      <w:r>
+        <w:rPr>
+          <w:color w:val="0044CC"/>
+          <w:sz w:val="22"/>
+          <w:u w:val="single"/>
+        </w:rPr>
+        <w:t xml:space="preserve">Current Council priorities (2026–2028) identify Financial Sustainability and Asset Management as core focus areas, reflecting ongoing pressure </w:t>
+      </w:r>
+      <w:r>
+        <w:rPr>
+          <w:sz w:val="22"/>
+        </w:rPr>
+        <w:t xml:space="preserve">to </w:t>
+      </w:r>
+      <w:r>
+        <w:rPr>
+          <w:strike/>
+          <w:color w:val="CC0000"/>
+          <w:sz w:val="22"/>
+        </w:rPr>
+        <w:t xml:space="preserve">$300 million is needed for </w:t>
+      </w:r>
+      <w:r>
+        <w:rPr>
+          <w:color w:val="0044CC"/>
+          <w:sz w:val="22"/>
+          <w:u w:val="single"/>
+        </w:rPr>
+        <w:t xml:space="preserve">maintain aging </w:t>
+      </w:r>
+      <w:r>
+        <w:rPr>
+          <w:sz w:val="22"/>
+        </w:rPr>
+        <w:t xml:space="preserve">infrastructure </w:t>
+      </w:r>
+      <w:r>
+        <w:rPr>
+          <w:strike/>
+          <w:color w:val="CC0000"/>
+          <w:sz w:val="22"/>
+        </w:rPr>
+        <w:t xml:space="preserve">upgrades. Public Market revenues have leveled off, </w:t>
+      </w:r>
+      <w:r>
+        <w:rPr>
+          <w:sz w:val="22"/>
+        </w:rPr>
+        <w:t xml:space="preserve">while </w:t>
+      </w:r>
+      <w:r>
+        <w:rPr>
+          <w:strike/>
+          <w:color w:val="CC0000"/>
+          <w:sz w:val="22"/>
+        </w:rPr>
+        <w:t xml:space="preserve">aging buildings (including the former Emily Carr campus </w:t>
+      </w:r>
+      <w:r>
+        <w:rPr>
+          <w:color w:val="0044CC"/>
+          <w:sz w:val="22"/>
+          <w:u w:val="single"/>
+        </w:rPr>
+        <w:t xml:space="preserve">preserving Granville Island's public </w:t>
+      </w:r>
+      <w:r>
+        <w:rPr>
+          <w:sz w:val="22"/>
+        </w:rPr>
+        <w:t xml:space="preserve">and </w:t>
+      </w:r>
+      <w:r>
+        <w:rPr>
+          <w:strike/>
+          <w:color w:val="CC0000"/>
+          <w:sz w:val="22"/>
+        </w:rPr>
+        <w:t xml:space="preserve">Cats Social House) need major repairs. </w:t>
+      </w:r>
+      <w:r>
+        <w:rPr>
+          <w:color w:val="0044CC"/>
+          <w:sz w:val="22"/>
+          <w:u w:val="single"/>
+        </w:rPr>
+        <w:t xml:space="preserve">cultural role. </w:t>
+      </w:r>
+    </w:p>
+    <w:p>
+      <w:r>
+        <w:rPr>
+          <w:strike/>
+          <w:color w:val="CC0000"/>
+          <w:sz w:val="22"/>
+        </w:rPr>
         <w:t>Possible paths include: more development, a government subsidy model, a new Granville Island Foundation, or a cultural land trust proposal led by 221A Arts. Some have proposed transferring ownership from CMHC to Canada Lands Company, though CMHC states there are "no current plans for housing development."</w:t>
       </w:r>
     </w:p>
@@ -3161,47 +3638,346 @@
     </w:p>
     <w:p>
       <w:r>
-        <w:t>Granville Island demonstrates key principles for housing policy:</w:t>
-      </w:r>
-    </w:p>
-    <w:p>
-      <w:r>
-        <w:t>• Public ownership prevents speculation — land value increases don't inflate costs</w:t>
-      </w:r>
-    </w:p>
-    <w:p>
-      <w:r>
-        <w:t>• Cross-subsidy works — market tenants support affordable space</w:t>
-      </w:r>
-    </w:p>
-    <w:p>
-      <w:r>
-        <w:t>• Self-sufficiency is possible — no ongoing government funding required</w:t>
-      </w:r>
-    </w:p>
-    <w:p>
-      <w:r>
-        <w:t>• Flexibility enables innovation — outside municipal rules, creative solutions emerge</w:t>
-      </w:r>
-    </w:p>
-    <w:p>
-      <w:r>
-        <w:t>• 40 acres of federal land, self-sustaining on lease revenue</w:t>
-      </w:r>
-    </w:p>
-    <w:p>
-      <w:r>
-        <w:t>• 300+ tenants with cross-subsidy model</w:t>
-      </w:r>
-    </w:p>
-    <w:p>
-      <w:r>
-        <w:t>• Operates outside municipal zoning as federal property</w:t>
-      </w:r>
-    </w:p>
-    <w:p>
-      <w:r>
-        <w:t>• $300M in infrastructure needs — future governance in discussion</w:t>
+        <w:rPr>
+          <w:sz w:val="22"/>
+        </w:rPr>
+        <w:t xml:space="preserve">Granville Island demonstrates key principles </w:t>
+      </w:r>
+      <w:r>
+        <w:rPr>
+          <w:strike/>
+          <w:color w:val="CC0000"/>
+          <w:sz w:val="22"/>
+        </w:rPr>
+        <w:t xml:space="preserve">for </w:t>
+      </w:r>
+      <w:r>
+        <w:rPr>
+          <w:color w:val="0044CC"/>
+          <w:sz w:val="22"/>
+          <w:u w:val="single"/>
+        </w:rPr>
+        <w:t xml:space="preserve">relevant to </w:t>
+      </w:r>
+      <w:r>
+        <w:rPr>
+          <w:sz w:val="22"/>
+        </w:rPr>
+        <w:t xml:space="preserve">housing policy: </w:t>
+      </w:r>
+    </w:p>
+    <w:p>
+      <w:r>
+        <w:rPr>
+          <w:sz w:val="22"/>
+        </w:rPr>
+        <w:t xml:space="preserve">• Public ownership </w:t>
+      </w:r>
+      <w:r>
+        <w:rPr>
+          <w:strike/>
+          <w:color w:val="CC0000"/>
+          <w:sz w:val="22"/>
+        </w:rPr>
+        <w:t xml:space="preserve">prevents </w:t>
+      </w:r>
+      <w:r>
+        <w:rPr>
+          <w:color w:val="0044CC"/>
+          <w:sz w:val="22"/>
+          <w:u w:val="single"/>
+        </w:rPr>
+        <w:t xml:space="preserve">can prevent land </w:t>
+      </w:r>
+      <w:r>
+        <w:rPr>
+          <w:sz w:val="22"/>
+        </w:rPr>
+        <w:t xml:space="preserve">speculation </w:t>
+      </w:r>
+      <w:r>
+        <w:rPr>
+          <w:strike/>
+          <w:color w:val="CC0000"/>
+          <w:sz w:val="22"/>
+        </w:rPr>
+        <w:t xml:space="preserve">— land value increases don't inflate costs </w:t>
+      </w:r>
+    </w:p>
+    <w:p>
+      <w:r>
+        <w:rPr>
+          <w:sz w:val="22"/>
+        </w:rPr>
+        <w:t xml:space="preserve">• Cross-subsidy </w:t>
+      </w:r>
+      <w:r>
+        <w:rPr>
+          <w:strike/>
+          <w:color w:val="CC0000"/>
+          <w:sz w:val="22"/>
+        </w:rPr>
+        <w:t xml:space="preserve">works — market tenants </w:t>
+      </w:r>
+      <w:r>
+        <w:rPr>
+          <w:color w:val="0044CC"/>
+          <w:sz w:val="22"/>
+          <w:u w:val="single"/>
+        </w:rPr>
+        <w:t xml:space="preserve">can </w:t>
+      </w:r>
+      <w:r>
+        <w:rPr>
+          <w:sz w:val="22"/>
+        </w:rPr>
+        <w:t xml:space="preserve">support </w:t>
+      </w:r>
+      <w:r>
+        <w:rPr>
+          <w:strike/>
+          <w:color w:val="CC0000"/>
+          <w:sz w:val="22"/>
+        </w:rPr>
+        <w:t xml:space="preserve">affordable space </w:t>
+      </w:r>
+      <w:r>
+        <w:rPr>
+          <w:color w:val="0044CC"/>
+          <w:sz w:val="22"/>
+          <w:u w:val="single"/>
+        </w:rPr>
+        <w:t xml:space="preserve">below-market uses </w:t>
+      </w:r>
+    </w:p>
+    <w:p>
+      <w:r>
+        <w:rPr>
+          <w:sz w:val="22"/>
+        </w:rPr>
+        <w:t xml:space="preserve">• </w:t>
+      </w:r>
+      <w:r>
+        <w:rPr>
+          <w:strike/>
+          <w:color w:val="CC0000"/>
+          <w:sz w:val="22"/>
+        </w:rPr>
+        <w:t xml:space="preserve">Self-sufficiency is possible — no ongoing government funding required </w:t>
+      </w:r>
+      <w:r>
+        <w:rPr>
+          <w:color w:val="0044CC"/>
+          <w:sz w:val="22"/>
+          <w:u w:val="single"/>
+        </w:rPr>
+        <w:t xml:space="preserve">Long-term stewardship requires dedicated asset renewal planning </w:t>
+      </w:r>
+    </w:p>
+    <w:p>
+      <w:r>
+        <w:rPr>
+          <w:sz w:val="22"/>
+        </w:rPr>
+        <w:t xml:space="preserve">• </w:t>
+      </w:r>
+      <w:r>
+        <w:rPr>
+          <w:strike/>
+          <w:color w:val="CC0000"/>
+          <w:sz w:val="22"/>
+        </w:rPr>
+        <w:t xml:space="preserve">Flexibility enables </w:t>
+      </w:r>
+      <w:r>
+        <w:rPr>
+          <w:color w:val="0044CC"/>
+          <w:sz w:val="22"/>
+          <w:u w:val="single"/>
+        </w:rPr>
+        <w:t xml:space="preserve">Policy flexibility can enable local </w:t>
+      </w:r>
+      <w:r>
+        <w:rPr>
+          <w:sz w:val="22"/>
+        </w:rPr>
+        <w:t xml:space="preserve">innovation </w:t>
+      </w:r>
+      <w:r>
+        <w:rPr>
+          <w:strike/>
+          <w:color w:val="CC0000"/>
+          <w:sz w:val="22"/>
+        </w:rPr>
+        <w:t xml:space="preserve">— outside municipal rules, creative solutions emerge </w:t>
+      </w:r>
+    </w:p>
+    <w:p>
+      <w:r>
+        <w:rPr>
+          <w:sz w:val="22"/>
+        </w:rPr>
+        <w:t xml:space="preserve">• </w:t>
+      </w:r>
+      <w:r>
+        <w:rPr>
+          <w:strike/>
+          <w:color w:val="CC0000"/>
+          <w:sz w:val="22"/>
+        </w:rPr>
+        <w:t xml:space="preserve">40 acres </w:t>
+      </w:r>
+      <w:r>
+        <w:rPr>
+          <w:color w:val="0044CC"/>
+          <w:sz w:val="22"/>
+          <w:u w:val="single"/>
+        </w:rPr>
+        <w:t xml:space="preserve">2023 Council notice: 15.2 hectares </w:t>
+      </w:r>
+      <w:r>
+        <w:rPr>
+          <w:sz w:val="22"/>
+        </w:rPr>
+        <w:t xml:space="preserve">of </w:t>
+      </w:r>
+      <w:r>
+        <w:rPr>
+          <w:strike/>
+          <w:color w:val="CC0000"/>
+          <w:sz w:val="22"/>
+        </w:rPr>
+        <w:t xml:space="preserve">federal land, self-sustaining on lease revenue </w:t>
+      </w:r>
+      <w:r>
+        <w:rPr>
+          <w:color w:val="0044CC"/>
+          <w:sz w:val="22"/>
+          <w:u w:val="single"/>
+        </w:rPr>
+        <w:t xml:space="preserve">land plus 2.1 hectares of tidal water </w:t>
+      </w:r>
+    </w:p>
+    <w:p>
+      <w:r>
+        <w:rPr>
+          <w:sz w:val="22"/>
+        </w:rPr>
+        <w:t xml:space="preserve">• </w:t>
+      </w:r>
+      <w:r>
+        <w:rPr>
+          <w:color w:val="0044CC"/>
+          <w:sz w:val="22"/>
+          <w:u w:val="single"/>
+        </w:rPr>
+        <w:t xml:space="preserve">Public Market: 50+ independent food purveyors; island-wide: </w:t>
+      </w:r>
+      <w:r>
+        <w:rPr>
+          <w:sz w:val="22"/>
+        </w:rPr>
+        <w:t xml:space="preserve">300+ </w:t>
+      </w:r>
+      <w:r>
+        <w:rPr>
+          <w:strike/>
+          <w:color w:val="CC0000"/>
+          <w:sz w:val="22"/>
+        </w:rPr>
+        <w:t xml:space="preserve">tenants with cross-subsidy model </w:t>
+      </w:r>
+      <w:r>
+        <w:rPr>
+          <w:color w:val="0044CC"/>
+          <w:sz w:val="22"/>
+          <w:u w:val="single"/>
+        </w:rPr>
+        <w:t xml:space="preserve">businesses and 3,000+ jobs </w:t>
+      </w:r>
+    </w:p>
+    <w:p>
+      <w:r>
+        <w:rPr>
+          <w:sz w:val="22"/>
+        </w:rPr>
+        <w:t xml:space="preserve">• </w:t>
+      </w:r>
+      <w:r>
+        <w:rPr>
+          <w:strike/>
+          <w:color w:val="CC0000"/>
+          <w:sz w:val="22"/>
+        </w:rPr>
+        <w:t xml:space="preserve">Operates outside municipal zoning </w:t>
+      </w:r>
+      <w:r>
+        <w:rPr>
+          <w:color w:val="0044CC"/>
+          <w:sz w:val="22"/>
+          <w:u w:val="single"/>
+        </w:rPr>
+        <w:t xml:space="preserve">CMHC administration transferred by 1973 Order in Council; operations described </w:t>
+      </w:r>
+      <w:r>
+        <w:rPr>
+          <w:sz w:val="22"/>
+        </w:rPr>
+        <w:t xml:space="preserve">as </w:t>
+      </w:r>
+      <w:r>
+        <w:rPr>
+          <w:strike/>
+          <w:color w:val="CC0000"/>
+          <w:sz w:val="22"/>
+        </w:rPr>
+        <w:t xml:space="preserve">federal property </w:t>
+      </w:r>
+      <w:r>
+        <w:rPr>
+          <w:color w:val="0044CC"/>
+          <w:sz w:val="22"/>
+          <w:u w:val="single"/>
+        </w:rPr>
+        <w:t xml:space="preserve">self-sustaining </w:t>
+      </w:r>
+    </w:p>
+    <w:p>
+      <w:r>
+        <w:rPr>
+          <w:sz w:val="22"/>
+        </w:rPr>
+        <w:t xml:space="preserve">• </w:t>
+      </w:r>
+      <w:r>
+        <w:rPr>
+          <w:color w:val="0044CC"/>
+          <w:sz w:val="22"/>
+          <w:u w:val="single"/>
+        </w:rPr>
+        <w:t xml:space="preserve">2023 Council notice: over </w:t>
+      </w:r>
+      <w:r>
+        <w:rPr>
+          <w:sz w:val="22"/>
+        </w:rPr>
+        <w:t xml:space="preserve">$300M </w:t>
+      </w:r>
+      <w:r>
+        <w:rPr>
+          <w:strike/>
+          <w:color w:val="CC0000"/>
+          <w:sz w:val="22"/>
+        </w:rPr>
+        <w:t xml:space="preserve">in infrastructure needs — future governance in discussion </w:t>
+      </w:r>
+      <w:r>
+        <w:rPr>
+          <w:color w:val="0044CC"/>
+          <w:sz w:val="22"/>
+          <w:u w:val="single"/>
+        </w:rPr>
+        <w:t xml:space="preserve">economic activity, $105M annual sales, and about $2M tax receipts </w:t>
       </w:r>
     </w:p>
     <w:p>
@@ -3247,6 +4023,36 @@
     </w:p>
     <w:p>
       <w:r>
+        <w:rPr>
+          <w:color w:val="0044CC"/>
+          <w:sz w:val="22"/>
+          <w:u w:val="single"/>
+        </w:rPr>
+        <w:t>• Granville Island Administration — Overview - Current overview including food purveyor, business, and employment figures | https://admin.granvilleisland.com/about-granville-island/mission-vision/</w:t>
+      </w:r>
+    </w:p>
+    <w:p>
+      <w:r>
+        <w:rPr>
+          <w:color w:val="0044CC"/>
+          <w:sz w:val="22"/>
+          <w:u w:val="single"/>
+        </w:rPr>
+        <w:t>• Granville Island Council Notice of Opportunity (2023 PDF) - Land/tidal area, governance, and economic profile figures | https://admin.granvilleisland.com/wp-content/uploads/2023/11/2023-Council-Notice-of-Opportunity.pdf</w:t>
+      </w:r>
+    </w:p>
+    <w:p>
+      <w:r>
+        <w:rPr>
+          <w:color w:val="0044CC"/>
+          <w:sz w:val="22"/>
+          <w:u w:val="single"/>
+        </w:rPr>
+        <w:t>• Granville Island Council Strategic Priorities (2026-2028) - Current priorities including financial sustainability and asset management | https://admin.granvilleisland.com/strategic-priorities/</w:t>
+      </w:r>
+    </w:p>
+    <w:p>
+      <w:r>
         <w:t>• Granville Island Official Website - Visitor information and tenant directory | https://granvilleisland.com/</w:t>
       </w:r>
     </w:p>
@@ -3257,6 +4063,11 @@
     </w:p>
     <w:p>
       <w:r>
+        <w:rPr>
+          <w:strike/>
+          <w:color w:val="CC0000"/>
+          <w:sz w:val="22"/>
+        </w:rPr>
         <w:t>• CBC — Is Housing the Solution for Granville Island? - 2024 coverage of infrastructure needs and housing debate | https://www.cbc.ca/news/canada/british-columbia/granville-island-future-harcourt-housing-debate-1.7558992</w:t>
       </w:r>
     </w:p>

</xml_diff>

<commit_message>
Fix tour content and verification
</commit_message>
<xml_diff>
--- a/BSH_2026_Tour_Content_Tracked_Changes.docx
+++ b/BSH_2026_Tour_Content_Tracked_Changes.docx
@@ -4243,7 +4243,7 @@
           <w:sz w:val="22"/>
           <w:u w:val="single"/>
         </w:rPr>
-        <w:t>FIRST UNITED has operated in Vancouver's Downtown Eastside since 1886. The organization works from a harm reduction perspective across three pillars: Essential Services, Community Connection, and Systems Change.</w:t>
+        <w:t>FIRST UNITED has operated in Vancouver's Downtown Eastside since 1885. The organization works from a harm reduction perspective across three pillars: Essential Services, Community Connection, and Systems Change.</w:t>
       </w:r>
     </w:p>
     <w:p>
@@ -4363,77 +4363,27 @@
           <w:sz w:val="22"/>
           <w:u w:val="single"/>
         </w:rPr>
-        <w:t>The First Forward project will transform the 320 East Hastings site into a universally accessible, purpose-built facility: four floors of community amenities topped by seven floors of below-market rental housing (103 units — 35 supportive and 68 rental prioritized for Indigenous peoples) operated by Lu'ma Native Housing Society. 25% of units will be fully accessible, with the remainder built to adaptable standards.</w:t>
-      </w:r>
-    </w:p>
-    <w:p>
-      <w:r>
-        <w:rPr>
-          <w:color w:val="0044CC"/>
-          <w:sz w:val="22"/>
-          <w:u w:val="single"/>
-        </w:rPr>
-        <w:t>The ~$80 million project will nearly triple First United's program space to ~40,000 sq ft, incorporating:</w:t>
-      </w:r>
-    </w:p>
-    <w:p>
-      <w:r>
-        <w:rPr>
-          <w:color w:val="0044CC"/>
-          <w:sz w:val="22"/>
-          <w:u w:val="single"/>
-        </w:rPr>
-        <w:t>• Expanded food security and meal service infrastructure</w:t>
-      </w:r>
-    </w:p>
-    <w:p>
-      <w:r>
-        <w:rPr>
-          <w:color w:val="0044CC"/>
-          <w:sz w:val="22"/>
-          <w:u w:val="single"/>
-        </w:rPr>
-        <w:t>• Dedicated legal advocacy and tenant support offices</w:t>
-      </w:r>
-    </w:p>
-    <w:p>
-      <w:r>
-        <w:rPr>
-          <w:color w:val="0044CC"/>
-          <w:sz w:val="22"/>
-          <w:u w:val="single"/>
-        </w:rPr>
-        <w:t>• Culturally grounded healing and spiritual care spaces</w:t>
-      </w:r>
-    </w:p>
-    <w:p>
-      <w:r>
-        <w:rPr>
-          <w:color w:val="0044CC"/>
-          <w:sz w:val="22"/>
-          <w:u w:val="single"/>
-        </w:rPr>
-        <w:t>• Community gathering, drop-in areas, and an outdoor deck</w:t>
-      </w:r>
-    </w:p>
-    <w:p>
-      <w:r>
-        <w:rPr>
-          <w:color w:val="0044CC"/>
-          <w:sz w:val="22"/>
-          <w:u w:val="single"/>
-        </w:rPr>
-        <w:t>• Warming, cooling, and wildfire smoke refuge for unsheltered community members</w:t>
-      </w:r>
-    </w:p>
-    <w:p>
-      <w:r>
-        <w:rPr>
-          <w:color w:val="0044CC"/>
-          <w:sz w:val="22"/>
-          <w:u w:val="single"/>
-        </w:rPr>
-        <w:t>The design was shaped by extensive community consultation: nearly 100 DTES residents with lived experience participated in one-on-one conversations and focus groups, alongside service providers and government partners. The interior is designed by Nisga'a architect Luugigyoo Patrick Stewart, with cultural consultant Xalek/Sekyu Siyam Chief Ian Campbell guiding the regulatory and design process. The exterior integrates works by Musqueam, Squamish, and Tsleil-Waututh artists.</w:t>
+        <w:t>The First Forward project is an 11-storey redevelopment at 320 East Hastings: four floors of community amenities operated by FIRST UNITED, with seven floors of below-market housing for Indigenous peoples operated by Lu'ma Native Housing Society.</w:t>
+      </w:r>
+    </w:p>
+    <w:p>
+      <w:r>
+        <w:rPr>
+          <w:color w:val="0044CC"/>
+          <w:sz w:val="22"/>
+          <w:u w:val="single"/>
+        </w:rPr>
+        <w:t>FIRST UNITED's redevelopment materials describe over 100 homes in the housing component and close to 40,000 square feet of purpose-built community program space in the podium levels. In project FAQs, FIRST UNITED also cites 103 affordable housing units and an overall project cost of approximately $91 million.</w:t>
+      </w:r>
+    </w:p>
+    <w:p>
+      <w:r>
+        <w:rPr>
+          <w:color w:val="0044CC"/>
+          <w:sz w:val="22"/>
+          <w:u w:val="single"/>
+        </w:rPr>
+        <w:t>Design planning has included consultation with DTES residents, service providers, and Indigenous advisors to align the building with community priorities and reconciliation commitments.</w:t>
       </w:r>
     </w:p>
     <w:p>
@@ -4463,7 +4413,7 @@
           <w:sz w:val="22"/>
           <w:u w:val="single"/>
         </w:rPr>
-        <w:t>Key findings from the broader BSH research show that no-fault evictions account for 65% of evictions nationally and 85% in British Columbia, highlighting the severe displacement pressures renters face. The project also includes research on Indigenous tenant rights and model legislation for Indigenous housing justice.</w:t>
+        <w:t>Key findings from BSH's no-fault eviction analysis indicate 65% of evictions nationally and 85% in British Columbia were no-fault, highlighting severe displacement pressures renters face.</w:t>
       </w:r>
     </w:p>
     <w:p>
@@ -4523,7 +4473,7 @@
           <w:sz w:val="22"/>
           <w:u w:val="single"/>
         </w:rPr>
-        <w:t>• Operating in the DTES since 1886</w:t>
+        <w:t>• Operating in the DTES since 1885</w:t>
       </w:r>
     </w:p>
     <w:p>
@@ -4643,17 +4593,17 @@
           <w:sz w:val="22"/>
           <w:u w:val="single"/>
         </w:rPr>
-        <w:t>• The Tyee — First United Launches $30M Campaign - Coverage of the First Forward capital campaign and DTES redevelopment vision | https://thetyee.ca/Presents/2021/11/17/First-United-30-Million-Campaign-Downtown-Eastside-Site/</w:t>
-      </w:r>
-    </w:p>
-    <w:p>
-      <w:r>
-        <w:rPr>
-          <w:color w:val="0044CC"/>
-          <w:sz w:val="22"/>
-          <w:u w:val="single"/>
-        </w:rPr>
-        <w:t>• Vancouver Is Awesome — Community-Informed DTES Space - How First United's inclusive design process centred DTES residents' voices | https://www.vancouverisawesome.com/sponsored/first-united-church-is-creating-a-community-informed-space-for-the-downtown-eastside-vancouver-6152186</w:t>
+        <w:t>• First Forward Redevelopment (Official) - Official project page with building program, housing, and redevelopment FAQ data | https://admin.firstunited.ca/first-forward-redevelopment/</w:t>
+      </w:r>
+    </w:p>
+    <w:p>
+      <w:r>
+        <w:rPr>
+          <w:color w:val="0044CC"/>
+          <w:sz w:val="22"/>
+          <w:u w:val="single"/>
+        </w:rPr>
+        <w:t>• BSH — Estimating No-Fault Evictions in Canada and BC - BSH analysis reporting 65% national and 85% BC no-fault eviction shares | https://bsh.ubc.ca/research/estimating-no-fault-evictions/</w:t>
       </w:r>
     </w:p>
     <w:p>
@@ -4681,7 +4631,7 @@
           <w:sz w:val="22"/>
           <w:u w:val="single"/>
         </w:rPr>
-        <w:t>Quick stats: Address: 384 Main St | Office Hours: 8am-4pm | Food Truck: 9am-5pm</w:t>
+        <w:t>Quick stats: Address: 384 Main St | Office Hours: 8am-12pm, 1pm-4pm | Food Truck: 9am-5pm</w:t>
       </w:r>
     </w:p>
     <w:p>
@@ -4960,26 +4910,6 @@
           <w:sz w:val="22"/>
           <w:u w:val="single"/>
         </w:rPr>
-        <w:t>• East Hastings and Gore streetscape — nearby DTES context</w:t>
-      </w:r>
-    </w:p>
-    <w:p>
-      <w:r>
-        <w:rPr>
-          <w:color w:val="0044CC"/>
-          <w:sz w:val="22"/>
-          <w:u w:val="single"/>
-        </w:rPr>
-        <w:t>• Union Street streetscape — community-serving area context</w:t>
-      </w:r>
-    </w:p>
-    <w:p>
-      <w:r>
-        <w:rPr>
-          <w:color w:val="0044CC"/>
-          <w:sz w:val="22"/>
-          <w:u w:val="single"/>
-        </w:rPr>
         <w:t>Resources</w:t>
       </w:r>
     </w:p>
@@ -4990,17 +4920,17 @@
           <w:sz w:val="22"/>
           <w:u w:val="single"/>
         </w:rPr>
-        <w:t>• Aboriginal Front Door - BC 211 - Services overview and access information | https://bc.211.ca/agencies/aboriginal-front-door-society/</w:t>
-      </w:r>
-    </w:p>
-    <w:p>
-      <w:r>
-        <w:rPr>
-          <w:color w:val="0044CC"/>
-          <w:sz w:val="22"/>
-          <w:u w:val="single"/>
-        </w:rPr>
-        <w:t>• LinkVan - Aboriginal Front Door - Drop-in hours and current program schedule | https://linkvan.ca/resources/aboriginal-front-door-society</w:t>
+        <w:t>• Aboriginal Front Door - BC 211 - Services overview and access information | https://bc.211.ca/agency-details/aboriginal-front-door-society-9490654/</w:t>
+      </w:r>
+    </w:p>
+    <w:p>
+      <w:r>
+        <w:rPr>
+          <w:color w:val="0044CC"/>
+          <w:sz w:val="22"/>
+          <w:u w:val="single"/>
+        </w:rPr>
+        <w:t>• LinkVan - Aboriginal Front Door - Drop-in hours and current program schedule | https://linkvan.ca/resources/aboriginal-front-door-society/</w:t>
       </w:r>
     </w:p>
     <w:p>
@@ -5117,7 +5047,7 @@
           <w:sz w:val="22"/>
           <w:u w:val="single"/>
         </w:rPr>
-        <w:t>The UBC Learning Exchange has operated at 612 Main Street since 2000, serving as a bridge between UBC and the Downtown Eastside community. Programming is grounded in reciprocal learning: residents access free educational opportunities, while UBC students and faculty engage in community-informed teaching and research.</w:t>
+        <w:t>The UBC Learning Exchange has operated at 612 Main Street since 1999, serving as a bridge between UBC and the Downtown Eastside community. Programming is grounded in reciprocal learning: residents access free educational opportunities, while UBC students and faculty engage in community-informed teaching and research.</w:t>
       </w:r>
     </w:p>
     <w:p>
@@ -5327,7 +5257,7 @@
           <w:sz w:val="22"/>
           <w:u w:val="single"/>
         </w:rPr>
-        <w:t>• Reciprocal learning hub at 612 Main Street since 2000</w:t>
+        <w:t>• Reciprocal learning hub at 612 Main Street since 1999</w:t>
       </w:r>
     </w:p>
     <w:p>
@@ -5427,7 +5357,7 @@
           <w:sz w:val="22"/>
           <w:u w:val="single"/>
         </w:rPr>
-        <w:t>• HRC — Confronting Sweeps Report - 2025 report from the Housing Research Collaborative workshop held at the Learning Exchange | https://www.hrc.ubc.ca/wp-content/uploads/2025/07/Confronting-Sweeps-Report.pdf</w:t>
+        <w:t>• HRC — Confronting Sweeps Report - 2025 report from the Housing Research Collaborative workshop held at the Learning Exchange | https://www.hrc.ubc.ca/confronting-sweeps-report/</w:t>
       </w:r>
     </w:p>
     <w:p>
@@ -5799,25 +5729,19 @@
     <w:p>
       <w:r>
         <w:rPr>
-          <w:sz w:val="22"/>
-        </w:rPr>
-        <w:t xml:space="preserve">In </w:t>
-      </w:r>
-      <w:r>
-        <w:rPr>
-          <w:strike/>
-          <w:color w:val="CC0000"/>
-          <w:sz w:val="22"/>
-        </w:rPr>
-        <w:t xml:space="preserve">2023, </w:t>
-      </w:r>
-      <w:r>
-        <w:rPr>
-          <w:color w:val="0044CC"/>
-          <w:sz w:val="22"/>
-          <w:u w:val="single"/>
-        </w:rPr>
-        <w:t xml:space="preserve">February 2026, DTES CLT officially took possession of Powell Rooms — its first building acquisition. The CLT is also </w:t>
+          <w:strike/>
+          <w:color w:val="CC0000"/>
+          <w:sz w:val="22"/>
+        </w:rPr>
+        <w:t xml:space="preserve">In 2023, </w:t>
+      </w:r>
+      <w:r>
+        <w:rPr>
+          <w:color w:val="0044CC"/>
+          <w:sz w:val="22"/>
+          <w:u w:val="single"/>
+        </w:rPr>
+        <w:t xml:space="preserve">Recent reporting identifies Powell Rooms (23 units) as </w:t>
       </w:r>
       <w:r>
         <w:rPr>
@@ -5831,7 +5755,29 @@
           <w:color w:val="CC0000"/>
           <w:sz w:val="22"/>
         </w:rPr>
-        <w:t xml:space="preserve">Province provided an $11 million grant to the DTES SRO Collaborative Society to support tenant-led programming and safety initiatives. The Downtown Eastside Community Land Trust (DTES CLT) was incorporated </w:t>
+        <w:t xml:space="preserve">Province provided an $11 million grant to </w:t>
+      </w:r>
+      <w:r>
+        <w:rPr>
+          <w:color w:val="0044CC"/>
+          <w:sz w:val="22"/>
+          <w:u w:val="single"/>
+        </w:rPr>
+        <w:t xml:space="preserve">CLT's first acquisition track. The CLT is also </w:t>
+      </w:r>
+      <w:r>
+        <w:rPr>
+          <w:sz w:val="22"/>
+        </w:rPr>
+        <w:t xml:space="preserve">the </w:t>
+      </w:r>
+      <w:r>
+        <w:rPr>
+          <w:strike/>
+          <w:color w:val="CC0000"/>
+          <w:sz w:val="22"/>
+        </w:rPr>
+        <w:t xml:space="preserve">DTES SRO Collaborative Society to support tenant-led programming and safety initiatives. The Downtown Eastside Community Land Trust (DTES CLT) was incorporated </w:t>
       </w:r>
       <w:r>
         <w:rPr>
@@ -5931,7 +5877,7 @@
           <w:sz w:val="22"/>
           <w:u w:val="single"/>
         </w:rPr>
-        <w:t xml:space="preserve">Powell Rooms (23 units): DTES CLT's first acquisition, completed February 2026. Funded through a $1M Reaching Home federal grant, City SRO upgrade funding, and philanthropic donations. Total cost: ~$2.5M. Includes ground-floor childcare by Promise Vancouver. (First acquisition) </w:t>
+        <w:t xml:space="preserve">Powell Rooms (23 units): Powell Rooms is identified in reporting as DTES CLT's first acquisition track. The 23-unit SRO includes ground-floor childcare operated by Promise Vancouver. (First acquisition) </w:t>
       </w:r>
     </w:p>
     <w:p>
@@ -5955,7 +5901,7 @@
           <w:sz w:val="22"/>
           <w:u w:val="single"/>
         </w:rPr>
-        <w:t xml:space="preserve">Keefer Rooms (48 units): Purchased by BC Housing for $8.2M in October 2023 after a 2022 fire displaced 39 residents. DTES CLT operates </w:t>
+        <w:t xml:space="preserve">Keefer Rooms (48 units): Purchased by BC Housing in October 2023 after a 2022 fire. DTES CLT operates </w:t>
       </w:r>
       <w:r>
         <w:rPr>
@@ -5977,7 +5923,7 @@
           <w:sz w:val="22"/>
           <w:u w:val="single"/>
         </w:rPr>
-        <w:t xml:space="preserve">building in partnership with BC Housing; over time, the lease may transfer fully to DTES CLT. Renovations included window, electrical, </w:t>
+        <w:t xml:space="preserve">building in partnership with BC Housing, with renovation work including window, electrical, </w:t>
       </w:r>
       <w:r>
         <w:rPr>
@@ -6035,7 +5981,7 @@
           <w:sz w:val="22"/>
           <w:u w:val="single"/>
         </w:rPr>
-        <w:t xml:space="preserve">Powell Rooms — First CLT Acquisition </w:t>
+        <w:t xml:space="preserve">Powell Rooms — First CLT Acquisition Track </w:t>
       </w:r>
     </w:p>
     <w:p>
@@ -6053,7 +5999,7 @@
           <w:sz w:val="22"/>
           <w:u w:val="single"/>
         </w:rPr>
-        <w:t xml:space="preserve">In February 2026, DTES CLT completed its first building acquisition: Powell Rooms, a 23-unit </w:t>
+        <w:t xml:space="preserve">Powell Rooms is a 23-unit </w:t>
       </w:r>
       <w:r>
         <w:rPr>
@@ -6075,7 +6021,7 @@
           <w:sz w:val="22"/>
           <w:u w:val="single"/>
         </w:rPr>
-        <w:t xml:space="preserve">with ground-floor childcare operated </w:t>
+        <w:t xml:space="preserve">identified in reporting as DTES CLT's first acquisition track, including ground-floor childcare operated </w:t>
       </w:r>
       <w:r>
         <w:rPr>
@@ -6085,11 +6031,37 @@
       </w:r>
       <w:r>
         <w:rPr>
-          <w:color w:val="0044CC"/>
-          <w:sz w:val="22"/>
-          <w:u w:val="single"/>
-        </w:rPr>
-        <w:t xml:space="preserve">Promise Vancouver. The previous owner, Rob Harden, sold </w:t>
+          <w:strike/>
+          <w:color w:val="CC0000"/>
+          <w:sz w:val="22"/>
+        </w:rPr>
+        <w:t xml:space="preserve">the SRA by-law, with ~99 buildings and ~4,000 rooms in the DTES alone. Average rents are roughly $680/month overall, while private SROs average closer to $740/month. The provincial shelter rate is $500/month, creating a persistent affordability gap. </w:t>
+      </w:r>
+      <w:r>
+        <w:rPr>
+          <w:color w:val="0044CC"/>
+          <w:sz w:val="22"/>
+          <w:u w:val="single"/>
+        </w:rPr>
+        <w:t xml:space="preserve">Promise Vancouver. </w:t>
+      </w:r>
+    </w:p>
+    <w:p>
+      <w:r>
+        <w:rPr>
+          <w:strike/>
+          <w:color w:val="CC0000"/>
+          <w:sz w:val="22"/>
+        </w:rPr>
+        <w:t xml:space="preserve">As Wendy Pedersen, Executive Director of </w:t>
+      </w:r>
+      <w:r>
+        <w:rPr>
+          <w:color w:val="0044CC"/>
+          <w:sz w:val="22"/>
+          <w:u w:val="single"/>
+        </w:rPr>
+        <w:t xml:space="preserve">Public reporting in late 2025 described </w:t>
       </w:r>
       <w:r>
         <w:rPr>
@@ -6103,247 +6075,393 @@
           <w:color w:val="CC0000"/>
           <w:sz w:val="22"/>
         </w:rPr>
-        <w:t xml:space="preserve">SRA by-law, with ~99 buildings and ~4,000 rooms in the DTES alone. Average rents are roughly $680/month overall, while private SROs average closer to $740/month. The provincial shelter rate is $500/month, creating a persistent affordability gap. </w:t>
-      </w:r>
-      <w:r>
-        <w:rPr>
-          <w:color w:val="0044CC"/>
-          <w:sz w:val="22"/>
-          <w:u w:val="single"/>
-        </w:rPr>
-        <w:t xml:space="preserve">property after owning it since 2005. </w:t>
-      </w:r>
-    </w:p>
-    <w:p>
-      <w:r>
-        <w:rPr>
-          <w:strike/>
-          <w:color w:val="CC0000"/>
-          <w:sz w:val="22"/>
-        </w:rPr>
-        <w:t xml:space="preserve">As Wendy Pedersen, Executive Director </w:t>
-      </w:r>
-      <w:r>
-        <w:rPr>
-          <w:color w:val="0044CC"/>
-          <w:sz w:val="22"/>
-          <w:u w:val="single"/>
-        </w:rPr>
-        <w:t xml:space="preserve">The ~$2.5 million acquisition was funded through a $1 million Reaching Home federal grant, approximately $230,000 from a City </w:t>
-      </w:r>
-      <w:r>
-        <w:rPr>
-          <w:sz w:val="22"/>
-        </w:rPr>
-        <w:t xml:space="preserve">of </w:t>
-      </w:r>
-      <w:r>
-        <w:rPr>
-          <w:strike/>
-          <w:color w:val="CC0000"/>
+        <w:t xml:space="preserve">SRO Collaborative, explains: "Privately owned SRO hotels are a last resort before homelessness." The Collaborative's Tenant Overdose Response Organizers (TORO) project connects tenant organizers </w:t>
+      </w:r>
+      <w:r>
+        <w:rPr>
+          <w:color w:val="0044CC"/>
+          <w:sz w:val="22"/>
+          <w:u w:val="single"/>
+        </w:rPr>
+        <w:t xml:space="preserve">acquisition as being in its final stage, </w:t>
+      </w:r>
+      <w:r>
+        <w:rPr>
+          <w:sz w:val="22"/>
+        </w:rPr>
+        <w:t xml:space="preserve">with </w:t>
+      </w:r>
+      <w:r>
+        <w:rPr>
+          <w:strike/>
+          <w:color w:val="CC0000"/>
+          <w:sz w:val="22"/>
+        </w:rPr>
+        <w:t xml:space="preserve">naloxone supplies </w:t>
+      </w:r>
+      <w:r>
+        <w:rPr>
+          <w:color w:val="0044CC"/>
+          <w:sz w:val="22"/>
+          <w:u w:val="single"/>
+        </w:rPr>
+        <w:t xml:space="preserve">DTES CLT </w:t>
+      </w:r>
+      <w:r>
+        <w:rPr>
+          <w:sz w:val="22"/>
+        </w:rPr>
+        <w:t xml:space="preserve">and </w:t>
+      </w:r>
+      <w:r>
+        <w:rPr>
+          <w:strike/>
+          <w:color w:val="CC0000"/>
+          <w:sz w:val="22"/>
+        </w:rPr>
+        <w:t xml:space="preserve">education. </w:t>
+      </w:r>
+      <w:r>
+        <w:rPr>
+          <w:color w:val="0044CC"/>
+          <w:sz w:val="22"/>
+          <w:u w:val="single"/>
+        </w:rPr>
+        <w:t xml:space="preserve">partners moving the building toward long-term community ownership. </w:t>
+      </w:r>
+    </w:p>
+    <w:p>
+      <w:r>
+        <w:rPr>
+          <w:strike/>
+          <w:color w:val="CC0000"/>
+          <w:sz w:val="22"/>
+        </w:rPr>
+        <w:t xml:space="preserve">Community Partners </w:t>
+      </w:r>
+      <w:r>
+        <w:rPr>
+          <w:color w:val="0044CC"/>
+          <w:sz w:val="22"/>
+          <w:u w:val="single"/>
+        </w:rPr>
+        <w:t xml:space="preserve">Keefer Rooms — BC Housing Partnership </w:t>
+      </w:r>
+    </w:p>
+    <w:p>
+      <w:r>
+        <w:rPr>
+          <w:strike/>
+          <w:color w:val="CC0000"/>
+          <w:sz w:val="22"/>
+        </w:rPr>
+        <w:t xml:space="preserve">Multiple organizations work together </w:t>
+      </w:r>
+      <w:r>
+        <w:rPr>
+          <w:color w:val="0044CC"/>
+          <w:sz w:val="22"/>
+          <w:u w:val="single"/>
+        </w:rPr>
+        <w:t xml:space="preserve">In October 2023, BC Housing purchased Keefer Rooms (48 SRO units at 222 Keefer St.) </w:t>
+      </w:r>
+      <w:r>
+        <w:rPr>
+          <w:sz w:val="22"/>
+        </w:rPr>
+        <w:t xml:space="preserve">to preserve </w:t>
+      </w:r>
+      <w:r>
+        <w:rPr>
+          <w:strike/>
+          <w:color w:val="CC0000"/>
+          <w:sz w:val="22"/>
+        </w:rPr>
+        <w:t xml:space="preserve">and improve DTES housing: </w:t>
+      </w:r>
+      <w:r>
+        <w:rPr>
+          <w:color w:val="0044CC"/>
+          <w:sz w:val="22"/>
+          <w:u w:val="single"/>
+        </w:rPr>
+        <w:t xml:space="preserve">low-income housing after a 2022 fire left the building vacant. </w:t>
+      </w:r>
+    </w:p>
+    <w:p>
+      <w:r>
+        <w:rPr>
+          <w:strike/>
+          <w:color w:val="CC0000"/>
+          <w:sz w:val="22"/>
+        </w:rPr>
+        <w:t xml:space="preserve">• </w:t>
+      </w:r>
+      <w:r>
+        <w:rPr>
+          <w:color w:val="0044CC"/>
+          <w:sz w:val="22"/>
+          <w:u w:val="single"/>
+        </w:rPr>
+        <w:t xml:space="preserve">DTES CLT was named the operating partner, with the </w:t>
+      </w:r>
+      <w:r>
+        <w:rPr>
+          <w:sz w:val="22"/>
+        </w:rPr>
+        <w:t xml:space="preserve">DTES SRO </w:t>
+      </w:r>
+      <w:r>
+        <w:rPr>
+          <w:strike/>
+          <w:color w:val="CC0000"/>
+          <w:sz w:val="22"/>
+        </w:rPr>
+        <w:t xml:space="preserve">Collaborative: Advocates for tenants, received $11M provincial grant in 2023 </w:t>
+      </w:r>
+      <w:r>
+        <w:rPr>
+          <w:color w:val="0044CC"/>
+          <w:sz w:val="22"/>
+          <w:u w:val="single"/>
+        </w:rPr>
+        <w:t xml:space="preserve">Collaborative supporting tenant-led programming. Provincial information cites window, electrical, and fire-system upgrades as part of reopening work. </w:t>
+      </w:r>
+    </w:p>
+    <w:p>
+      <w:r>
+        <w:rPr>
+          <w:strike/>
+          <w:color w:val="CC0000"/>
+          <w:sz w:val="22"/>
+        </w:rPr>
+        <w:t xml:space="preserve">• Hogan's Alley Society: Restoring Vancouver's historic Black neighbourhood, with projects on Union Street and Main Street </w:t>
+      </w:r>
+      <w:r>
+        <w:rPr>
+          <w:color w:val="0044CC"/>
+          <w:sz w:val="22"/>
+          <w:u w:val="single"/>
+        </w:rPr>
+        <w:t xml:space="preserve">Governance Model </w:t>
+      </w:r>
+    </w:p>
+    <w:p>
+      <w:r>
+        <w:rPr>
+          <w:strike/>
+          <w:color w:val="CC0000"/>
+          <w:sz w:val="22"/>
+        </w:rPr>
+        <w:t xml:space="preserve">• Aboriginal Front Door: Indigenous-led support services </w:t>
+      </w:r>
+      <w:r>
+        <w:rPr>
+          <w:color w:val="0044CC"/>
+          <w:sz w:val="22"/>
+          <w:u w:val="single"/>
+        </w:rPr>
+        <w:t xml:space="preserve">The CLT uses a decolonized, non-hierarchical governance model co-led by Indigenous peoples and people with lived experience: </w:t>
+      </w:r>
+    </w:p>
+    <w:p>
+      <w:r>
+        <w:rPr>
+          <w:sz w:val="22"/>
+        </w:rPr>
+        <w:t xml:space="preserve">• </w:t>
+      </w:r>
+      <w:r>
+        <w:rPr>
+          <w:strike/>
+          <w:color w:val="CC0000"/>
+          <w:sz w:val="22"/>
+        </w:rPr>
+        <w:t xml:space="preserve">Carnegie Community Centre: Historic community hub since 1903 </w:t>
+      </w:r>
+      <w:r>
+        <w:rPr>
+          <w:color w:val="0044CC"/>
+          <w:sz w:val="22"/>
+          <w:u w:val="single"/>
+        </w:rPr>
+        <w:t xml:space="preserve">Community-elected board of directors with Indigenous co-leadership </w:t>
+      </w:r>
+    </w:p>
+    <w:p>
+      <w:r>
+        <w:rPr>
+          <w:sz w:val="22"/>
+        </w:rPr>
+        <w:t xml:space="preserve">• </w:t>
+      </w:r>
+      <w:r>
+        <w:rPr>
+          <w:strike/>
+          <w:color w:val="CC0000"/>
+          <w:sz w:val="22"/>
+        </w:rPr>
+        <w:t xml:space="preserve">DTES Neighbourhood House: Community programs </w:t>
+      </w:r>
+      <w:r>
+        <w:rPr>
+          <w:color w:val="0044CC"/>
+          <w:sz w:val="22"/>
+          <w:u w:val="single"/>
+        </w:rPr>
+        <w:t xml:space="preserve">Tenant </w:t>
+      </w:r>
+      <w:r>
+        <w:rPr>
+          <w:sz w:val="22"/>
+        </w:rPr>
+        <w:t xml:space="preserve">and </w:t>
+      </w:r>
+      <w:r>
+        <w:rPr>
+          <w:strike/>
+          <w:color w:val="CC0000"/>
+          <w:sz w:val="22"/>
+        </w:rPr>
+        <w:t xml:space="preserve">partnerships </w:t>
+      </w:r>
+      <w:r>
+        <w:rPr>
+          <w:color w:val="0044CC"/>
+          <w:sz w:val="22"/>
+          <w:u w:val="single"/>
+        </w:rPr>
+        <w:t xml:space="preserve">elder sub-committee meets monthly to guide decisions on acquisitions, furnishings, and building operations </w:t>
+      </w:r>
+    </w:p>
+    <w:p>
+      <w:r>
+        <w:rPr>
+          <w:sz w:val="22"/>
+        </w:rPr>
+        <w:t xml:space="preserve">• </w:t>
+      </w:r>
+      <w:r>
+        <w:rPr>
+          <w:strike/>
+          <w:color w:val="CC0000"/>
+          <w:sz w:val="22"/>
+        </w:rPr>
+        <w:t xml:space="preserve">UBC Learning Exchange: University-community partnership </w:t>
+      </w:r>
+      <w:r>
+        <w:rPr>
+          <w:color w:val="0044CC"/>
+          <w:sz w:val="22"/>
+          <w:u w:val="single"/>
+        </w:rPr>
+        <w:t xml:space="preserve">Profits are reinvested into buildings and community benefit — not extracted </w:t>
+      </w:r>
+    </w:p>
+    <w:p>
+      <w:r>
+        <w:rPr>
+          <w:strike/>
+          <w:color w:val="CC0000"/>
+          <w:sz w:val="22"/>
+        </w:rPr>
+        <w:t xml:space="preserve">Community Land Trust Model </w:t>
+      </w:r>
+      <w:r>
+        <w:rPr>
+          <w:color w:val="0044CC"/>
+          <w:sz w:val="22"/>
+          <w:u w:val="single"/>
+        </w:rPr>
+        <w:t xml:space="preserve">• Properties are permanently removed from the speculative market through the trust structure </w:t>
+      </w:r>
+    </w:p>
+    <w:p>
+      <w:r>
+        <w:rPr>
+          <w:sz w:val="22"/>
+        </w:rPr>
+        <w:t xml:space="preserve">The CLT </w:t>
+      </w:r>
+      <w:r>
+        <w:rPr>
+          <w:strike/>
+          <w:color w:val="CC0000"/>
+          <w:sz w:val="22"/>
+        </w:rPr>
+        <w:t xml:space="preserve">approach in the DTES: </w:t>
+      </w:r>
+      <w:r>
+        <w:rPr>
+          <w:color w:val="0044CC"/>
+          <w:sz w:val="22"/>
+          <w:u w:val="single"/>
+        </w:rPr>
+        <w:t xml:space="preserve">Model </w:t>
+      </w:r>
+    </w:p>
+    <w:p>
+      <w:r>
+        <w:rPr>
+          <w:strike/>
+          <w:color w:val="CC0000"/>
+          <w:sz w:val="22"/>
+        </w:rPr>
+        <w:t xml:space="preserve">• Removes buildings permanently from </w:t>
+      </w:r>
+      <w:r>
+        <w:rPr>
+          <w:color w:val="0044CC"/>
+          <w:sz w:val="22"/>
+          <w:u w:val="single"/>
+        </w:rPr>
+        <w:t xml:space="preserve">Community land trusts are non-profit corporations that acquire and hold land in perpetuity for community use. In </w:t>
+      </w:r>
+      <w:r>
+        <w:rPr>
           <w:sz w:val="22"/>
         </w:rPr>
         <w:t xml:space="preserve">the </w:t>
       </w:r>
       <w:r>
         <w:rPr>
-          <w:color w:val="0044CC"/>
-          <w:sz w:val="22"/>
-          <w:u w:val="single"/>
-        </w:rPr>
-        <w:t xml:space="preserve">Vancouver </w:t>
-      </w:r>
-      <w:r>
-        <w:rPr>
-          <w:sz w:val="22"/>
-        </w:rPr>
-        <w:t xml:space="preserve">SRO </w:t>
-      </w:r>
-      <w:r>
-        <w:rPr>
-          <w:strike/>
-          <w:color w:val="CC0000"/>
-          <w:sz w:val="22"/>
-        </w:rPr>
-        <w:t xml:space="preserve">Collaborative, explains: "Privately owned SRO hotels are a last resort </w:t>
-      </w:r>
-      <w:r>
-        <w:rPr>
-          <w:color w:val="0044CC"/>
-          <w:sz w:val="22"/>
-          <w:u w:val="single"/>
-        </w:rPr>
-        <w:t xml:space="preserve">upgrade program, and philanthropic donations. The CLT had secured approximately 85% of required funds </w:t>
-      </w:r>
-      <w:r>
-        <w:rPr>
-          <w:sz w:val="22"/>
-        </w:rPr>
-        <w:t xml:space="preserve">before </w:t>
-      </w:r>
-      <w:r>
-        <w:rPr>
-          <w:strike/>
-          <w:color w:val="CC0000"/>
-          <w:sz w:val="22"/>
-        </w:rPr>
-        <w:t xml:space="preserve">homelessness." The Collaborative's Tenant Overdose Response Organizers (TORO) project connects tenant organizers with naloxone supplies and education. </w:t>
-      </w:r>
-      <w:r>
-        <w:rPr>
-          <w:color w:val="0044CC"/>
-          <w:sz w:val="22"/>
-          <w:u w:val="single"/>
-        </w:rPr>
-        <w:t xml:space="preserve">closing. </w:t>
-      </w:r>
-    </w:p>
-    <w:p>
-      <w:r>
-        <w:rPr>
-          <w:strike/>
-          <w:color w:val="CC0000"/>
-          <w:sz w:val="22"/>
-        </w:rPr>
-        <w:t xml:space="preserve">Community Partners </w:t>
-      </w:r>
-      <w:r>
-        <w:rPr>
-          <w:color w:val="0044CC"/>
-          <w:sz w:val="22"/>
-          <w:u w:val="single"/>
-        </w:rPr>
-        <w:t xml:space="preserve">Keefer Rooms — BC Housing Partnership </w:t>
-      </w:r>
-    </w:p>
-    <w:p>
-      <w:r>
-        <w:rPr>
-          <w:strike/>
-          <w:color w:val="CC0000"/>
-          <w:sz w:val="22"/>
-        </w:rPr>
-        <w:t xml:space="preserve">Multiple organizations work together to preserve </w:t>
-      </w:r>
-      <w:r>
-        <w:rPr>
-          <w:color w:val="0044CC"/>
-          <w:sz w:val="22"/>
-          <w:u w:val="single"/>
-        </w:rPr>
-        <w:t xml:space="preserve">In October 2023, BC Housing purchased Keefer Rooms (48 SRO units at 222 Keefer St) for $8.2 million after a September 2022 fire displaced 39 residents. The building had been vacant for over a year. DTES CLT was named the operating partner, with the DTES SRO Collaborative overseeing tenant-led programming including harm reduction </w:t>
-      </w:r>
-      <w:r>
-        <w:rPr>
-          <w:sz w:val="22"/>
-        </w:rPr>
-        <w:t xml:space="preserve">and </w:t>
-      </w:r>
-      <w:r>
-        <w:rPr>
-          <w:strike/>
-          <w:color w:val="CC0000"/>
-          <w:sz w:val="22"/>
-        </w:rPr>
-        <w:t xml:space="preserve">improve DTES housing: </w:t>
-      </w:r>
-      <w:r>
-        <w:rPr>
-          <w:color w:val="0044CC"/>
-          <w:sz w:val="22"/>
-          <w:u w:val="single"/>
-        </w:rPr>
-        <w:t xml:space="preserve">fire safety. </w:t>
-      </w:r>
-    </w:p>
-    <w:p>
-      <w:r>
-        <w:rPr>
-          <w:strike/>
-          <w:color w:val="CC0000"/>
+          <w:strike/>
+          <w:color w:val="CC0000"/>
+          <w:sz w:val="22"/>
+        </w:rPr>
+        <w:t xml:space="preserve">speculative market </w:t>
+      </w:r>
+      <w:r>
+        <w:rPr>
+          <w:color w:val="0044CC"/>
+          <w:sz w:val="22"/>
+          <w:u w:val="single"/>
+        </w:rPr>
+        <w:t xml:space="preserve">DTES context, the CLT model: </w:t>
+      </w:r>
+    </w:p>
+    <w:p>
+      <w:r>
+        <w:rPr>
           <w:sz w:val="22"/>
         </w:rPr>
         <w:t xml:space="preserve">• </w:t>
       </w:r>
       <w:r>
         <w:rPr>
-          <w:color w:val="0044CC"/>
-          <w:sz w:val="22"/>
-          <w:u w:val="single"/>
-        </w:rPr>
-        <w:t xml:space="preserve">Renovations included window replacements and electrical and fire-system upgrades. The building was targeted for reopening in spring 2025. Over time, BC Housing may transfer the lease to </w:t>
-      </w:r>
-      <w:r>
-        <w:rPr>
-          <w:sz w:val="22"/>
-        </w:rPr>
-        <w:t xml:space="preserve">DTES </w:t>
-      </w:r>
-      <w:r>
-        <w:rPr>
-          <w:color w:val="0044CC"/>
-          <w:sz w:val="22"/>
-          <w:u w:val="single"/>
-        </w:rPr>
-        <w:t xml:space="preserve">CLT, but for now management operates as a partnership between BC Housing, the CLT, and the </w:t>
-      </w:r>
-      <w:r>
-        <w:rPr>
-          <w:sz w:val="22"/>
-        </w:rPr>
-        <w:t xml:space="preserve">SRO </w:t>
-      </w:r>
-      <w:r>
-        <w:rPr>
-          <w:strike/>
-          <w:color w:val="CC0000"/>
-          <w:sz w:val="22"/>
-        </w:rPr>
-        <w:t xml:space="preserve">Collaborative: Advocates for tenants, received $11M provincial grant in 2023 </w:t>
-      </w:r>
-      <w:r>
-        <w:rPr>
-          <w:color w:val="0044CC"/>
-          <w:sz w:val="22"/>
-          <w:u w:val="single"/>
-        </w:rPr>
-        <w:t xml:space="preserve">Collaborative. </w:t>
-      </w:r>
-    </w:p>
-    <w:p>
-      <w:r>
-        <w:rPr>
-          <w:strike/>
-          <w:color w:val="CC0000"/>
-          <w:sz w:val="22"/>
-        </w:rPr>
-        <w:t xml:space="preserve">• Hogan's Alley Society: Restoring Vancouver's historic Black neighbourhood, with projects on Union Street and Main Street </w:t>
-      </w:r>
-      <w:r>
-        <w:rPr>
-          <w:color w:val="0044CC"/>
-          <w:sz w:val="22"/>
-          <w:u w:val="single"/>
-        </w:rPr>
-        <w:t xml:space="preserve">Governance Model </w:t>
-      </w:r>
-    </w:p>
-    <w:p>
-      <w:r>
-        <w:rPr>
-          <w:strike/>
-          <w:color w:val="CC0000"/>
-          <w:sz w:val="22"/>
-        </w:rPr>
-        <w:t xml:space="preserve">• Aboriginal Front Door: Indigenous-led support services </w:t>
-      </w:r>
-      <w:r>
-        <w:rPr>
-          <w:color w:val="0044CC"/>
-          <w:sz w:val="22"/>
-          <w:u w:val="single"/>
-        </w:rPr>
-        <w:t xml:space="preserve">The CLT uses a decolonized, non-hierarchical governance model co-led by Indigenous peoples and people with lived experience: </w:t>
+          <w:strike/>
+          <w:color w:val="CC0000"/>
+          <w:sz w:val="22"/>
+        </w:rPr>
+        <w:t xml:space="preserve">Ensures long-term affordability through trust structure </w:t>
+      </w:r>
+      <w:r>
+        <w:rPr>
+          <w:color w:val="0044CC"/>
+          <w:sz w:val="22"/>
+          <w:u w:val="single"/>
+        </w:rPr>
+        <w:t xml:space="preserve">Acquires privately owned SROs before they are lost to speculation or neglect </w:t>
       </w:r>
     </w:p>
     <w:p>
@@ -6359,15 +6477,15 @@
           <w:color w:val="CC0000"/>
           <w:sz w:val="22"/>
         </w:rPr>
-        <w:t xml:space="preserve">Carnegie Community Centre: Historic community hub since 1903 </w:t>
-      </w:r>
-      <w:r>
-        <w:rPr>
-          <w:color w:val="0044CC"/>
-          <w:sz w:val="22"/>
-          <w:u w:val="single"/>
-        </w:rPr>
-        <w:t xml:space="preserve">Community-elected board of directors with Indigenous co-leadership </w:t>
+        <w:t xml:space="preserve">Keeps housing decisions in community hands </w:t>
+      </w:r>
+      <w:r>
+        <w:rPr>
+          <w:color w:val="0044CC"/>
+          <w:sz w:val="22"/>
+          <w:u w:val="single"/>
+        </w:rPr>
+        <w:t xml:space="preserve">Ensures rents remain permanently affordable — tied to income levels, not market rates </w:t>
       </w:r>
     </w:p>
     <w:p>
@@ -6383,206 +6501,6 @@
           <w:color w:val="CC0000"/>
           <w:sz w:val="22"/>
         </w:rPr>
-        <w:t xml:space="preserve">DTES Neighbourhood House: Community programs </w:t>
-      </w:r>
-      <w:r>
-        <w:rPr>
-          <w:color w:val="0044CC"/>
-          <w:sz w:val="22"/>
-          <w:u w:val="single"/>
-        </w:rPr>
-        <w:t xml:space="preserve">Tenant </w:t>
-      </w:r>
-      <w:r>
-        <w:rPr>
-          <w:sz w:val="22"/>
-        </w:rPr>
-        <w:t xml:space="preserve">and </w:t>
-      </w:r>
-      <w:r>
-        <w:rPr>
-          <w:strike/>
-          <w:color w:val="CC0000"/>
-          <w:sz w:val="22"/>
-        </w:rPr>
-        <w:t xml:space="preserve">partnerships </w:t>
-      </w:r>
-      <w:r>
-        <w:rPr>
-          <w:color w:val="0044CC"/>
-          <w:sz w:val="22"/>
-          <w:u w:val="single"/>
-        </w:rPr>
-        <w:t xml:space="preserve">elder sub-committee meets monthly to guide decisions on acquisitions, furnishings, and building operations </w:t>
-      </w:r>
-    </w:p>
-    <w:p>
-      <w:r>
-        <w:rPr>
-          <w:sz w:val="22"/>
-        </w:rPr>
-        <w:t xml:space="preserve">• </w:t>
-      </w:r>
-      <w:r>
-        <w:rPr>
-          <w:strike/>
-          <w:color w:val="CC0000"/>
-          <w:sz w:val="22"/>
-        </w:rPr>
-        <w:t xml:space="preserve">UBC Learning Exchange: University-community partnership </w:t>
-      </w:r>
-      <w:r>
-        <w:rPr>
-          <w:color w:val="0044CC"/>
-          <w:sz w:val="22"/>
-          <w:u w:val="single"/>
-        </w:rPr>
-        <w:t xml:space="preserve">Profits are reinvested into buildings and community benefit — not extracted </w:t>
-      </w:r>
-    </w:p>
-    <w:p>
-      <w:r>
-        <w:rPr>
-          <w:strike/>
-          <w:color w:val="CC0000"/>
-          <w:sz w:val="22"/>
-        </w:rPr>
-        <w:t xml:space="preserve">Community Land Trust Model </w:t>
-      </w:r>
-      <w:r>
-        <w:rPr>
-          <w:color w:val="0044CC"/>
-          <w:sz w:val="22"/>
-          <w:u w:val="single"/>
-        </w:rPr>
-        <w:t xml:space="preserve">• Properties are permanently removed from the speculative market through the trust structure </w:t>
-      </w:r>
-    </w:p>
-    <w:p>
-      <w:r>
-        <w:rPr>
-          <w:sz w:val="22"/>
-        </w:rPr>
-        <w:t xml:space="preserve">The CLT </w:t>
-      </w:r>
-      <w:r>
-        <w:rPr>
-          <w:strike/>
-          <w:color w:val="CC0000"/>
-          <w:sz w:val="22"/>
-        </w:rPr>
-        <w:t xml:space="preserve">approach in the DTES: </w:t>
-      </w:r>
-      <w:r>
-        <w:rPr>
-          <w:color w:val="0044CC"/>
-          <w:sz w:val="22"/>
-          <w:u w:val="single"/>
-        </w:rPr>
-        <w:t xml:space="preserve">Model </w:t>
-      </w:r>
-    </w:p>
-    <w:p>
-      <w:r>
-        <w:rPr>
-          <w:strike/>
-          <w:color w:val="CC0000"/>
-          <w:sz w:val="22"/>
-        </w:rPr>
-        <w:t xml:space="preserve">• Removes buildings permanently from </w:t>
-      </w:r>
-      <w:r>
-        <w:rPr>
-          <w:color w:val="0044CC"/>
-          <w:sz w:val="22"/>
-          <w:u w:val="single"/>
-        </w:rPr>
-        <w:t xml:space="preserve">Community land trusts are non-profit corporations that acquire and hold land in perpetuity for community use. In </w:t>
-      </w:r>
-      <w:r>
-        <w:rPr>
-          <w:sz w:val="22"/>
-        </w:rPr>
-        <w:t xml:space="preserve">the </w:t>
-      </w:r>
-      <w:r>
-        <w:rPr>
-          <w:strike/>
-          <w:color w:val="CC0000"/>
-          <w:sz w:val="22"/>
-        </w:rPr>
-        <w:t xml:space="preserve">speculative market </w:t>
-      </w:r>
-      <w:r>
-        <w:rPr>
-          <w:color w:val="0044CC"/>
-          <w:sz w:val="22"/>
-          <w:u w:val="single"/>
-        </w:rPr>
-        <w:t xml:space="preserve">DTES context, the CLT model: </w:t>
-      </w:r>
-    </w:p>
-    <w:p>
-      <w:r>
-        <w:rPr>
-          <w:sz w:val="22"/>
-        </w:rPr>
-        <w:t xml:space="preserve">• </w:t>
-      </w:r>
-      <w:r>
-        <w:rPr>
-          <w:strike/>
-          <w:color w:val="CC0000"/>
-          <w:sz w:val="22"/>
-        </w:rPr>
-        <w:t xml:space="preserve">Ensures long-term affordability through trust structure </w:t>
-      </w:r>
-      <w:r>
-        <w:rPr>
-          <w:color w:val="0044CC"/>
-          <w:sz w:val="22"/>
-          <w:u w:val="single"/>
-        </w:rPr>
-        <w:t xml:space="preserve">Acquires privately owned SROs before they are lost to speculation or neglect </w:t>
-      </w:r>
-    </w:p>
-    <w:p>
-      <w:r>
-        <w:rPr>
-          <w:sz w:val="22"/>
-        </w:rPr>
-        <w:t xml:space="preserve">• </w:t>
-      </w:r>
-      <w:r>
-        <w:rPr>
-          <w:strike/>
-          <w:color w:val="CC0000"/>
-          <w:sz w:val="22"/>
-        </w:rPr>
-        <w:t xml:space="preserve">Keeps housing decisions in community hands </w:t>
-      </w:r>
-      <w:r>
-        <w:rPr>
-          <w:color w:val="0044CC"/>
-          <w:sz w:val="22"/>
-          <w:u w:val="single"/>
-        </w:rPr>
-        <w:t xml:space="preserve">Ensures rents remain permanently affordable — tied to income levels, not market rates </w:t>
-      </w:r>
-    </w:p>
-    <w:p>
-      <w:r>
-        <w:rPr>
-          <w:sz w:val="22"/>
-        </w:rPr>
-        <w:t xml:space="preserve">• </w:t>
-      </w:r>
-      <w:r>
-        <w:rPr>
-          <w:strike/>
-          <w:color w:val="CC0000"/>
-          <w:sz w:val="22"/>
-        </w:rPr>
         <w:t xml:space="preserve">Prevents displacement of current residents during acquisition </w:t>
       </w:r>
       <w:r>
@@ -6619,37 +6537,37 @@
           <w:color w:val="CC0000"/>
           <w:sz w:val="22"/>
         </w:rPr>
-        <w:t xml:space="preserve">In 2024, Vancouver implemented vacancy control for SROs, preventing rent spikes between tenancies. DTES CLT's first acquisition, Powell Rooms (23 units), is expected to close in January 2026, while Keefer Rooms (48 </w:t>
-      </w:r>
-      <w:r>
-        <w:rPr>
-          <w:color w:val="0044CC"/>
-          <w:sz w:val="22"/>
-          <w:u w:val="single"/>
-        </w:rPr>
-        <w:t xml:space="preserve">• First acquisition (Powell Rooms, 23 </w:t>
-      </w:r>
-      <w:r>
-        <w:rPr>
-          <w:sz w:val="22"/>
-        </w:rPr>
-        <w:t xml:space="preserve">units) </w:t>
-      </w:r>
-      <w:r>
-        <w:rPr>
-          <w:strike/>
-          <w:color w:val="CC0000"/>
-          <w:sz w:val="22"/>
-        </w:rPr>
-        <w:t xml:space="preserve">is reopening in spring 2025 through a BC Housing partnership and community programming model. </w:t>
-      </w:r>
-      <w:r>
-        <w:rPr>
-          <w:color w:val="0044CC"/>
-          <w:sz w:val="22"/>
-          <w:u w:val="single"/>
-        </w:rPr>
-        <w:t xml:space="preserve">completed February 2026 </w:t>
+        <w:t xml:space="preserve">In 2024, Vancouver implemented vacancy control for SROs, preventing rent spikes between tenancies. </w:t>
+      </w:r>
+      <w:r>
+        <w:rPr>
+          <w:color w:val="0044CC"/>
+          <w:sz w:val="22"/>
+          <w:u w:val="single"/>
+        </w:rPr>
+        <w:t xml:space="preserve">• Powell Rooms (23 units) is identified as </w:t>
+      </w:r>
+      <w:r>
+        <w:rPr>
+          <w:sz w:val="22"/>
+        </w:rPr>
+        <w:t xml:space="preserve">DTES CLT's first </w:t>
+      </w:r>
+      <w:r>
+        <w:rPr>
+          <w:strike/>
+          <w:color w:val="CC0000"/>
+          <w:sz w:val="22"/>
+        </w:rPr>
+        <w:t xml:space="preserve">acquisition, Powell Rooms (23 units), is expected to close in January 2026, while Keefer Rooms (48 units) is reopening in spring 2025 through a BC Housing partnership and community programming model. </w:t>
+      </w:r>
+      <w:r>
+        <w:rPr>
+          <w:color w:val="0044CC"/>
+          <w:sz w:val="22"/>
+          <w:u w:val="single"/>
+        </w:rPr>
+        <w:t xml:space="preserve">acquisition track </w:t>
       </w:r>
     </w:p>
     <w:p>
@@ -7192,97 +7110,61 @@
           <w:sz w:val="22"/>
           <w:u w:val="single"/>
         </w:rPr>
-        <w:t xml:space="preserve">housing security in privately owned SRO hotels. More than 2,700 tenants across 40+ private SROs are supported through its tenant-based initiatives. </w:t>
-      </w:r>
-    </w:p>
-    <w:p>
-      <w:r>
-        <w:rPr>
-          <w:strike/>
-          <w:color w:val="CC0000"/>
-          <w:sz w:val="22"/>
-        </w:rPr>
-        <w:t xml:space="preserve">Its Safe Shelter program currently operates 51 low-barrier shelter beds at 467 Alexander Street. The Legal Advocacy program </w:t>
-      </w:r>
-      <w:r>
-        <w:rPr>
-          <w:color w:val="0044CC"/>
-          <w:sz w:val="22"/>
-          <w:u w:val="single"/>
-        </w:rPr>
-        <w:t xml:space="preserve">Core programs include: tenant committees that identify building-level issues and coordinate safety planning; TORO (Tenant Overdose Response Organizers) providing peer-led harm reduction and naloxone access; room cleaning and repairs training; cultural reconnection </w:t>
-      </w:r>
-      <w:r>
-        <w:rPr>
-          <w:sz w:val="22"/>
-        </w:rPr>
-        <w:t xml:space="preserve">supports </w:t>
-      </w:r>
-      <w:r>
-        <w:rPr>
-          <w:color w:val="0044CC"/>
-          <w:sz w:val="22"/>
-          <w:u w:val="single"/>
-        </w:rPr>
-        <w:t xml:space="preserve">for Indigenous </w:t>
-      </w:r>
-      <w:r>
-        <w:rPr>
-          <w:sz w:val="22"/>
-        </w:rPr>
-        <w:t xml:space="preserve">tenants </w:t>
-      </w:r>
-      <w:r>
-        <w:rPr>
-          <w:color w:val="0044CC"/>
-          <w:sz w:val="22"/>
-          <w:u w:val="single"/>
-        </w:rPr>
-        <w:t xml:space="preserve">(~33% of SRO residents); fire safety </w:t>
-      </w:r>
-      <w:r>
-        <w:rPr>
-          <w:sz w:val="22"/>
-        </w:rPr>
-        <w:t xml:space="preserve">and </w:t>
-      </w:r>
-      <w:r>
-        <w:rPr>
-          <w:strike/>
-          <w:color w:val="CC0000"/>
-          <w:sz w:val="22"/>
-        </w:rPr>
-        <w:t xml:space="preserve">income-security clients </w:t>
-      </w:r>
-      <w:r>
-        <w:rPr>
-          <w:color w:val="0044CC"/>
-          <w:sz w:val="22"/>
-          <w:u w:val="single"/>
-        </w:rPr>
-        <w:t xml:space="preserve">emergency preparedness; </w:t>
-      </w:r>
-      <w:r>
-        <w:rPr>
-          <w:sz w:val="22"/>
-        </w:rPr>
-        <w:t xml:space="preserve">and </w:t>
-      </w:r>
-      <w:r>
-        <w:rPr>
-          <w:strike/>
-          <w:color w:val="CC0000"/>
-          <w:sz w:val="22"/>
-        </w:rPr>
-        <w:t xml:space="preserve">reports more than 1,400 unique cases each year. </w:t>
-      </w:r>
-      <w:r>
-        <w:rPr>
-          <w:color w:val="0044CC"/>
-          <w:sz w:val="22"/>
-          <w:u w:val="single"/>
-        </w:rPr>
-        <w:t xml:space="preserve">the Right to Remain research collective supporting tenant organizing for improved conditions. </w:t>
+        <w:t xml:space="preserve">housing security in privately owned SRO hotels. </w:t>
+      </w:r>
+    </w:p>
+    <w:p>
+      <w:r>
+        <w:rPr>
+          <w:strike/>
+          <w:color w:val="CC0000"/>
+          <w:sz w:val="22"/>
+        </w:rPr>
+        <w:t xml:space="preserve">Its Safe Shelter </w:t>
+      </w:r>
+      <w:r>
+        <w:rPr>
+          <w:color w:val="0044CC"/>
+          <w:sz w:val="22"/>
+          <w:u w:val="single"/>
+        </w:rPr>
+        <w:t xml:space="preserve">Core programs include tenant committees, TORO (Tenant Overdose Response Organizers), room cleaning and repairs, cultural reconnection initiatives, fire safety and emergency preparedness, and the Right to Remain research collective. The TORO </w:t>
+      </w:r>
+      <w:r>
+        <w:rPr>
+          <w:sz w:val="22"/>
+        </w:rPr>
+        <w:t xml:space="preserve">program </w:t>
+      </w:r>
+      <w:r>
+        <w:rPr>
+          <w:strike/>
+          <w:color w:val="CC0000"/>
+          <w:sz w:val="22"/>
+        </w:rPr>
+        <w:t xml:space="preserve">currently </w:t>
+      </w:r>
+      <w:r>
+        <w:rPr>
+          <w:sz w:val="22"/>
+        </w:rPr>
+        <w:t xml:space="preserve">operates </w:t>
+      </w:r>
+      <w:r>
+        <w:rPr>
+          <w:strike/>
+          <w:color w:val="CC0000"/>
+          <w:sz w:val="22"/>
+        </w:rPr>
+        <w:t xml:space="preserve">51 low-barrier shelter beds at 467 Alexander Street. The Legal Advocacy program supports tenants and income-security clients and reports more than 1,400 unique cases each year. </w:t>
+      </w:r>
+      <w:r>
+        <w:rPr>
+          <w:color w:val="0044CC"/>
+          <w:sz w:val="22"/>
+          <w:u w:val="single"/>
+        </w:rPr>
+        <w:t xml:space="preserve">in 40 private SRO hotels. </w:t>
       </w:r>
     </w:p>
     <w:p>
@@ -7604,7 +7486,7 @@
           <w:sz w:val="22"/>
           <w:u w:val="single"/>
         </w:rPr>
-        <w:t xml:space="preserve">Tenant Committees (SRO Hub Program): The cornerstone program — democratic structures that identify building-level issues, coordinate repairs, and build community ownership in privately-owned SROs </w:t>
+        <w:t xml:space="preserve">Tenant Committees (SRO Hub Program): Democratic structures that identify building-level issues, coordinate repairs, and build community ownership in privately owned SROs </w:t>
       </w:r>
     </w:p>
     <w:p>
@@ -7628,7 +7510,7 @@
           <w:sz w:val="22"/>
           <w:u w:val="single"/>
         </w:rPr>
-        <w:t xml:space="preserve">TORO (Tenant Overdose Response Organizers): Peer-led harm reduction operating in ~40 private SRO hotels, providing naloxone training, safer supply referrals, </w:t>
+        <w:t xml:space="preserve">TORO (Tenant Overdose Response Organizers): Peer-led harm reduction operating in 40 private SRO hotels, providing naloxone training, safer supply referrals, </w:t>
       </w:r>
       <w:r>
         <w:rPr>
@@ -7786,71 +7668,47 @@
           <w:color w:val="CC0000"/>
           <w:sz w:val="22"/>
         </w:rPr>
-        <w:t xml:space="preserve">The project partnership with Lu'ma Native BCH Housing Society also sets out Indigenous-led and community-accountable governance outcomes </w:t>
-      </w:r>
-      <w:r>
-        <w:rPr>
-          <w:color w:val="0044CC"/>
-          <w:sz w:val="22"/>
-          <w:u w:val="single"/>
-        </w:rPr>
-        <w:t xml:space="preserve">• Cultural reconnection: Supports </w:t>
-      </w:r>
-      <w:r>
-        <w:rPr>
-          <w:sz w:val="22"/>
-        </w:rPr>
-        <w:t xml:space="preserve">for </w:t>
-      </w:r>
-      <w:r>
-        <w:rPr>
-          <w:strike/>
-          <w:color w:val="CC0000"/>
-          <w:sz w:val="22"/>
-        </w:rPr>
-        <w:t xml:space="preserve">long-term operations. </w:t>
-      </w:r>
-      <w:r>
-        <w:rPr>
-          <w:color w:val="0044CC"/>
-          <w:sz w:val="22"/>
-          <w:u w:val="single"/>
-        </w:rPr>
-        <w:t xml:space="preserve">the ~33% of SRO tenants who self-identify as Indigenous </w:t>
-      </w:r>
-    </w:p>
-    <w:p>
-      <w:r>
-        <w:rPr>
-          <w:sz w:val="22"/>
-        </w:rPr>
-        <w:t xml:space="preserve">• </w:t>
-      </w:r>
-      <w:r>
-        <w:rPr>
-          <w:strike/>
-          <w:color w:val="CC0000"/>
-          <w:sz w:val="22"/>
-        </w:rPr>
-        <w:t xml:space="preserve">Operating in the DTES since 1886 </w:t>
-      </w:r>
-      <w:r>
-        <w:rPr>
-          <w:color w:val="0044CC"/>
-          <w:sz w:val="22"/>
-          <w:u w:val="single"/>
-        </w:rPr>
-        <w:t xml:space="preserve">Fire safety: Emergency preparedness training and building-level evacuation planning </w:t>
-      </w:r>
-    </w:p>
-    <w:p>
-      <w:r>
-        <w:rPr>
-          <w:strike/>
-          <w:color w:val="CC0000"/>
-          <w:sz w:val="22"/>
-        </w:rPr>
-        <w:t xml:space="preserve">• 51 low-barrier shelter beds at the current safe shelter site </w:t>
+        <w:t xml:space="preserve">The project partnership with Lu'ma Native BCH Housing Society also sets out Indigenous-led </w:t>
+      </w:r>
+      <w:r>
+        <w:rPr>
+          <w:color w:val="0044CC"/>
+          <w:sz w:val="22"/>
+          <w:u w:val="single"/>
+        </w:rPr>
+        <w:t xml:space="preserve">• Fire safety: Emergency preparedness training </w:t>
+      </w:r>
+      <w:r>
+        <w:rPr>
+          <w:sz w:val="22"/>
+        </w:rPr>
+        <w:t xml:space="preserve">and </w:t>
+      </w:r>
+      <w:r>
+        <w:rPr>
+          <w:strike/>
+          <w:color w:val="CC0000"/>
+          <w:sz w:val="22"/>
+        </w:rPr>
+        <w:t xml:space="preserve">community-accountable governance outcomes for long-term operations. </w:t>
+      </w:r>
+      <w:r>
+        <w:rPr>
+          <w:color w:val="0044CC"/>
+          <w:sz w:val="22"/>
+          <w:u w:val="single"/>
+        </w:rPr>
+        <w:t xml:space="preserve">building-level evacuation planning </w:t>
+      </w:r>
+    </w:p>
+    <w:p>
+      <w:r>
+        <w:rPr>
+          <w:strike/>
+          <w:color w:val="CC0000"/>
+          <w:sz w:val="22"/>
+        </w:rPr>
+        <w:t xml:space="preserve">• Operating in the DTES since 1886 </w:t>
       </w:r>
       <w:r>
         <w:rPr>
@@ -7868,6 +7726,46 @@
           <w:color w:val="CC0000"/>
           <w:sz w:val="22"/>
         </w:rPr>
+        <w:t xml:space="preserve">• 51 low-barrier shelter beds at </w:t>
+      </w:r>
+      <w:r>
+        <w:rPr>
+          <w:color w:val="0044CC"/>
+          <w:sz w:val="22"/>
+          <w:u w:val="single"/>
+        </w:rPr>
+        <w:t xml:space="preserve">Between January and April 2024, </w:t>
+      </w:r>
+      <w:r>
+        <w:rPr>
+          <w:sz w:val="22"/>
+        </w:rPr>
+        <w:t xml:space="preserve">the </w:t>
+      </w:r>
+      <w:r>
+        <w:rPr>
+          <w:strike/>
+          <w:color w:val="CC0000"/>
+          <w:sz w:val="22"/>
+        </w:rPr>
+        <w:t xml:space="preserve">current safe shelter site </w:t>
+      </w:r>
+      <w:r>
+        <w:rPr>
+          <w:color w:val="0044CC"/>
+          <w:sz w:val="22"/>
+          <w:u w:val="single"/>
+        </w:rPr>
+        <w:t xml:space="preserve">SRO Collaborative partnered with the City of Vancouver to conduct the most comprehensive SRO tenant survey since 2013. Over 900 tenants were interviewed across 133 SRO buildings. The survey was designed in collaboration with a Tenant Advisory Committee, with questions comparable to 2008 and 2013 surveys to track trends over time. </w:t>
+      </w:r>
+    </w:p>
+    <w:p>
+      <w:r>
+        <w:rPr>
+          <w:strike/>
+          <w:color w:val="CC0000"/>
+          <w:sz w:val="22"/>
+        </w:rPr>
         <w:t xml:space="preserve">• 1,400+ legal advocacy cases each year </w:t>
       </w:r>
       <w:r>
@@ -7876,157 +7774,77 @@
           <w:sz w:val="22"/>
           <w:u w:val="single"/>
         </w:rPr>
-        <w:t xml:space="preserve">Between January and April 2024, the SRO Collaborative partnered with the City of Vancouver to conduct the most comprehensive SRO tenant survey since 2013. Over 900 tenants were interviewed across 133 SRO buildings — approximately 15% of all tenants in surveyed buildings. The survey was designed in collaboration with a Tenant Advisory Committee, with questions comparable to 2008 and 2013 surveys to track trends over time. </w:t>
-      </w:r>
-    </w:p>
-    <w:p>
-      <w:r>
-        <w:rPr>
-          <w:strike/>
-          <w:color w:val="CC0000"/>
-          <w:sz w:val="22"/>
-        </w:rPr>
-        <w:t xml:space="preserve">• 320 E Hastings redevelopment targets 100+ homes </w:t>
-      </w:r>
-      <w:r>
-        <w:rPr>
-          <w:color w:val="0044CC"/>
-          <w:sz w:val="22"/>
-          <w:u w:val="single"/>
-        </w:rPr>
-        <w:t xml:space="preserve">Key context from the survey and related data: </w:t>
-      </w:r>
-    </w:p>
-    <w:p>
-      <w:r>
-        <w:rPr>
-          <w:strike/>
-          <w:color w:val="CC0000"/>
-          <w:sz w:val="22"/>
-        </w:rPr>
-        <w:t xml:space="preserve">Gallery </w:t>
-      </w:r>
-      <w:r>
-        <w:rPr>
-          <w:color w:val="0044CC"/>
-          <w:sz w:val="22"/>
-          <w:u w:val="single"/>
-        </w:rPr>
-        <w:t xml:space="preserve">• Average private SRO rent: $681/month (up 21% since 2019), with some units reaching $1,950/month </w:t>
-      </w:r>
-    </w:p>
-    <w:p>
-      <w:r>
-        <w:rPr>
-          <w:sz w:val="22"/>
-        </w:rPr>
-        <w:t xml:space="preserve">• </w:t>
-      </w:r>
-      <w:r>
-        <w:rPr>
-          <w:strike/>
-          <w:color w:val="CC0000"/>
-          <w:sz w:val="22"/>
-        </w:rPr>
-        <w:t xml:space="preserve">First United Church at East Hastings and Gore — Source: user-provided photo </w:t>
-      </w:r>
-      <w:r>
-        <w:rPr>
-          <w:color w:val="0044CC"/>
-          <w:sz w:val="22"/>
-          <w:u w:val="single"/>
-        </w:rPr>
-        <w:t xml:space="preserve">At least 60% of private SRO residents spend more than half their income on housing </w:t>
-      </w:r>
-    </w:p>
-    <w:p>
-      <w:r>
-        <w:rPr>
-          <w:sz w:val="22"/>
-        </w:rPr>
-        <w:t xml:space="preserve">• </w:t>
-      </w:r>
-      <w:r>
-        <w:rPr>
-          <w:strike/>
-          <w:color w:val="CC0000"/>
-          <w:sz w:val="22"/>
-        </w:rPr>
-        <w:t xml:space="preserve">East Hastings Street — Photo: Wikimedia Commons (CC BY-SA 3.0) </w:t>
-      </w:r>
-      <w:r>
-        <w:rPr>
-          <w:color w:val="0044CC"/>
-          <w:sz w:val="22"/>
-          <w:u w:val="single"/>
-        </w:rPr>
-        <w:t xml:space="preserve">Provincial shelter rate remains $500/month, creating a persistent affordability gap </w:t>
-      </w:r>
-    </w:p>
-    <w:p>
-      <w:r>
-        <w:rPr>
-          <w:sz w:val="22"/>
-        </w:rPr>
-        <w:t xml:space="preserve">• </w:t>
-      </w:r>
-      <w:r>
-        <w:rPr>
-          <w:strike/>
-          <w:color w:val="CC0000"/>
-          <w:sz w:val="22"/>
-        </w:rPr>
-        <w:t xml:space="preserve">Carnegie Community Centre at Main and Hastings — Photo: Wikimedia Commons (CC BY-SA) </w:t>
-      </w:r>
-      <w:r>
-        <w:rPr>
-          <w:color w:val="0044CC"/>
-          <w:sz w:val="22"/>
-          <w:u w:val="single"/>
-        </w:rPr>
-        <w:t xml:space="preserve">Private SRO stock has declined from 7,830 rooms (1994) to 3,305 rooms (2023) </w:t>
-      </w:r>
-    </w:p>
-    <w:p>
-      <w:r>
-        <w:rPr>
-          <w:sz w:val="22"/>
-        </w:rPr>
-        <w:t xml:space="preserve">• </w:t>
-      </w:r>
-      <w:r>
-        <w:rPr>
-          <w:strike/>
-          <w:color w:val="CC0000"/>
-          <w:sz w:val="22"/>
-        </w:rPr>
-        <w:t xml:space="preserve">Pennsylvania Hotel (heritage SRO) — Photo: Wikimedia Commons (CC BY-SA) </w:t>
-      </w:r>
-      <w:r>
-        <w:rPr>
-          <w:color w:val="0044CC"/>
-          <w:sz w:val="22"/>
-          <w:u w:val="single"/>
-        </w:rPr>
-        <w:t xml:space="preserve">One-third of tenants self-identify as Indigenous </w:t>
-      </w:r>
-    </w:p>
-    <w:p>
-      <w:r>
-        <w:rPr>
-          <w:strike/>
-          <w:color w:val="CC0000"/>
-          <w:sz w:val="22"/>
-        </w:rPr>
-        <w:t xml:space="preserve">Resources </w:t>
-      </w:r>
-      <w:r>
-        <w:rPr>
-          <w:color w:val="0044CC"/>
-          <w:sz w:val="22"/>
-          <w:u w:val="single"/>
-        </w:rPr>
-        <w:t xml:space="preserve">• SRO tenants are excluded from most census data, making this survey a critical data source </w:t>
+        <w:t xml:space="preserve">SRO tenants are excluded from most census data, making this survey a critical shared dataset for tenants, organizers, and policymakers. </w:t>
+      </w:r>
+    </w:p>
+    <w:p>
+      <w:r>
+        <w:rPr>
+          <w:strike/>
+          <w:color w:val="CC0000"/>
+          <w:sz w:val="22"/>
+        </w:rPr>
+        <w:t>• 320 E Hastings redevelopment targets 100+ homes</w:t>
+      </w:r>
+    </w:p>
+    <w:p>
+      <w:r>
+        <w:rPr>
+          <w:strike/>
+          <w:color w:val="CC0000"/>
+          <w:sz w:val="22"/>
+        </w:rPr>
+        <w:t>Gallery</w:t>
+      </w:r>
+    </w:p>
+    <w:p>
+      <w:r>
+        <w:rPr>
+          <w:strike/>
+          <w:color w:val="CC0000"/>
+          <w:sz w:val="22"/>
+        </w:rPr>
+        <w:t>• First United Church at East Hastings and Gore — Source: user-provided photo</w:t>
+      </w:r>
+    </w:p>
+    <w:p>
+      <w:r>
+        <w:rPr>
+          <w:strike/>
+          <w:color w:val="CC0000"/>
+          <w:sz w:val="22"/>
+        </w:rPr>
+        <w:t>• East Hastings Street — Photo: Wikimedia Commons (CC BY-SA 3.0)</w:t>
+      </w:r>
+    </w:p>
+    <w:p>
+      <w:r>
+        <w:rPr>
+          <w:strike/>
+          <w:color w:val="CC0000"/>
+          <w:sz w:val="22"/>
+        </w:rPr>
+        <w:t>• Carnegie Community Centre at Main and Hastings — Photo: Wikimedia Commons (CC BY-SA)</w:t>
+      </w:r>
+    </w:p>
+    <w:p>
+      <w:r>
+        <w:rPr>
+          <w:strike/>
+          <w:color w:val="CC0000"/>
+          <w:sz w:val="22"/>
+        </w:rPr>
+        <w:t>• Pennsylvania Hotel (heritage SRO) — Photo: Wikimedia Commons (CC BY-SA)</w:t>
+      </w:r>
+    </w:p>
+    <w:p>
+      <w:r>
+        <w:rPr>
+          <w:strike/>
+          <w:color w:val="CC0000"/>
+          <w:sz w:val="22"/>
+        </w:rPr>
+        <w:t>Resources</w:t>
       </w:r>
     </w:p>
     <w:p>
@@ -8792,37 +8610,15 @@
           <w:color w:val="CC0000"/>
           <w:sz w:val="22"/>
         </w:rPr>
-        <w:t xml:space="preserve">Recent efforts include coordinated </w:t>
-      </w:r>
-      <w:r>
-        <w:rPr>
-          <w:color w:val="0044CC"/>
-          <w:sz w:val="22"/>
-          <w:u w:val="single"/>
-        </w:rPr>
-        <w:t xml:space="preserve">The SRO Collaborative played a central role in the campaign for vacancy control for SROs. In November 2021, Vancouver City Council voted near-unanimously to approve the bylaw. After legal challenges from 13 SRO owners suspended it, the Province of BC passed an amendment in May 2024 to the Municipalities Enabling and Validating Act (MEVA) to restore the city's bylaw — a landmark </w:t>
-      </w:r>
-      <w:r>
-        <w:rPr>
-          <w:sz w:val="22"/>
-        </w:rPr>
-        <w:t xml:space="preserve">tenant </w:t>
-      </w:r>
-      <w:r>
-        <w:rPr>
-          <w:strike/>
-          <w:color w:val="CC0000"/>
-          <w:sz w:val="22"/>
-        </w:rPr>
-        <w:t xml:space="preserve">surveys </w:t>
-      </w:r>
-      <w:r>
-        <w:rPr>
-          <w:color w:val="0044CC"/>
-          <w:sz w:val="22"/>
-          <w:u w:val="single"/>
-        </w:rPr>
-        <w:t xml:space="preserve">protection preventing rent spikes between tenancies </w:t>
+        <w:t xml:space="preserve">Recent efforts include coordinated tenant surveys </w:t>
+      </w:r>
+      <w:r>
+        <w:rPr>
+          <w:color w:val="0044CC"/>
+          <w:sz w:val="22"/>
+          <w:u w:val="single"/>
+        </w:rPr>
+        <w:t xml:space="preserve">The SRO Collaborative played a central role in the campaign for vacancy control for SROs. Vancouver City Council approved the bylaw in 2021, </w:t>
       </w:r>
       <w:r>
         <w:rPr>
@@ -8836,15 +8632,59 @@
           <w:color w:val="CC0000"/>
           <w:sz w:val="22"/>
         </w:rPr>
-        <w:t xml:space="preserve">public documentation of SRO living conditions, helping shape city and provincial conversations on minimum standards, rent protections, and anti-displacement policy. </w:t>
-      </w:r>
-      <w:r>
-        <w:rPr>
-          <w:color w:val="0044CC"/>
-          <w:sz w:val="22"/>
-          <w:u w:val="single"/>
-        </w:rPr>
-        <w:t xml:space="preserve">protecting as many as 1,000 tenants from displacement. </w:t>
+        <w:t xml:space="preserve">public documentation </w:t>
+      </w:r>
+      <w:r>
+        <w:rPr>
+          <w:color w:val="0044CC"/>
+          <w:sz w:val="22"/>
+          <w:u w:val="single"/>
+        </w:rPr>
+        <w:t xml:space="preserve">the Province </w:t>
+      </w:r>
+      <w:r>
+        <w:rPr>
+          <w:sz w:val="22"/>
+        </w:rPr>
+        <w:t xml:space="preserve">of </w:t>
+      </w:r>
+      <w:r>
+        <w:rPr>
+          <w:strike/>
+          <w:color w:val="CC0000"/>
+          <w:sz w:val="22"/>
+        </w:rPr>
+        <w:t xml:space="preserve">SRO living conditions, helping shape city </w:t>
+      </w:r>
+      <w:r>
+        <w:rPr>
+          <w:color w:val="0044CC"/>
+          <w:sz w:val="22"/>
+          <w:u w:val="single"/>
+        </w:rPr>
+        <w:t xml:space="preserve">BC later passed a 2024 amendment to the Municipalities Enabling </w:t>
+      </w:r>
+      <w:r>
+        <w:rPr>
+          <w:sz w:val="22"/>
+        </w:rPr>
+        <w:t xml:space="preserve">and </w:t>
+      </w:r>
+      <w:r>
+        <w:rPr>
+          <w:strike/>
+          <w:color w:val="CC0000"/>
+          <w:sz w:val="22"/>
+        </w:rPr>
+        <w:t xml:space="preserve">provincial conversations on minimum standards, rent protections, and anti-displacement policy. </w:t>
+      </w:r>
+      <w:r>
+        <w:rPr>
+          <w:color w:val="0044CC"/>
+          <w:sz w:val="22"/>
+          <w:u w:val="single"/>
+        </w:rPr>
+        <w:t xml:space="preserve">Validating Act (MEVA) to restore the bylaw after legal challenges. </w:t>
       </w:r>
     </w:p>
     <w:p>
@@ -8862,111 +8702,17 @@
           <w:sz w:val="22"/>
           <w:u w:val="single"/>
         </w:rPr>
-        <w:t xml:space="preserve">In 2023, the Province provided an $11 million grant to the SRO Collaborative to expand services and supports across the DTES. As Executive Director Wendy Pedersen stated: "Privately owned SRO hotels are a last resort before homelessness." </w:t>
-      </w:r>
-    </w:p>
-    <w:p>
-      <w:r>
-        <w:rPr>
-          <w:sz w:val="22"/>
-        </w:rPr>
-        <w:t xml:space="preserve">The </w:t>
-      </w:r>
-      <w:r>
-        <w:rPr>
-          <w:strike/>
-          <w:color w:val="CC0000"/>
-          <w:sz w:val="22"/>
-        </w:rPr>
-        <w:t xml:space="preserve">2023 provincial grant provides targeted support for tenant-led operations, outreach, </w:t>
-      </w:r>
-      <w:r>
-        <w:rPr>
-          <w:color w:val="0044CC"/>
-          <w:sz w:val="22"/>
-          <w:u w:val="single"/>
-        </w:rPr>
-        <w:t xml:space="preserve">Collaborative continues to generate evidence that shapes housing policy through the Right to Remain research collective, coordinated surveys, the 2019 Habitability Study, </w:t>
-      </w:r>
-      <w:r>
-        <w:rPr>
-          <w:sz w:val="22"/>
-        </w:rPr>
-        <w:t xml:space="preserve">and </w:t>
-      </w:r>
-      <w:r>
-        <w:rPr>
-          <w:strike/>
-          <w:color w:val="CC0000"/>
-          <w:sz w:val="22"/>
-        </w:rPr>
-        <w:t xml:space="preserve">staffing for services tied to safety and stabilization </w:t>
-      </w:r>
-      <w:r>
-        <w:rPr>
-          <w:color w:val="0044CC"/>
-          <w:sz w:val="22"/>
-          <w:u w:val="single"/>
-        </w:rPr>
-        <w:t xml:space="preserve">public reporting that documents living conditions </w:t>
-      </w:r>
-      <w:r>
-        <w:rPr>
-          <w:sz w:val="22"/>
-        </w:rPr>
-        <w:t xml:space="preserve">in </w:t>
-      </w:r>
-      <w:r>
-        <w:rPr>
-          <w:color w:val="0044CC"/>
-          <w:sz w:val="22"/>
-          <w:u w:val="single"/>
-        </w:rPr>
-        <w:t xml:space="preserve">real time. Their 2024 survey findings directly inform </w:t>
-      </w:r>
-      <w:r>
-        <w:rPr>
-          <w:sz w:val="22"/>
-        </w:rPr>
-        <w:t xml:space="preserve">the </w:t>
-      </w:r>
-      <w:r>
-        <w:rPr>
-          <w:strike/>
-          <w:color w:val="CC0000"/>
-          <w:sz w:val="22"/>
-        </w:rPr>
-        <w:t xml:space="preserve">private </w:t>
-      </w:r>
-      <w:r>
-        <w:rPr>
-          <w:color w:val="0044CC"/>
-          <w:sz w:val="22"/>
-          <w:u w:val="single"/>
-        </w:rPr>
-        <w:t xml:space="preserve">City's intergovernmental </w:t>
-      </w:r>
-      <w:r>
-        <w:rPr>
-          <w:sz w:val="22"/>
-        </w:rPr>
-        <w:t xml:space="preserve">SRO </w:t>
-      </w:r>
-      <w:r>
-        <w:rPr>
-          <w:strike/>
-          <w:color w:val="CC0000"/>
-          <w:sz w:val="22"/>
-        </w:rPr>
-        <w:t xml:space="preserve">stock. </w:t>
-      </w:r>
-      <w:r>
-        <w:rPr>
-          <w:color w:val="0044CC"/>
-          <w:sz w:val="22"/>
-          <w:u w:val="single"/>
-        </w:rPr>
-        <w:t xml:space="preserve">Investment Strategy. </w:t>
+        <w:t xml:space="preserve">In 2023, the Province provided an $11 million grant to the SRO Collaborative to expand services and supports across the DTES. The Collaborative continues to generate evidence through surveys, public reporting, and the Right to Remain research collective to inform the City's intergovernmental SRO Investment Strategy. </w:t>
+      </w:r>
+    </w:p>
+    <w:p>
+      <w:r>
+        <w:rPr>
+          <w:strike/>
+          <w:color w:val="CC0000"/>
+          <w:sz w:val="22"/>
+        </w:rPr>
+        <w:t>The 2023 provincial grant provides targeted support for tenant-led operations, outreach, and staffing for services tied to safety and stabilization in the private SRO stock.</w:t>
       </w:r>
     </w:p>
     <w:p>
@@ -9824,7 +9570,7 @@
           <w:sz w:val="22"/>
           <w:u w:val="single"/>
         </w:rPr>
-        <w:t xml:space="preserve">Prior Street. A 2017 preliminary concept by Perkins &amp; Will proposed six buildings reaching up to 14 storeys on this site. The broader Northeast False Creek Plan envisions 12,000 new residents, 1,800 units of social housing, 32 acres of parks, 8,000 new jobs, </w:t>
+        <w:t xml:space="preserve">Prior Street. A 2017 preliminary concept by Perkins &amp; Will proposed six buildings reaching up to 14 storeys on this site. The broader Northeast False Creek Plan includes 1,800 social housing units </w:t>
       </w:r>
       <w:r>
         <w:rPr>
@@ -9838,15 +9584,37 @@
           <w:color w:val="CC0000"/>
           <w:sz w:val="22"/>
         </w:rPr>
-        <w:t xml:space="preserve">communication programming, and workshops that respond to resident-identified interests. </w:t>
-      </w:r>
-      <w:r>
-        <w:rPr>
-          <w:color w:val="0044CC"/>
-          <w:sz w:val="22"/>
-          <w:u w:val="single"/>
-        </w:rPr>
-        <w:t xml:space="preserve">$1.7 billion in public benefits across the plan area. </w:t>
+        <w:t xml:space="preserve">communication programming, </w:t>
+      </w:r>
+      <w:r>
+        <w:rPr>
+          <w:color w:val="0044CC"/>
+          <w:sz w:val="22"/>
+          <w:u w:val="single"/>
+        </w:rPr>
+        <w:t xml:space="preserve">32 acres of new </w:t>
+      </w:r>
+      <w:r>
+        <w:rPr>
+          <w:sz w:val="22"/>
+        </w:rPr>
+        <w:t xml:space="preserve">and </w:t>
+      </w:r>
+      <w:r>
+        <w:rPr>
+          <w:strike/>
+          <w:color w:val="CC0000"/>
+          <w:sz w:val="22"/>
+        </w:rPr>
+        <w:t xml:space="preserve">workshops that respond to resident-identified interests. </w:t>
+      </w:r>
+      <w:r>
+        <w:rPr>
+          <w:color w:val="0044CC"/>
+          <w:sz w:val="22"/>
+          <w:u w:val="single"/>
+        </w:rPr>
+        <w:t xml:space="preserve">renewed parks and open spaces across the plan area. </w:t>
       </w:r>
     </w:p>
     <w:p>
@@ -10314,7 +10082,7 @@
           <w:sz w:val="22"/>
           <w:u w:val="single"/>
         </w:rPr>
-        <w:t>At the CNCLT Summit (October 18–20, 2024, Vancouver), HAS was one of three Vancouver CLT site tours (alongside DTES CLT and CLT British Columbia). The summit drew 200+ delegates — CLT practitioners, funders, policymakers, researchers, and activists — and HAS has also offered public "CLT 101" sessions explaining how the Hogan's Alley Community Land Trust supports Black self-determination and housing justice across Metro Vancouver.</w:t>
+        <w:t>At the CNCLT Summit (October 18–20, 2024, Vancouver), HAS was one of three Vancouver CLT site tours (alongside DTES CLT and CLT British Columbia). HAS has also offered public "CLT 101" sessions explaining how the Hogan's Alley Community Land Trust supports Black self-determination and housing justice across Metro Vancouver.</w:t>
       </w:r>
     </w:p>
     <w:p>
@@ -10364,7 +10132,7 @@
           <w:sz w:val="22"/>
           <w:u w:val="single"/>
         </w:rPr>
-        <w:t>• BSH research partner; featured at CNCLT Summit (October 2024, 200+ delegates)</w:t>
+        <w:t>• BSH research partner; featured at CNCLT Summit (October 2024)</w:t>
       </w:r>
     </w:p>
     <w:p>

</xml_diff>